<commit_message>
Konuşma metni: bütün İslami deliller ve 16 illet geri eklendi
Co-Authored-By: Claude Sonnet 5.5 <noreply@anthropic.com>
Claude-Session: https://claude.ai/code/session_01Q71gHQtKJ86ZE2CtYTYSwP
</commit_message>
<xml_diff>
--- a/sunum/plan2/Konusma_Metni_Planned_Obsolescence.docx
+++ b/sunum/plan2/Konusma_Metni_Planned_Obsolescence.docx
@@ -15,7 +15,7 @@
         <w:spacing w:line="360" w:lineRule="auto" w:after="160"/>
       </w:pPr>
       <w:r>
-        <w:t>I will sort the wrongs by one criterion: who is wronged, and at what moment. The buyer is wronged at the moment of sale. The owner is wronged after the sale. Everyone else is wronged without ever having bought anything. After that I will take the four answers a maker can give and show why each one fails. Every wrong comes with one real case, and every conclusion follows from the facts of that case.</w:t>
+        <w:t>This is not one wrong. It touches sixteen grounds on which Islamic law forbids a dealing or invalidates a contract. Ten come straight from the texts and the rules of contract. Six come from reason, engineering and economics, and they bind us because the cause and the effect are visible and measurable. I will classify all sixteen by one criterion: the moment at which the wrong happens. There are four moments. The first is the sale. The second is the time of use. The third is the time of failure or the end of support. The fourth is the sum of all sales across a society. Each ground comes with one real case, and I claim only what the case itself proves.</w:t>
       </w:r>
     </w:p>
     <w:p>
@@ -23,7 +23,7 @@
         <w:spacing w:line="360" w:lineRule="auto" w:after="160"/>
       </w:pPr>
       <w:r>
-        <w:t>Start with the buyer at the moment of sale. What did he pay for, and what did he receive?</w:t>
+        <w:t>First moment, the sale. What did the buyer pay for, and what did he receive?</w:t>
       </w:r>
     </w:p>
     <w:p>
@@ -31,7 +31,7 @@
         <w:spacing w:line="360" w:lineRule="auto" w:after="160"/>
       </w:pPr>
       <w:r>
-        <w:t>A price is not just a number. It is a payment for something the buyer expects to get, and a sale is fair only when the thing delivered matches the thing paid for. The jurists call a payment that buys nothing taking wealth by a false route, and they add a second rule: when the price is far above the value of what was delivered, the buyer has been cheated, even if he agreed to the number. Take Revolv. It sold a smart-home hub with a lifetime subscription. In October 2014 Nest bought the company and stopped selling the hub. In April 2016 Nest announced that the hub would stop working on the fifteenth of May. Nest explained that lifetime meant the life of the device, and the maker ended the life of the device by its own decision. The customer had paid for a lifetime. The part of the price that was meant to buy the time after the fifteenth of May bought nothing, and there is no doubt about whose decision ended that time, because the maker announced it with a date.</w:t>
+        <w:t>The first ground is wealth taken without a counter-value. God says in Surah An-Nisa: do not consume one another's wealth unjustly, but trade by mutual consent. In an exchange, what the buyer pays must meet something that the seller delivers. The jurists define riba as an increase with no counter-value in an exchange. I do not call this riba, but the unmatched part of a price has the same shape, so it falls under the same concern. Take Revolv. It sold a smart-home hub with a lifetime subscription. In October 2014 Nest bought the company and stopped selling the hub. In April 2016 Nest announced that the hub would stop working on the fifteenth of May. The customer had paid for a lifetime, and the part of the price that was meant to buy the time after that date bought nothing.</w:t>
       </w:r>
     </w:p>
     <w:p>
@@ -39,7 +39,7 @@
         <w:spacing w:line="360" w:lineRule="auto" w:after="160"/>
       </w:pPr>
       <w:r>
-        <w:t>The second wrong is a hidden attribute. The expected life of a product sets its price. When the seller knows the life and the buyer cannot know it, the sale contains an uncertainty that only the seller can remove, and the jurists treat that uncertainty as deceit. A seller who stays silent where speaking was needed makes a statement by his silence. Apple's case shows it clearly. In late 2016 some iPhones shut down unexpectedly. In January 2017 Apple released an update that limited the peak performance of phones with aged batteries. Owners were not told. In December 2017 a benchmark developer measured the slowdown and published it, and Apple confirmed it and apologized. The engineering reason was real, because an aged battery can cause shutdowns. The wrong was the silence, and the proof that telling was possible is that Apple later did it. In 2018 Apple added a battery health display and a switch that turns the limit off.</w:t>
+        <w:t>The second ground is uncertainty about what is sold. The Prophet, peace be upon him, forbade the sale that contains gharar, and the jurists place the attributes that set the price inside this rule. The Hanafi jurists add that an uncertainty which leads to quarrel invalidates the sale. The life of a product is such an attribute. In 1925 the leading lamp makers formed the Phoebus cartel and fixed the life of a household bulb at one thousand hours. A buyer cannot read the life of a bulb from its glass. The makers knew the figure, and the buyer paid without knowing it.</w:t>
       </w:r>
     </w:p>
     <w:p>
@@ -47,7 +47,7 @@
         <w:spacing w:line="360" w:lineRule="auto" w:after="160"/>
       </w:pPr>
       <w:r>
-        <w:t>Now the owner after the sale. Who decides what happens to the product?</w:t>
+        <w:t>The third ground is concealing a defect and deceiving. The Prophet said: whoever deceives us is not one of us. He found wet grain under dry grain in a heap, and he asked the seller why he had not put it on top, so that people could see it. The buyer could not have found the wet grain himself, and the seller was still blamed for hiding it. The jurists call this tadlis, ghish and taghrir. Apple shows it. In late 2016 some iPhones shut down unexpectedly. In January 2017 Apple released an update that limited the peak performance of phones with aged batteries. Owners were not told. In December 2017 a benchmark developer measured the slowdown and published it, and Apple confirmed it and apologized. The engineering reason was real. The wrong was the silence, and the French authority fined Apple for omitting the information.</w:t>
       </w:r>
     </w:p>
     <w:p>
@@ -55,7 +55,7 @@
         <w:spacing w:line="360" w:lineRule="auto" w:after="160"/>
       </w:pPr>
       <w:r>
-        <w:t>A sale moves ownership to the buyer. The owner uses the product, repairs it, lends it and resells it. A term that takes the repair away from him contradicts the sale itself, and a restriction that contradicts the nature of the contract is void. When the only party who can repair the product is the party that sold it, the owner also loses his bargaining position: he accepts the seller's price and the seller's schedule. John Deere shows this. In January 2025 the Federal Trade Commission and five states sued Deere. They alleged that the software tools needed for the full range of electronic repairs were offered only to Deere's dealers, so farmers and independent shops could not complete those repairs. In July 2026 a stipulated order was filed under which Deere must, for ten years, give farmers and independent repairers resources equal to those it gives its dealers. The remedy proves the principle, because it gives the owner back the power that the sale was supposed to give him.</w:t>
+        <w:t>The fourth ground is a price far from the value delivered. The jurists accept small gaps and give the buyer a way out when the gap is gross and comes with deceit. The schools draw the line between a small gap and a gross one anywhere from a twentieth of the value to a third. Now look at Revolv again. The buyer paid in full for a hub. After the fifteenth of May the hub was worth nothing, and the maker alone decided it. A gap of the whole value is beyond any line that any school has drawn.</w:t>
       </w:r>
     </w:p>
     <w:p>
@@ -63,7 +63,7 @@
         <w:spacing w:line="360" w:lineRule="auto" w:after="160"/>
       </w:pPr>
       <w:r>
-        <w:t>The fourth wrong is the second profit. Nobody may profit from a loss that he caused when he could have avoided it. In 1925 the leading lamp makers formed the Phoebus cartel and fixed the life of a household bulb at one thousand hours. Before that, bulbs lasted about fifteen hundred hours or more. The cartel tested samples and fined every member whose bulbs lasted longer. The arithmetic is plain. A household that needs three thousand hours of light buys three bulbs instead of two, and the extra half is the cartel's gain and the household's loss. No member could sell the longer-lasting bulb without paying a fine, so the buyer who wanted it had nowhere to buy it.</w:t>
+        <w:t>The fifth ground is a condition that destroys the nature of the sale. A sale moves ownership and the power of disposal to the buyer. A condition that takes that power back contradicts the contract, and the jurists call it a corrupting condition. When a maker's terms say the buyer may not open the device, may not take it to an independent repairer and may not use third-party parts, the maker collects the full price and keeps the power. John Deere shows how this looks in practice. In January 2025 the Federal Trade Commission and five states sued Deere. They said that the software tools needed for the full range of electronic repairs were offered only to Deere's dealers.</w:t>
       </w:r>
     </w:p>
     <w:p>
@@ -71,7 +71,7 @@
         <w:spacing w:line="360" w:lineRule="auto" w:after="160"/>
       </w:pPr>
       <w:r>
-        <w:t>Third, everyone who never bought anything.</w:t>
+        <w:t>Second moment, the time of use. What happens while the owner uses the product?</w:t>
       </w:r>
     </w:p>
     <w:p>
@@ -79,7 +79,7 @@
         <w:spacing w:line="360" w:lineRule="auto" w:after="160"/>
       </w:pPr>
       <w:r>
-        <w:t>A device that could serve six years and is replaced after three means that two devices are made, shipped and disposed of where one was enough. Each device carries its metals, its energy and its disposal, and these costs fall on people who were not parties to the sale. The United Nations Global E-waste Monitor counted sixty-two million tonnes of electronic waste in 2022 and found that less than a quarter was documented as properly collected and recycled. The report itself names shorter product life cycles, limited repair options and design shortcomings among the causes. Planned obsolescence belongs to those causes, and each unit it adds to the pile falls on someone who never agreed to carry it.</w:t>
+        <w:t>The sixth ground is the weakness built in on purpose. Natural wear comes from the fatigue of materials. Here the engineering effort goes in the opposite direction: it is spent to make the product fail. The Phoebus cartel tested samples from its members and fined every member whose bulbs lasted longer than the standard. Nobody fines a bulb for lasting. The only reason to fine it is to keep it from lasting.</w:t>
       </w:r>
     </w:p>
     <w:p>
@@ -87,7 +87,7 @@
         <w:spacing w:line="360" w:lineRule="auto" w:after="160"/>
       </w:pPr>
       <w:r>
-        <w:t>When the tools are reserved to dealers, the independent repair shops in the same towns are shut out of the work. This is the Deere case again. The complaint alleges that independent shops could not obtain the tools they needed to finish repairs, and the order requires equal access for them. The consequence is simple: the repair work that independent shops would have done goes to the dealers, and the owner has one place to take his machine.</w:t>
+        <w:t>Closely linked is the seventh ground: a thing whose whole function is harm has no lawful benefit. The jurists forbid trade in what has no lawful use. A part, a code or a testing regime whose only function is to end the product early is harm by design. The Phoebus testing laboratory and its fine schedule had no other purpose.</w:t>
       </w:r>
     </w:p>
     <w:p>
@@ -95,7 +95,7 @@
         <w:spacing w:line="360" w:lineRule="auto" w:after="160"/>
       </w:pPr>
       <w:r>
-        <w:t>In a market where buyers cannot judge a product's life, the honest maker is the one who loses. Phoebus shows it again, because the cartel fined members whose bulbs lasted too long. The maker who built the better bulb was punished for building it. When cheating is the rule, an honest maker either copies the cheating or leaves the market, and the buyers lose the one signal they had.</w:t>
+        <w:t>The eighth ground is that nobody may cause harm and then profit from it. The rule is: there is no harm and no answering harm with harm, and harm is removed. The arithmetic of the cartel is plain. Before it, bulbs lasted about fifteen hundred hours or more. A household that needs three thousand hours of light needs three bulbs under a one-thousand-hour standard and two under a fifteen-hundred-hour standard. The extra bulb is the cartel's gain and the household's loss, and no member could sell a longer-lasting bulb without paying a fine, so the buyer had nowhere to buy it.</w:t>
       </w:r>
     </w:p>
     <w:p>
@@ -103,7 +103,7 @@
         <w:spacing w:line="360" w:lineRule="auto" w:after="160"/>
       </w:pPr>
       <w:r>
-        <w:t>Money spent on replacing a device that still worked cannot be spent on anything else. When Revolv switched off its hubs, every owner had to spend money on replacing a hub that was physically sound, only because the maker pulled the server. Add up every product replaced early, and the loss is the sum of all that spending.</w:t>
+        <w:t>The ninth ground is the owner's property held hostage. The rule of the Mecelle is that when the sale is complete on the seller's side, any attempt to undo it is rejected. Nobody may act in another man's property without his permission, and nobody may take it without a lawful cause. A maker who keeps the key to the repair of a product he sold is acting in the buyer's property. Return to Deere. In July 2026 a stipulated order was filed under which Deere must, for ten years, give farmers and independent repairers resources equal to those it gives its dealers. The remedy gives the owner back the power that the sale was supposed to give him.</w:t>
       </w:r>
     </w:p>
     <w:p>
@@ -111,7 +111,7 @@
         <w:spacing w:line="360" w:lineRule="auto" w:after="160"/>
       </w:pPr>
       <w:r>
-        <w:t>Two more facts follow from the same switch. First, a product that depends on the maker's server can be turned off by the maker, and the Revolv hubs all stopped on the same date. Whoever holds the switch holds the power, and a state or an industry whose machines depend on a foreign maker's server has placed that power outside its borders. Second, a country that imports its devices pays foreign currency for every replacement, so replacing at three years instead of six doubles the foreign currency spent for each year of service.</w:t>
+        <w:t>Third moment, failure and the end of support. What happens when the product breaks or the maker stops helping?</w:t>
       </w:r>
     </w:p>
     <w:p>
@@ -119,7 +119,79 @@
         <w:spacing w:line="360" w:lineRule="auto" w:after="160"/>
       </w:pPr>
       <w:r>
-        <w:t>Finally, a hidden practice produces disputes once it is found. The Qur'an names enmity and hatred between people as a reason why wine and gambling are forbidden, and any dealing that reliably produces enmity falls under the same concern. Apple's case produced a French fine of twenty-five million euros, a class settlement of five hundred million dollars in the United States, and a settlement of one hundred thirteen million dollars with thirty-four states and the District of Columbia. Apple settled the American cases without admitting wrongdoing. The point is the number of disputes, not the verdict: these are the disputes that a hidden limit produces once buyers learn of it.</w:t>
+        <w:t>The tenth ground is exploiting a person in distress. A report from Ali, may God be pleased with him, says the Prophet forbade the sale made to a man in distress. When the only party who can repair is the party that sold the product, the owner has no choice but to accept that party's price and schedule. A farmer whose machine stops in the middle of the harvest season cannot go looking for a better offer.</w:t>
+      </w:r>
+    </w:p>
+    <w:p>
+      <w:pPr>
+        <w:spacing w:line="360" w:lineRule="auto" w:after="160"/>
+      </w:pPr>
+      <w:r>
+        <w:t>The eleventh ground is withholding. Ihtikar is holding back what people need so that scarcity raises the price. The classical case is food, and some jurists, Abu Yusuf among them, extend it to anything whose withholding harms people. When the diagnostic software and the parts are given to the maker's dealers alone, the means of repair are withheld, and the scarcity is made by the maker. That is the Deere complaint in one sentence.</w:t>
+      </w:r>
+    </w:p>
+    <w:p>
+      <w:pPr>
+        <w:spacing w:line="360" w:lineRule="auto" w:after="160"/>
+      </w:pPr>
+      <w:r>
+        <w:t>The twelfth ground is compulsion of the buyer's choice. In the strict sense, compulsion needs a threat. Here the pressure is the loss of function: the owner who could keep a sound product is made to buy another. When Revolv switched off its hubs, every owner had to replace a hub that was physically sound. The buyer was free in law, but the choice to buy again was not free in fact.</w:t>
+      </w:r>
+    </w:p>
+    <w:p>
+      <w:pPr>
+        <w:spacing w:line="360" w:lineRule="auto" w:after="160"/>
+      </w:pPr>
+      <w:r>
+        <w:t>The thirteenth ground is that hasty gain is punished. The Mecelle says that whoever hastens something before its time by illegitimate means is punished by being deprived of it. The rule's own example is the heir who kills to inherit early. A maker who shortens the life of a product brings forward the buyer's next purchase. Under the cartel the second purchase came after one thousand hours where it would have come after fifteen hundred, which means one third sooner.</w:t>
+      </w:r>
+    </w:p>
+    <w:p>
+      <w:pPr>
+        <w:spacing w:line="360" w:lineRule="auto" w:after="160"/>
+      </w:pPr>
+      <w:r>
+        <w:t>The fourteenth ground is enmity. A hidden practice produces disputes when it is found. The Qur'an gives, as a reason for forbidding wine and gambling, that Satan wants to cause enmity and hatred between you. Any dealing that reliably produces enmity falls under the same concern, and the Hanafi rule on uncertainty that leads to quarrel says the same thing for sales. Apple's case produced a French fine of twenty-five million euros, a class settlement of five hundred million dollars in the United States, and a settlement of one hundred thirteen million dollars with thirty-four states and the District of Columbia. Apple settled the American cases without admitting wrongdoing. The point is the number of disputes, not the verdict.</w:t>
+      </w:r>
+    </w:p>
+    <w:p>
+      <w:pPr>
+        <w:spacing w:line="360" w:lineRule="auto" w:after="160"/>
+      </w:pPr>
+      <w:r>
+        <w:t>Fourth moment, the sum of all sales. What about the people who never bought anything?</w:t>
+      </w:r>
+    </w:p>
+    <w:p>
+      <w:pPr>
+        <w:spacing w:line="360" w:lineRule="auto" w:after="160"/>
+      </w:pPr>
+      <w:r>
+        <w:t>The fifteenth ground is waste and the burden on the public. The Mecelle says a private harm is accepted to repel a public one, the heavier harm is removed by the lighter, and burdens go with benefits. Take a device that could serve six years and is replaced after three. Two devices are made, shipped and disposed of where one was enough, and each carries its metals, its energy and its disposal. The United Nations Global E-waste Monitor counted sixty-two million tonnes of electronic waste in 2022 and found that less than a quarter was documented as properly collected and recycled. The report names shorter product life cycles, limited repair options and design shortcomings among the causes. The maker takes the benefit of the extra sale. The cost of the extra extraction and disposal falls on people who were not parties to the sale.</w:t>
+      </w:r>
+    </w:p>
+    <w:p>
+      <w:pPr>
+        <w:spacing w:line="360" w:lineRule="auto" w:after="160"/>
+      </w:pPr>
+      <w:r>
+        <w:t>The sixteenth ground is the collapse of trust in the market, and it has a companion: capital that is wasted. Where buyers cannot judge the life of a product, the honest maker loses. The cartel fined its members whose bulbs lasted too long, so the maker who built the better bulb was punished for it. When cheating becomes the rule, an honest maker copies it or leaves, and buyers lose the one signal they had. And the money spent replacing a device that still worked cannot be spent on anything else. When Revolv pulled its server, every owner paid to replace a sound hub, and every product replaced early repeats that loss.</w:t>
+      </w:r>
+    </w:p>
+    <w:p>
+      <w:pPr>
+        <w:spacing w:line="360" w:lineRule="auto" w:after="160"/>
+      </w:pPr>
+      <w:r>
+        <w:t>Three more effects follow from the same cause. First, the independent repair trade is destroyed. When the tools are reserved to dealers, the independent shops in the same towns are shut out of the work, and the repair work goes to the dealers. That is what the Deere order corrects. The Mecelle rule applies again: the seller who has completed the sale cannot undo it by closing the repair. Second, a country that imports its devices pays foreign currency for every replacement, so replacing at three years instead of six doubles the foreign currency spent for each year of service. Third, a product that depends on the maker's server can be turned off by the maker, and the Revolv hubs all stopped on the same date. Whoever holds the switch holds the power, and a state or an industry whose machines depend on a foreign maker's server has placed that power outside its borders.</w:t>
+      </w:r>
+    </w:p>
+    <w:p>
+      <w:pPr>
+        <w:spacing w:line="360" w:lineRule="auto" w:after="160"/>
+      </w:pPr>
+      <w:r>
+        <w:t>Seen from what Islamic law protects, the sixteen grounds fall in four places. Grounds one, four, eight and fifteen strike at property. Grounds two, three, five, nine and twelve strike at the soundness of the contract and the freedom of the will. Grounds ten, fourteen and sixteen strike at trust and peace in society. Grounds six, seven, eleven and fifteen strike at the material world and its balance. No single ground carries this verdict alone. Planned obsolescence touches at least six of them at once: uncertainty, deceit, the corrupting condition, wealth taken without a counter-value, withholding and enmity. That is why it is not an ordinary defect in a sale and not a lawful business manoeuvre. It is an organized violation of rights.</w:t>
       </w:r>
     </w:p>
     <w:p>
@@ -135,7 +207,7 @@
         <w:spacing w:line="360" w:lineRule="auto" w:after="160"/>
       </w:pPr>
       <w:r>
-        <w:t>First: "The customer accepted the terms." Acceptance needs knowledge. Every Apple owner who tapped Install had accepted the update, and not one of them had agreed to a slower phone, because nobody had told them that the update would slow it. The French authority fined Apple for omitting the information. A signature on something whose effect was hidden is not consent to that effect.</w:t>
+        <w:t>First: "The customer accepted the terms." A term that contradicts the purpose of the contract is void, and a signature does not turn a forced yes into free consent. Every Apple owner who tapped Install had accepted the update, and not one of them had agreed to a slower phone, because nobody had told them that the update would slow it. The French authority fined Apple for omitting the information. A signature on something whose effect was hidden is not consent to that effect.</w:t>
       </w:r>
     </w:p>
     <w:p>
@@ -143,7 +215,7 @@
         <w:spacing w:line="360" w:lineRule="auto" w:after="160"/>
       </w:pPr>
       <w:r>
-        <w:t>Second: "It was necessary for safety." Necessity excuses the limit. It never excuses the hiding. Apple's own history shows the difference. The shutdown problem was real, and in 2018 Apple solved the same problem by telling the owner, showing the health of the battery and letting him switch the limit off. If necessity had required silence, that fix could not exist.</w:t>
+        <w:t>Second: "It was necessary for safety." Necessity is measured by its extent, and necessity does not cancel another man's right. It excuses the limit. It never excuses the hiding, and it never takes the owner's decision away from him. Apple's own history shows the difference. The shutdown problem was real, and in 2018 Apple solved the same problem by telling the owner, showing the health of the battery and letting him switch the limit off. If necessity had required silence, that fix could not exist.</w:t>
       </w:r>
     </w:p>
     <w:p>
@@ -151,7 +223,7 @@
         <w:spacing w:line="360" w:lineRule="auto" w:after="160"/>
       </w:pPr>
       <w:r>
-        <w:t>Third: "We sold the device, but we only licensed the software." Look at what the buyer carried home. The Revolv hub is a box that does nothing without the maker's server, and the customer paid for a working hub with a lifetime subscription. A label cannot turn that sale into a lease after the money has changed hands. If the maker wants to keep ownership, he must call the contract a lease and price it as rent.</w:t>
+        <w:t>Third: "We sold the device, but we only licensed the software." In a contract, meaning counts, not wording, and what is inseparable from a thing follows the thing in the ruling. The Revolv hub is a box that does nothing without the maker's server, and the customer paid for a working hub with a lifetime subscription. A label cannot turn that sale into a lease after the money has changed hands. If the maker wants to keep ownership, he must call the contract a lease and price it as rent.</w:t>
       </w:r>
     </w:p>
     <w:p>
@@ -159,7 +231,15 @@
         <w:spacing w:line="360" w:lineRule="auto" w:after="160"/>
       </w:pPr>
       <w:r>
-        <w:t>Fourth, and strongest: "It funds innovation. Without replacement sales we cannot afford research." Take the same logic into a shop. A chocolate maker shrinks every bar by a tenth, keeps the wrapper and the price, and says the money builds a new factory. The factory may be real, and every buyer was still cheated. A good use for the money does not make a hidden way of taking it honest. The research argument fails in the same way, and four questions show it. If buyers would accept "this lasts two years, and the difference funds the next model," the maker loses nothing by saying so, and his silence shows that he expects a refusal. If he needs money, he can raise the price openly, offer a trade-in, or sell a cheaper line with the life printed on it. If the new product is better, buyers have a reason to buy it and the old one does not have to die first. If the new product is not better, the buyer pays twice for the same thing, and that is not research. And if research benefits everyone, then everyone should fund it in the open, and one class of buyers should not fund it in the dark.</w:t>
+        <w:t>Fourth, and strongest: "It funds innovation. Without replacement sales we cannot afford research." A lawful aim does not make an unlawful means lawful, and no man's right may be broken to produce a general benefit. Take the same logic into a shop. A chocolate maker shrinks every bar by a tenth, keeps the wrapper and the price, and says the money builds a new factory. The factory may be real, and every buyer was still cheated. The research argument fails in the same way, and four questions show it. If buyers would accept "this lasts two years, and the difference funds the next model," the maker loses nothing by saying so, and his silence shows that he expects a refusal. If he needs money, he can raise the price openly, offer a trade-in, or sell a cheaper line with the life printed on it. If the new product is better, buyers have a reason to buy it and the old one does not have to die first. If the new product is not better, the buyer pays twice for the same thing, and that is not research. And if research benefits everyone, then everyone should fund it in the open, and one class of buyers should not fund it in the dark.</w:t>
+      </w:r>
+    </w:p>
+    <w:p>
+      <w:pPr>
+        <w:spacing w:line="360" w:lineRule="auto" w:after="160"/>
+      </w:pPr>
+      <w:r>
+        <w:t>The conclusion is plain. Hiding the designed life of a product is cheating in the scales. Blocking the repair and locking the parts is taking another man's property without right. Sending working products to the waste pile is a violation of the public's right. Defending these acts with the words innovation, security or license does not change what the acts are.</w:t>
       </w:r>
     </w:p>
     <w:p>

</xml_diff>

<commit_message>
Konuşma metni: verilen metinlerin tertibi ve tercümesi
Co-Authored-By: Claude Sonnet 5.5 <noreply@anthropic.com>
Claude-Session: https://claude.ai/code/session_01Q71gHQtKJ86ZE2CtYTYSwP
</commit_message>
<xml_diff>
--- a/sunum/plan2/Konusma_Metni_Planned_Obsolescence.docx
+++ b/sunum/plan2/Konusma_Metni_Planned_Obsolescence.docx
@@ -7,7 +7,7 @@
         <w:spacing w:line="360" w:lineRule="auto" w:after="160"/>
       </w:pPr>
       <w:r>
-        <w:t>Planned obsolescence looks like a technology debate, but it is a question about trade, and trade has a simple test. Did the buyer receive what he paid for? Does the thing he bought still belong to him? Planned obsolescence is the case in which the answer to one of these questions is no, and the maker chose that answer. I define it as a choice by the maker that shortens the useful life of a product he has sold, or takes away the owner's power to extend that life. Ordinary wear is outside this definition, because nobody chose it. A short life that is printed on the box is outside it too, because the buyer chose it with his eyes open.</w:t>
+        <w:t>My name is Beşir Kerem Üstüntürk. Today I will speak about planned obsolescence and its legal, rational and moral ruling.</w:t>
       </w:r>
     </w:p>
     <w:p>
@@ -15,7 +15,7 @@
         <w:spacing w:line="360" w:lineRule="auto" w:after="160"/>
       </w:pPr>
       <w:r>
-        <w:t>This is not one wrong. It touches sixteen grounds on which Islamic law forbids a dealing or invalidates a contract. Ten come straight from the texts and the rules of contract. Six come from reason, engineering and economics, and they bind us because the cause and the effect are visible and measurable. I will classify all sixteen by one criterion: the moment at which the wrong happens. There are four moments. The first is the sale. The second is the time of use. The third is the time of failure or the end of support. The fourth is the sum of all sales across a society. Each ground comes with one real case, and I claim only what the case itself proves.</w:t>
+        <w:t>The method I will follow is this: I will lay the matter out with rational, experiential and realistic examples that leave no room for evasion. The talk has four parts. In Part One, I give our three evidences. In Part Two, I show the social and economic harms. In Part Three, I lay out the grounds of Islamic law that forbid the practice, sixteen grounds in all, and classify them. In Part Four, I refute, one by one, the four false claims that producers hide behind. After that I will give the conclusion.</w:t>
       </w:r>
     </w:p>
     <w:p>
@@ -23,7 +23,7 @@
         <w:spacing w:line="360" w:lineRule="auto" w:after="160"/>
       </w:pPr>
       <w:r>
-        <w:t>First moment, the sale. What did the buyer pay for, and what did he receive?</w:t>
+        <w:t>Trade is two people exchanging value by mutual consent. When one side knows what it receives while the other side hides what it gives, trade ends there, and theft and usurpation begin. The matter of planned obsolescence is not a complicated technology debate. The matter is this: the seller secretly steals the life of the goods he sells, and he does not take his hand off the property he has sold.</w:t>
       </w:r>
     </w:p>
     <w:p>
@@ -31,7 +31,7 @@
         <w:spacing w:line="360" w:lineRule="auto" w:after="160"/>
       </w:pPr>
       <w:r>
-        <w:t>The first ground is wealth taken without a counter-value. God says in Surah An-Nisa: do not consume one another's wealth unjustly, but trade by mutual consent. In an exchange, what the buyer pays must meet something that the seller delivers. The jurists define riba as an increase with no counter-value in an exchange. I do not call this riba, but the unmatched part of a price has the same shape, so it falls under the same concern. Take Revolv. It sold a smart-home hub with a lifetime subscription. In October 2014 Nest bought the company and stopped selling the hub. In April 2016 Nest announced that the hub would stop working on the fifteenth of May. The customer had paid for a lifetime, and the part of the price that was meant to buy the time after that date bought nothing.</w:t>
+        <w:t>PART ONE: OUR EVIDENCES.</w:t>
       </w:r>
     </w:p>
     <w:p>
@@ -39,7 +39,7 @@
         <w:spacing w:line="360" w:lineRule="auto" w:after="160"/>
       </w:pPr>
       <w:r>
-        <w:t>The second ground is uncertainty about what is sold. The Prophet, peace be upon him, forbade the sale that contains gharar, and the jurists place the attributes that set the price inside this rule. The Hanafi jurists add that an uncertainty which leads to quarrel invalidates the sale. The life of a product is such an attribute. In 1925 the leading lamp makers formed the Phoebus cartel and fixed the life of a household bulb at one thousand hours. A buyer cannot read the life of a bulb from its glass. The makers knew the figure, and the buyer paid without knowing it.</w:t>
+        <w:t>Our first evidence is the hidden defect and gain without a counter-value. This is the principle of consent. Imagine you are building a house, and you order concrete of C30 standard from a concrete plant, concrete that should last fifty years. You pay the price of C30 down to the last penny. The owner of the plant, in his laboratory, uses an additive that he alone knows and that nobody outside can detect, and he adjusts the strength of the concrete so that it crumbles from the inside in ten years. Ten years later the building cracks and cannot be lived in. What happened here? You paid for fifty years of strength, and the producer secretly delivered goods of ten years. The price of the remaining forty years stayed in the producer's till. If the buyer had known this limit, would he have paid that money? No. To put into an electronic device a solder that, with normal use, could last five years but is knowingly made to fail in two, a battery that is made to swell, or software that counts the life of the device and locks it, is the same as secretly stealing strength from the concrete of a building. Every life that is hidden is advance payment stolen from the customer. The rule is this: a sale made with deceit and with gross price deception, gabn-i fâhiş, is void. The part in which the buyer's consent is missing is unjust gain for the seller, and it is forbidden.</w:t>
       </w:r>
     </w:p>
     <w:p>
@@ -47,7 +47,7 @@
         <w:spacing w:line="360" w:lineRule="auto" w:after="160"/>
       </w:pPr>
       <w:r>
-        <w:t>The third ground is concealing a defect and deceiving. The Prophet said: whoever deceives us is not one of us. He found wet grain under dry grain in a heap, and he asked the seller why he had not put it on top, so that people could see it. The buyer could not have found the wet grain himself, and the seller was still blamed for hiding it. The jurists call this tadlis, ghish and taghrir. Apple shows it. In late 2016 some iPhones shut down unexpectedly. In January 2017 Apple released an update that limited the peak performance of phones with aged batteries. Owners were not told. In December 2017 a benchmark developer measured the slowdown and published it, and Apple confirmed it and apologized. The engineering reason was real. The wrong was the silence, and the French authority fined Apple for omitting the information.</w:t>
+        <w:t>Our second evidence is causing harm on purpose and then producing a second gain from that harm. This is the principle of harm. Imagine you buy a brand-new combi boiler for your home. In the critical, hottest pipeline of the boiler, copper or brass is the technical standard. The producer, however, not to raise his profit but so that the device cracks from the heat and leaks water exactly when it completes its third year, puts a weak plastic part there. Three years later that part bursts. Water floods your home, your parquet swells, and the boiler stops working. You have to call the producer. He sells you that plastic part at an inflated price, and he also says: "This model is old, its repair costs more than it is worth, come, let us give you a new one." There is no natural wear here. The producer has knowingly planted a time bomb in the customer's property. He has harmed the customer, and out of the result of that harm he has sold the customer a second product or an inflated service. He has drawn a benefit from the disaster he himself caused. The rule is: ed-dararu yüzâl, harm is removed. Nobody can obtain a lawful gain from a harm that he caused through his own intentional and unjust act.</w:t>
       </w:r>
     </w:p>
     <w:p>
@@ -55,7 +55,7 @@
         <w:spacing w:line="360" w:lineRule="auto" w:after="160"/>
       </w:pPr>
       <w:r>
-        <w:t>The fourth ground is a price far from the value delivered. The jurists accept small gaps and give the buyer a way out when the gap is gross and comes with deceit. The schools draw the line between a small gap and a gross one anywhere from a twentieth of the value to a third. Now look at Revolv again. The buyer paid in full for a hub. After the fifteenth of May the hub was worth nothing, and the maker alone decided it. A gap of the whole value is beyond any line that any school has drawn.</w:t>
+        <w:t>Our third evidence is trespass on property and taking it hostage. This is the principle of ownership. Imagine you set up a logistics company and you buy a brand-new truck for transport. You count out three million lira, and the license is registered in your name. Two years later the alternator or a simple sensor of the vehicle fails. Your experienced master at the industrial site obtains the same original part and fits it. But the engine of the truck does not start. Why? Because the producer has put a digital lock in the brain of the vehicle. He says: "If our authorized service does not come and connect its own encrypted diagnostic device, this vehicle does not run." The authorized service does not give this password and software to anyone outside. It comes, charges five times the market service fee for that two-minute operation, and keeps your vehicle waiting for days, causing you commercial loss. The usurpation here is this: the goods do not break every month, but every time the goods fail, or every time the time for routine maintenance comes, the real owner of the goods is made unable to dispose of his own property. Your right to choose your own master, to buy the part cheaply, and to operate your property as you wish is taken from your hand. The owner is removed from being the lord of his property and is turned into a hostage who waits in line at the producer's door at every repair. The rule is this: when the sale is complete, the seller's right to dispose of the goods falls entirely, and to restrict the lawful power of disposal of the owner over his property is usurpation. In the words of the rule, el-milkü bi-tamâmih, ownership is complete.</w:t>
       </w:r>
     </w:p>
     <w:p>
@@ -63,7 +63,7 @@
         <w:spacing w:line="360" w:lineRule="auto" w:after="160"/>
       </w:pPr>
       <w:r>
-        <w:t>The fifth ground is a condition that destroys the nature of the sale. A sale moves ownership and the power of disposal to the buyer. A condition that takes that power back contradicts the contract, and the jurists call it a corrupting condition. When a maker's terms say the buyer may not open the device, may not take it to an independent repairer and may not use third-party parts, the maker collects the full price and keeps the power. John Deere shows how this looks in practice. In January 2025 the Federal Trade Commission and five states sued Deere. They said that the software tools needed for the full range of electronic repairs were offered only to Deere's dealers.</w:t>
+        <w:t>PART TWO: THE SOCIAL AND ECONOMIC HARMS.</w:t>
       </w:r>
     </w:p>
     <w:p>
@@ -71,7 +71,7 @@
         <w:spacing w:line="360" w:lineRule="auto" w:after="160"/>
       </w:pPr>
       <w:r>
-        <w:t>Second moment, the time of use. What happens while the owner uses the product?</w:t>
+        <w:t>Planned obsolescence does not stay a deceit between individuals. When it becomes a practice of a whole sector, it produces the following harms, and the cause-and-effect link between the practice and each of them is established.</w:t>
       </w:r>
     </w:p>
     <w:p>
@@ -79,7 +79,7 @@
         <w:spacing w:line="360" w:lineRule="auto" w:after="160"/>
       </w:pPr>
       <w:r>
-        <w:t>The sixth ground is the weakness built in on purpose. Natural wear comes from the fatigue of materials. Here the engineering effort goes in the opposite direction: it is spent to make the product fail. The Phoebus cartel tested samples from its members and fined every member whose bulbs lasted longer than the standard. Nobody fines a bulb for lasting. The only reason to fine it is to keep it from lasting.</w:t>
+        <w:t>The first harm is waste, and the burden of waste thrown on society. The cause-and-effect link: when the functional life of a device is lowered from six years to three, the production, the consumption of raw materials and the amount of waste that appears, to meet the same need, mathematically double. This is not a forecast. It is a direct result. While the producer earns profit from every extra sale, the cost of storing the doubled waste, of cleaning the lithium and heavy metals that mix into groundwater, and of the squandered natural resources, is placed not on the producer but on the whole of society. The example: think of the water meters of a city. Instead of a mechanical meter whose normal technical life is ten years, an electronic circuit is put inside that is designed to lock on purpose in three years. That city, which would have used one meter in ten years, consumes three meters. Two usable bodies go to the garbage. Needless spending comes out of the consumer's pocket, and the public dumps fill early. The real rule is Mecelle, Article 26: "Zarar-ı âm def'içün zarar-ı hâs ihtiyar olunur." That is, for the repelling of a general harm, a particular harm is chosen. The raw-material waste and the environmental damage the public carries is a general harm, while the producer's interest in earning from sales is a particular one. To prevent the general harm, this gate of profit of the producer is closed.</w:t>
       </w:r>
     </w:p>
     <w:p>
@@ -87,7 +87,7 @@
         <w:spacing w:line="360" w:lineRule="auto" w:after="160"/>
       </w:pPr>
       <w:r>
-        <w:t>Closely linked is the seventh ground: a thing whose whole function is harm has no lawful benefit. The jurists forbid trade in what has no lawful use. A part, a code or a testing regime whose only function is to end the product early is harm by design. The Phoebus testing laboratory and its fine schedule had no other purpose.</w:t>
+        <w:t>The second harm is the deliberate destruction of the repair market, and the consumer's sentence to monopoly. The cause-and-effect link: when the producer does not release spare parts to the market, seals the part to the main board with software, and hides the repair schemes, it becomes physically impossible for the independent master to repair that device. The result is beyond dispute: the independent repair sector must withdraw from this field, competition ends, and the consumer bows to the single price set by the authorized service. The example: the main board of a combi boiler. When a ten-lira capacitor or relay on the board burns, an electronics master at the industrial site can find it in half an hour and replace it for a hundred lira. But if the producer covers the board with an unremovable chemical resin and encrypts the part, the master cannot touch the board. The authorized service comes and says: "This board cannot be repaired, the whole board will be replaced for eight thousand lira." A ten-lira fault is reflected to the consumer as eight thousand lira because of the physical obstacle that the producer has put there. The real rule is Mecelle, Article 100: "Bir kimsenin sa'yi kendi cihetinden tamam olan şeyi nakzetmeye matuf olursa o sa'y merduttur." The effort of a person to undo what is completed on his own side is rejected. By the contract of sale the seller has transferred the ownership of the goods to the buyer. After selling, to keep his control over the goods by blocking the ways of repair, and to try to make ownership meaningless in practice, is void, and the law rejects it.</w:t>
       </w:r>
     </w:p>
     <w:p>
@@ -95,7 +95,7 @@
         <w:spacing w:line="360" w:lineRule="auto" w:after="160"/>
       </w:pPr>
       <w:r>
-        <w:t>The eighth ground is that nobody may cause harm and then profit from it. The rule is: there is no harm and no answering harm with harm, and harm is removed. The arithmetic of the cartel is plain. Before it, bulbs lasted about fifteen hundred hours or more. A household that needs three thousand hours of light needs three bulbs under a one-thousand-hour standard and two under a fifteen-hundred-hour standard. The extra bulb is the cartel's gain and the household's loss, and no member could sell a longer-lasting bulb without paying a fine, so the buyer had nowhere to buy it.</w:t>
+        <w:t>The third harm is forcing a second sale before its time, which is a waste of capital. The cause-and-effect link: when the software support of a device with sound hardware is deliberately cut, or the device is made unable to work by an update, the consumer is forced to buy a new device although he has no real need. The capital that the consumer could have directed to another productive field, or to saving, is spent on replacing an instrument that is still working. The example: the barcode readers or handheld terminals that a small business uses. The case, the keys and the laser of the device work perfectly. But the main producer, with a compulsory update it sends, closes the connection to the central server for the old models. The device is left useless overnight. The owner of the business has to put the capital in his hand into a new fleet of devices, not because his existing devices broke down, but because the producer pulled the plug. The real rule is Mecelle, Article 99: "Men iste'cele şey'en kable evânihî ûkıbe bi-hırmânih." Whoever tries to obtain a thing before its time by an illegitimate means is punished by being deprived of that thing. A producer who deliberately kills the goods early and tries to obtain the second sale before its time cannot have this gain accepted as lawful.</w:t>
       </w:r>
     </w:p>
     <w:p>
@@ -103,7 +103,7 @@
         <w:spacing w:line="360" w:lineRule="auto" w:after="160"/>
       </w:pPr>
       <w:r>
-        <w:t>The ninth ground is the owner's property held hostage. The rule of the Mecelle is that when the sale is complete on the seller's side, any attempt to undo it is rejected. Nobody may act in another man's property without his permission, and nobody may take it without a lawful cause. A maker who keeps the key to the repair of a product he sold is acting in the buyer's property. Return to Deere. In July 2026 a stipulated order was filed under which Deere must, for ten years, give farmers and independent repairers resources equal to those it gives its dealers. The remedy gives the owner back the power that the sale was supposed to give him.</w:t>
+        <w:t>The fourth harm is the collapse of trust and enmity between the parties. This finding is one of the most basic grounds of prohibition in the law of contracts. One of the greatest wisdoms of the prohibition of deceit, usury and gambling in Islamic law is that they breed adâvet and bağzâ, that is, grudge, hatred and enmity, between the parties. The cause-and-effect link: when goods wear out by their nature, or break by accident, the buyer does not hold a grudge against the producer. He says: "It was fated like this, it is the nature of a human-made thing," and he accepts. But the moment the buyer learns that the failure was not natural wear, that the producer, to earn more money, deliberately put a suicide mechanism inside the device, or crippled his instrument by remote interference, the matter stops being a commercial one. In the buyer arises directly a feeling of having been betrayed, deep hatred, and a settled grudge against the seller. This grudge is not accidental. It is the inevitable reaction of the spirit that every person who is deceived shows by his nature. The bond of covenant between producer and buyer is broken, and enmity takes its place. The example: you call a water plumber to your home. The master repairs the pipe, takes his money and goes. If the pipe bursts six months later because of the lime in the water or the high pressure, you do not turn into an enemy of the master. You say: "The installation was old," and you call him again. But if you learn afterwards that the master smeared a weak adhesive that melts on the joint of the pipe, so that he would be called again after six months and earn money a second time, what awakens in your heart against that master from that moment? Fierce hatred, grudge and enmity awaken. You never let that master through your door again, and you call his name a thief. When planned obsolescence is exposed, the feeling of all consumers toward the producing company is exactly this feeling of grudge and ill will toward the plumber. The real rule of the principles of jurisprudence is: "Küllü muâmeletin tüeddî ile'n-nizâ'i ve'l-adâveti fe-hiye fâsideh." Every contract and every condition that leads to quarrel, to scheming and to enmity between the parties is corrupt and void. The main purpose of forbidding deceit in Islamic law is to prevent hypocrisy and grudge from being put between people. In Surah Al-Ma'idah, verse 91, where the reason for forbidding is explained, the words "Satan only wants to cause enmity and hatred between you" are the text for this truth.</w:t>
       </w:r>
     </w:p>
     <w:p>
@@ -111,7 +111,7 @@
         <w:spacing w:line="360" w:lineRule="auto" w:after="160"/>
       </w:pPr>
       <w:r>
-        <w:t>Third moment, failure and the end of support. What happens when the product breaks or the maker stops helping?</w:t>
+        <w:t>PART THREE: THE GROUNDS OF ISLAMIC LAW.</w:t>
       </w:r>
     </w:p>
     <w:p>
@@ -119,7 +119,7 @@
         <w:spacing w:line="360" w:lineRule="auto" w:after="160"/>
       </w:pPr>
       <w:r>
-        <w:t>The tenth ground is exploiting a person in distress. A report from Ali, may God be pleased with him, says the Prophet forbade the sale made to a man in distress. When the only party who can repair is the party that sold the product, the owner has no choice but to accept that party's price and schedule. A farmer whose machine stops in the middle of the harvest season cannot go looking for a better offer.</w:t>
+        <w:t>Other basic grounds exist that corrupt contracts and commercial dealings and make them forbidden. In classical jurisprudence, especially in the Hanafi, Maliki and Shafi'i methods, all the prohibitions of trade rest on certain root grounds. Besides the public harm, the monopoly, the unjust gain and the enmity that we mentioned in Part Two, the other principal grounds that jurisprudence accepts in the field of dealings by agreement are these.</w:t>
       </w:r>
     </w:p>
     <w:p>
@@ -127,7 +127,7 @@
         <w:spacing w:line="360" w:lineRule="auto" w:after="160"/>
       </w:pPr>
       <w:r>
-        <w:t>The eleventh ground is withholding. Ihtikar is holding back what people need so that scarcity raises the price. The classical case is food, and some jurists, Abu Yusuf among them, extend it to anything whose withholding harms people. When the diagnostic software and the parts are given to the maker's dealers alone, the means of repair are withheld, and the scarcity is made by the maker. That is the Deere complaint in one sentence.</w:t>
+        <w:t>The first is ekl-i emvâl bi'l-bâtıl, taking property without a counter-value or without a lawful cause. It is the highest founding principle of contracts and a ground of prohibition in jurisprudence, and it rests directly on the text of the Qur'an: "O you who believe! Do not consume your wealth among yourselves by false, unlawful ways," Surah An-Nisa, verse 29. Its meaning in jurisprudence: in an exchange contract, the price one party takes has no real counter-value, ıvaz. Its application to the matter: the buyer pays ten thousand lira for the use value of five years, and the producer, through a hidden restriction, delivers him the value of two years. The price of the remaining three years stays, for the producer, without ıvaz, without a counter-value. In jurisprudence, every penny whose counter-value is not delivered falls under the ground of eating property by false means.</w:t>
       </w:r>
     </w:p>
     <w:p>
@@ -135,7 +135,7 @@
         <w:spacing w:line="360" w:lineRule="auto" w:after="160"/>
       </w:pPr>
       <w:r>
-        <w:t>The twelfth ground is compulsion of the buyer's choice. In the strict sense, compulsion needs a threat. Here the pressure is the loss of function: the owner who could keep a sound product is made to buy another. When Revolv switched off its hubs, every owner had to replace a hub that was physically sound. The buyer was free in law, but the choice to buy again was not free in fact.</w:t>
+        <w:t>The second is el-gararü'l-fâhiş, a heavy uncertainty touching the essence of the contract. It is one of the basic grounds that the Prophet, peace be upon him, himself forbade: "The Messenger of God, peace be upon him, forbade the sale of gharar," that is, a sale that carries uncertainty and the risk of deceit. This was reported by Muslim. Its meaning in jurisprudence: the existence of the goods, their deliverability, or the basic qualities that directly determine the price, the life, the durability and the quality, are left unknown at the time of the contract. Its application: the designed life of a device is the most essential quality that determines the price of that goods. A limit on life that the producer knows and that the buyer has no possible way of knowing brings into the contract one-sided ignorance and heavy gharar. The buyer ties his money to an unknown, not knowing for how long the device will work.</w:t>
       </w:r>
     </w:p>
     <w:p>
@@ -143,7 +143,7 @@
         <w:spacing w:line="360" w:lineRule="auto" w:after="160"/>
       </w:pPr>
       <w:r>
-        <w:t>The thirteenth ground is that hasty gain is punished. The Mecelle says that whoever hastens something before its time by illegitimate means is punished by being deprived of it. The rule's own example is the heir who kills to inherit early. A maker who shortens the life of a product brings forward the buyer's next purchase. Under the cartel the second purchase came after one thousand hours where it would have come after fifteen hundred, which means one third sooner.</w:t>
+        <w:t>The third is eş-şartü'l-müfsid, or şartü'n-nâkız li-muktezâ'l-akd, a condition that is contrary to the essence of the contract. In jurisprudence, when a contract of sale, bey', is made, the muktezâ of the contract, its natural and legal result, is that ownership and the power of disposal pass entirely to the customer. Its meaning: during the contract, one of the parties puts a restriction that is entirely opposed to the nature of the contract and that yields a one-sided benefit. Its application: the clauses that the producer puts in the user agreements, such as "You bought this device but you cannot open it, you cannot take it to an independent repairer, you cannot fit third-party parts, the software belongs to me," are in the method of jurisprudence a şart-ı müfsid, a condition that spoils the contract. For the seller collects the full price of ownership, and does not give the buyer the right of disposal that ownership brings. A condition that negates the purpose of the contract is void in jurisprudence.</w:t>
       </w:r>
     </w:p>
     <w:p>
@@ -151,7 +151,7 @@
         <w:spacing w:line="360" w:lineRule="auto" w:after="160"/>
       </w:pPr>
       <w:r>
-        <w:t>The fourteenth ground is enmity. A hidden practice produces disputes when it is found. The Qur'an gives, as a reason for forbidding wine and gambling, that Satan wants to cause enmity and hatred between you. Any dealing that reliably produces enmity falls under the same concern, and the Hanafi rule on uncertainty that leads to quarrel says the same thing for sales. Apple's case produced a French fine of twenty-five million euros, a class settlement of five hundred million dollars in the United States, and a settlement of one hundred thirteen million dollars with thirty-four states and the District of Columbia. Apple settled the American cases without admitting wrongdoing. The point is the number of disputes, not the verdict.</w:t>
+        <w:t>The fourth is istismâr-ı iztırâr, or bey'u'l-mudtarr, the exploitation of distress and of monopoly. It is reported from Ali, may God be pleased with him, that the Messenger of God, peace be upon him, forbade the sale made by exploiting the situation of a person who is in distress and helpless. This is in Abu Dawud. Its meaning: creating an artificial narrowness and a state of compulsion in which the consumer, or one party, can reach no other alternative, and making him agree to inflated prices. Its application: when the producer does not sell spare parts outside and locks the repair software only to his own authorized service, the owner of the broken device is placed in the position of a mudtarr, a helpless person. He has no legal or practical way except to pay the inflated service fee that the producer dictates, so as not to throw the device away. This is the ground of exploiting a market narrowness that was created on purpose.</w:t>
       </w:r>
     </w:p>
     <w:p>
@@ -159,7 +159,7 @@
         <w:spacing w:line="360" w:lineRule="auto" w:after="160"/>
       </w:pPr>
       <w:r>
-        <w:t>Fourth moment, the sum of all sales. What about the people who never bought anything?</w:t>
+        <w:t>The fifth is ta'lîlü'l-hürme bi-nev'i'l-ayn, that the object or the act is harmful in itself, the ground of mischief. In jurisprudence, if goods or an action by themselves harm the mind, life, descendants or property directly, their sale and production are forbidden without looking at any other condition. Wine, drugs and tools of deceit are examples. Its meaning: the subject of the contract produces not benefit but direct harm. Its application: the suicide counters that are placed inside the devices, whose only task is to deliberately break or slow the device after a certain time, the false update codes, and the rotten parts put in knowingly so that they wear out, are not, in jurisprudence, mütekavvim, that is, lawful and useful goods or deeds. To produce and sell a code or a design made only to cause harm is harm in itself. Lâ darara ve lâ dırâr: there is no harm and no answering harm with harm.</w:t>
       </w:r>
     </w:p>
     <w:p>
@@ -167,7 +167,7 @@
         <w:spacing w:line="360" w:lineRule="auto" w:after="160"/>
       </w:pPr>
       <w:r>
-        <w:t>The fifteenth ground is waste and the burden on the public. The Mecelle says a private harm is accepted to repel a public one, the heavier harm is removed by the lighter, and burdens go with benefits. Take a device that could serve six years and is replaced after three. Two devices are made, shipped and disposed of where one was enough, and each carries its metals, its energy and its disposal. The United Nations Global E-waste Monitor counted sixty-two million tonnes of electronic waste in 2022 and found that less than a quarter was documented as properly collected and recycled. The report names shorter product life cycles, limited repair options and design shortcomings among the causes. The maker takes the benefit of the extra sale. The cost of the extra extraction and disposal falls on people who were not parties to the sale.</w:t>
+        <w:t>In summary. When all the grounds of prohibition in the field of dealings in jurisprudence are gathered, this list appears. One, riba: increase without counter-value, usury. Two, gharar and ignorance: uncertainty and risk. Three, ghish and taghrir: hiding a defect, deceit. Four, gabn-i fâhiş: a deceptive price difference far beyond the market rate. Five, ekl-i emvâl bi'l-bâtıl: unjust and unlawful acquisition of property. Six, şart-ı fâsid: a restrictive contract that destroys the essence of ownership. Seven, ihtikâr and exploitation of distress: monopoly and the exploitation of helplessness. Eight, ikrâh: compulsion that destroys consent. Nine, dırâr and mefsedet: direct harm to property, life or the environment. Ten, adâvet and münâzaa: leading to enmity and dispute in society. The practice of planned obsolescence touches not only one of the items on this list. It is a compound crime that touches at least six principal grounds of jurisprudence at the same time: gharar, taghrir, the corrupting condition, eating property by false means, monopoly, and enmity.</w:t>
       </w:r>
     </w:p>
     <w:p>
@@ -175,7 +175,7 @@
         <w:spacing w:line="360" w:lineRule="auto" w:after="160"/>
       </w:pPr>
       <w:r>
-        <w:t>The sixteenth ground is the collapse of trust in the market, and it has a companion: capital that is wasted. Where buyers cannot judge the life of a product, the honest maker loses. The cartel fined its members whose bulbs lasted too long, so the maker who built the better bulb was punished for it. When cheating becomes the rule, an honest maker copies it or leaves, and buyers lose the one signal they had. And the money spent replacing a device that still worked cannot be spent on anything else. When Revolv pulled its server, every owner paid to replace a sound hub, and every product replaced early repeats that loss.</w:t>
+        <w:t>In this part we will not reduce the act of planned obsolescence to a single abstract offence. We will lay on the table the sixteen separate grounds that the act touches, that spoil the contract and that disturb the economic order. We will divide these grounds into two bodies. The first body is the juristic and religious grounds: ten classical grounds that arise directly from the texts, the verses and the hadiths, and from the contract theory of the principles of jurisprudence. The second body is the rational, economic and engineering grounds: six rational grounds that the reason, the technical facts and the science of economics firmly establish through the link of cause and effect, even where jurisprudence does not mention them by text. After that, we will analyze the sixteen grounds in a classification of many aspects: by whose standpoint it is, that is, by the party addressed; by the nature of the harm it produces; and by which part of the contract it touches.</w:t>
       </w:r>
     </w:p>
     <w:p>
@@ -183,7 +183,7 @@
         <w:spacing w:line="360" w:lineRule="auto" w:after="160"/>
       </w:pPr>
       <w:r>
-        <w:t>Three more effects follow from the same cause. First, the independent repair trade is destroyed. When the tools are reserved to dealers, the independent shops in the same towns are shut out of the work, and the repair work goes to the dealers. That is what the Deere order corrects. The Mecelle rule applies again: the seller who has completed the sale cannot undo it by closing the repair. Second, a country that imports its devices pays foreign currency for every replacement, so replacing at three years instead of six doubles the foreign currency spent for each year of service. Third, a product that depends on the maker's server can be turned off by the maker, and the Revolv hubs all stopped on the same date. Whoever holds the switch holds the power, and a state or an industry whose machines depend on a foreign maker's server has placed that power outside its borders.</w:t>
+        <w:t>First, the sixteen grounds, separated from each other and defined without metaphor. The first body is the juristic grounds, the basis of the rulings of classical law. They are the founding elements that, in Islamic law of obligations, make a contract void or defective and make the gain forbidden.</w:t>
       </w:r>
     </w:p>
     <w:p>
@@ -191,7 +191,7 @@
         <w:spacing w:line="360" w:lineRule="auto" w:after="160"/>
       </w:pPr>
       <w:r>
-        <w:t>Seen from what Islamic law protects, the sixteen grounds fall in four places. Grounds one, four, eight and fifteen strike at property. Grounds two, three, five, nine and twelve strike at the soundness of the contract and the freedom of the will. Grounds ten, fourteen and sixteen strike at trust and peace in society. Grounds six, seven, eleven and fifteen strike at the material world and its balance. No single ground carries this verdict alone. Planned obsolescence touches at least six of them at once: uncertainty, deceit, the corrupting condition, wealth taken without a counter-value, withholding and enmity. That is why it is not an ordinary defect in a sale and not a lawful business manoeuvre. It is an organized violation of rights.</w:t>
+        <w:t>One. Ekl-i emvâl bi'l-bâtıl, the ground of false and counter-valueless gain. It is established by the text of An-Nisa 29. In a sale, the price taken must be the counter-value of the goods delivered. When the money for a life of five years is collected and a life of two years is knowingly delivered, the money for the three years in between remains in law without a counter-value, and this is the acquisition of unjust property by a false way.</w:t>
       </w:r>
     </w:p>
     <w:p>
@@ -199,7 +199,7 @@
         <w:spacing w:line="360" w:lineRule="auto" w:after="160"/>
       </w:pPr>
       <w:r>
-        <w:t>Now the maker's answers. He has four.</w:t>
+        <w:t>Two. El-gararü'l-fâhiş, the ground of heavy uncertainty. The most essential element that determines the price of the goods is the period of use. A limit that one side knows and that it is technically impossible for the other side to know brings heavy uncertainty directly into the contract.</w:t>
       </w:r>
     </w:p>
     <w:p>
@@ -207,7 +207,7 @@
         <w:spacing w:line="360" w:lineRule="auto" w:after="160"/>
       </w:pPr>
       <w:r>
-        <w:t>First: "The customer accepted the terms." A term that contradicts the purpose of the contract is void, and a signature does not turn a forced yes into free consent. Every Apple owner who tapped Install had accepted the update, and not one of them had agreed to a slower phone, because nobody had told them that the update would slow it. The French authority fined Apple for omitting the information. A signature on something whose effect was hidden is not consent to that effect.</w:t>
+        <w:t>Three. Et-taghrîr ve'l-ghish, the ground of deliberately hiding a defect and of actual deceit. It is established by hadith: "Men gaşşenâ fe-leyse minnâ," whoever deceives us is not one of us. To put a weak part knowingly into the goods, or to place a hidden counter inside, and to hide it from the customer, is an actual deceit no different from hiding wet wheat under the sack.</w:t>
       </w:r>
     </w:p>
     <w:p>
@@ -215,7 +215,7 @@
         <w:spacing w:line="360" w:lineRule="auto" w:after="160"/>
       </w:pPr>
       <w:r>
-        <w:t>Second: "It was necessary for safety." Necessity is measured by its extent, and necessity does not cancel another man's right. It excuses the limit. It never excuses the hiding, and it never takes the owner's decision away from him. Apple's own history shows the difference. The shutdown problem was real, and in 2018 Apple solved the same problem by telling the owner, showing the health of the battery and letting him switch the limit off. If necessity had required silence, that fix could not exist.</w:t>
+        <w:t>Four. El-gabn-i fâhiş, the ground of a gross gap between value and price. It is the fixing of a price for a device that will turn into garbage after two years on the market rate of a device that will work five or six years. A gross price difference that combines with deceit, taghrir, spoils the contract.</w:t>
       </w:r>
     </w:p>
     <w:p>
@@ -223,7 +223,7 @@
         <w:spacing w:line="360" w:lineRule="auto" w:after="160"/>
       </w:pPr>
       <w:r>
-        <w:t>Third: "We sold the device, but we only licensed the software." In a contract, meaning counts, not wording, and what is inseparable from a thing follows the thing in the ruling. The Revolv hub is a box that does nothing without the maker's server, and the customer paid for a working hub with a lifetime subscription. A label cannot turn that sale into a lease after the money has changed hands. If the maker wants to keep ownership, he must call the contract a lease and price it as rent.</w:t>
+        <w:t>Five. Eş-şartü'l-fâsid, the ground of the restrictive condition that is contrary to the purpose of the contract. The essence of a contract of sale, its muktezâ, is that the owner can do with his goods what he wishes. The producer's imposition "You bought the device, but you cannot open it, you cannot take it to an independent repairer," is a şart-ı fâsid that spoils the nature of the contract.</w:t>
       </w:r>
     </w:p>
     <w:p>
@@ -231,7 +231,7 @@
         <w:spacing w:line="360" w:lineRule="auto" w:after="160"/>
       </w:pPr>
       <w:r>
-        <w:t>Fourth, and strongest: "It funds innovation. Without replacement sales we cannot afford research." A lawful aim does not make an unlawful means lawful, and no man's right may be broken to produce a general benefit. Take the same logic into a shop. A chocolate maker shrinks every bar by a tenth, keeps the wrapper and the price, and says the money builds a new factory. The factory may be real, and every buyer was still cheated. The research argument fails in the same way, and four questions show it. If buyers would accept "this lasts two years, and the difference funds the next model," the maker loses nothing by saying so, and his silence shows that he expects a refusal. If he needs money, he can raise the price openly, offer a trade-in, or sell a cheaper line with the life printed on it. If the new product is better, buyers have a reason to buy it and the old one does not have to die first. If the new product is not better, the buyer pays twice for the same thing, and that is not research. And if research benefits everyone, then everyone should fund it in the open, and one class of buyers should not fund it in the dark.</w:t>
+        <w:t>Six. El-ihtikâr, the ground of deliberately blocking the supply of the market and becoming a monopoly. It is the producer's not releasing the spare parts and the fault-detection software to the market and holding them only in his own center, creating an artificial scarcity in a service that the people are compelled to use.</w:t>
       </w:r>
     </w:p>
     <w:p>
@@ -239,7 +239,7 @@
         <w:spacing w:line="360" w:lineRule="auto" w:after="160"/>
       </w:pPr>
       <w:r>
-        <w:t>The conclusion is plain. Hiding the designed life of a product is cheating in the scales. Blocking the repair and locking the parts is taking another man's property without right. Sending working products to the waste pile is a violation of the public's right. Defending these acts with the words innovation, security or license does not change what the acts are.</w:t>
+        <w:t>Seven. İstismâr-ı iztırâr, or bey'u'l-mudtarr, the ground of reducing a person to helplessness and exploiting him. It is leaving the customer no other lawful channel to repair his device, and making him accept helplessly the inflated price list of the authorized service.</w:t>
       </w:r>
     </w:p>
     <w:p>
@@ -247,7 +247,7 @@
         <w:spacing w:line="360" w:lineRule="auto" w:after="160"/>
       </w:pPr>
       <w:r>
-        <w:t>The ruling follows. It is forbidden to hide a limit on a product's life or repair that the maker knows and the buyer does not. It is forbidden to slow, disable or lock a device after the sale without the owner's informed agreement. It is forbidden to close the owner's means of repair. It is required to tell the buyer the designed life and the support period before the sale, to say what an update takes away and let the owner choose, and to give notice before ending support. It remains lawful to sell cheap and short-lived products when the buyer is told, to end support with notice, to lease and call it a lease, and to charge openly for research.</w:t>
+        <w:t>Eight. Riba şüphesi, or fadl hâlî ani'l-ıvaz, the ground of increase without counter-value. The broadest definition of riba in jurisprudence is "every increase that has no counter-value." Every advance surplus collected without a counter-value in period of service or durability comes close to this ground.</w:t>
       </w:r>
     </w:p>
     <w:p>
@@ -255,7 +255,175 @@
         <w:spacing w:line="360" w:lineRule="auto" w:after="160"/>
       </w:pPr>
       <w:r>
-        <w:t>So the rule is short. Tell the buyer. Ask the owner. Leave the owner in charge. Thank you.</w:t>
+        <w:t>Nine. El-ikrâh-ı mülcî, the ground of actual compulsion. It is to remotely and deliberately slow down the software of a device in the consumer's hands, or to cut the server support, and so to bind him in fact to buy a new model. It is to cripple free will by indirect compulsion.</w:t>
+      </w:r>
+    </w:p>
+    <w:p>
+      <w:pPr>
+        <w:spacing w:line="360" w:lineRule="auto" w:after="160"/>
+      </w:pPr>
+      <w:r>
+        <w:t>Ten. Adâvet and münâzaa, the ground of producing enmity and ill will among people. It is the purpose of prohibition in Al-Ma'idah 91. When the hidden deceit is exposed, a natural hatred, grudge and enmity enter between buyer and seller. Every dealing that leads to dispute and hatred is against the spirit of jurisprudence.</w:t>
+      </w:r>
+    </w:p>
+    <w:p>
+      <w:pPr>
+        <w:spacing w:line="360" w:lineRule="auto" w:after="160"/>
+      </w:pPr>
+      <w:r>
+        <w:t>The second body is the rational, economic and technical grounds, the grounds that reason and the facts establish. Even if these grounds do not appear as terms in the books of jurisprudence, they are material facts that reason, experience and the science of economics necessarily bring out through the link of cause and effect.</w:t>
+      </w:r>
+    </w:p>
+    <w:p>
+      <w:pPr>
+        <w:spacing w:line="360" w:lineRule="auto" w:after="160"/>
+      </w:pPr>
+      <w:r>
+        <w:t>Eleven. Deliberately creating weakness by engineering, the ground of artificial suicide. Natural wear is born of the fatigue of materials. Here, the intelligence of engineering is spent not on strengthening but on placing a weak solder, a low-quality capacitor or a software lock that will make the device collapse exactly at the end of the warranty. The cause is directly intentional engineering.</w:t>
+      </w:r>
+    </w:p>
+    <w:p>
+      <w:pPr>
+        <w:spacing w:line="360" w:lineRule="auto" w:after="160"/>
+      </w:pPr>
+      <w:r>
+        <w:t>Twelve. Taking ownership hostage, the ground of actual guardianship. To make a thing that you have collected the full price for work or not work by a remote password or by part matching is to usurp the owner's physical power of disposal over his property. The buyer is made not the owner but the hostage of the producer.</w:t>
+      </w:r>
+    </w:p>
+    <w:p>
+      <w:pPr>
+        <w:spacing w:line="360" w:lineRule="auto" w:after="160"/>
+      </w:pPr>
+      <w:r>
+        <w:t>Thirteen. Needless mining and the destruction of resources, the ground of total ecological waste. When hardware that would be produced once in six years is produced again every three years, it means two times as much lithium, copper and gold taken from under the ground, and two times as much energy burned. To consume natural resources recklessly and by deceit is a rational murder.</w:t>
+      </w:r>
+    </w:p>
+    <w:p>
+      <w:pPr>
+        <w:spacing w:line="360" w:lineRule="auto" w:after="160"/>
+      </w:pPr>
+      <w:r>
+        <w:t>Fourteen. The paralysis of capital accumulation and of investment power, the ground of real economic blockage. The capital of households or enterprises, which would go to a new production or to welfare, is spent on buying again hardware that works, because of artificial failures. Capital is withdrawn from productive investment and imprisoned in the cycle of consumption.</w:t>
+      </w:r>
+    </w:p>
+    <w:p>
+      <w:pPr>
+        <w:spacing w:line="360" w:lineRule="auto" w:after="160"/>
+      </w:pPr>
+      <w:r>
+        <w:t>Fifteen. The liquidation of the independent repair sector and of local craft, the ground of the destruction of tradesmen. Locking the part and the scheme leaves the electrician, the lathe worker and the board repairer of the local industrial site technically useless. Service monopolies wipe local labor off the market.</w:t>
+      </w:r>
+    </w:p>
+    <w:p>
+      <w:pPr>
+        <w:spacing w:line="360" w:lineRule="auto" w:after="160"/>
+      </w:pPr>
+      <w:r>
+        <w:t>Sixteen. The collapse of market trust, the lemon market and the suicide of trust. When cheating spreads, the consumer stops trusting the statement of any brand. The honest domestic manufacturer who makes a product that lasts ten years cannot hold on against those who sell cheap devices that die early through planned obsolescence, and honest goods are driven out of the market.</w:t>
+      </w:r>
+    </w:p>
+    <w:p>
+      <w:pPr>
+        <w:spacing w:line="360" w:lineRule="auto" w:after="160"/>
+      </w:pPr>
+      <w:r>
+        <w:t>Now the classification of the sixteen grounds in many aspects. These sixteen grounds do not stand side by side at random. When seen from different standpoints, they form certain blocks. First, they divide into ten juristic or Sharia grounds, from the text and the theory of contract: ekl-i emvâl bi'l-bâtıl, heavy gharar, taghrir and ghish, gabn-i fâhiş, şart-ı fâsid, ihtikâr, exploitation of distress, the suspicion of riba, ikrâh-ı mülcî, and enmity and dispute. And into six rational or economic grounds, from the facts, the technology and the economy: the artificial suicide design, the taking of ownership hostage, total ecological waste, the paralysis of capital accumulation, the liquidation of tradesmen and craft, and the suicide of trust, the lemon market.</w:t>
+      </w:r>
+    </w:p>
+    <w:p>
+      <w:pPr>
+        <w:spacing w:line="360" w:lineRule="auto" w:after="160"/>
+      </w:pPr>
+      <w:r>
+        <w:t>Aspect one: the party addressed, that is, against whom each ground is. The first standpoint is the consumer, the buyer, the one who sits directly at the table. It holds ekl-i emvâl bi'l-bâtıl, gharar, taghrir and ghish, gabn-i fâhiş, şart-ı fâsid, ikrâh-ı mülcî, the artificial suicide and the taking of ownership hostage. Its basic manifestation: the consumer's consent is crippled by deceit, his money is taken without counter-value, the power of disposal over the goods he bought is taken from his hand, and he is forced to new spending before his time. The second standpoint is the market and the tradesman, the working of trade and of manufacture. It holds ihtikâr, exploitation of distress, the liquidation of tradesmen and the suicide of trust. Its basic manifestation: the atmosphere of competition is strangled, the independent repair tradesmen are wiped from the market, the honest producer is punished by unfair competition, and general trust in the market collapses. The third standpoint is the public, the state and nature, the third persons who are not seen. It holds enmity and dispute, ecological waste and the paralysis of capital accumulation. Its basic manifestation: grudge and enmity enter society, national wealth melts through needless import and consumption, and the cost of the doubled waste and the destruction of raw material remains on all of nature and on future generations.</w:t>
+      </w:r>
+    </w:p>
+    <w:p>
+      <w:pPr>
+        <w:spacing w:line="360" w:lineRule="auto" w:after="160"/>
+      </w:pPr>
+      <w:r>
+        <w:t>Aspect two: the nature of the harm, that is, what is injured. This classification shows which of the five basic principles that jurisprudence aims to protect, the Maqasid al-Shari'a, the matter destroys. The first is the grounds that aim at the protection of property, hıfz-ı mâl: ekl-i emvâl bi'l-bâtıl, gabn-i fâhiş, the suspicion of riba and the paralysis of capital accumulation. Their nature: here a value is siphoned unjustly, directly, out of the pocket of the buyer or of the nation. The second is the grounds that aim at the soundness of the contract and the freedom of will: heavy gharar, taghrir and ghish, şart-ı fâsid, ikrâh-ı mülcî and the taking of ownership hostage. Their nature: here, before the loss of money, the mind, will and power of disposal over property of the person are crippled. A person is shown as having consented to a game to which he did not consent. The third is the grounds that aim at social morality and the peace of law: enmity and dispute, the suicide of trust, the lemon market, and the exploitation of distress. Their nature: beyond material loss, it is the decay of the feeling of trust in the community, of faithfulness to covenants and of the morality of lawful trade. The fourth is the grounds that aim at physical existence and the ecological balance: the artificial suicide design, total ecological waste and ihtikâr. Their nature: interfering in the natural balance of creation, the mîzân, so that a corruption against the nature of things is produced and nature is destroyed.</w:t>
+      </w:r>
+    </w:p>
+    <w:p>
+      <w:pPr>
+        <w:spacing w:line="360" w:lineRule="auto" w:after="160"/>
+      </w:pPr>
+      <w:r>
+        <w:t>Aspect three: time and manifestation, that is, when the harm is born. The first is the grounds born at the moment of contract, at the time of sale: the gross difference is hidden, which is gabn, the defect is covered, which is taghrir, the life is unknown, which is gharar, and restrictive clauses are made to be approved, which is şart-ı fâsid in the contract. The second is the grounds that work during the period of use: the suicide counter inside the device is working, which is the artificial weakness, and the owner's fitting of independent parts is blocked by software, which is the taking of ownership hostage, working from the inside. The third is the grounds born at the last phase, when the failure comes and support is cut: the consumer is forced to bow to the authorized service, which is iztırar; the device is made useless by software and he is bound to a new purchase, which is ikrah; the counter-valueless money in between stays in the producer's pocket, which is ekl-i bâtıl; when the customer understands that he was deceived, enmity begins, which is adâvet; and the sound body is thrown into the garbage and nature is poisoned, which is ecological waste.</w:t>
+      </w:r>
+    </w:p>
+    <w:p>
+      <w:pPr>
+        <w:spacing w:line="360" w:lineRule="auto" w:after="160"/>
+      </w:pPr>
+      <w:r>
+        <w:t>The binding ruling of this part. As is seen, planned obsolescence is neither a simple sale of a defective good, hıyârü'l-ayb, nor a commercial maneuver acceptable in a free market. This act, from the juristic standpoint, is the compound of ten Sharia grounds that spoil at the same time the pillar of the contract, which is consent; the justice of the price, which is gabn; the quality of the goods sold, which is gharar; and the result of ownership, which is the right of disposal. From the rational and economic standpoint, it is the execution of six rational grounds: it wastes the intelligence of engineering on rotting things, takes ownership hostage, evaporates capital, strangles local tradesmen and destroys nature. For this reason, this act is both in the theory of contract an illegitimate dealing that carries the contract to nullity, and from the standpoint of public law and morality an organized violation of rights whose prevention is obligatory.</w:t>
+      </w:r>
+    </w:p>
+    <w:p>
+      <w:pPr>
+        <w:spacing w:line="360" w:lineRule="auto" w:after="160"/>
+      </w:pPr>
+      <w:r>
+        <w:t>PART FOUR: THE CLAIMS OF PRODUCERS AND THEIR REFUTATION.</w:t>
+      </w:r>
+    </w:p>
+    <w:p>
+      <w:pPr>
+        <w:spacing w:line="360" w:lineRule="auto" w:after="160"/>
+      </w:pPr>
+      <w:r>
+        <w:t>The first claim: "The customer accepted the terms of use, he has consented." The refutation, with an example: you go to a hotel, and while you fill in the registration form they put in front of you a forty-page contract like an ant's prayer. You sign out of necessity. On page thirty-two, in small print, it says: "The hotel management reserves the right, while the guest sleeps, to enter the room and switch off the air conditioner, or to throw the guest's belongings off the balcony." At midnight, when they come and switch off the air conditioner, can they say: "You signed this, you had consented"? They cannot. For the articles that are contrary to the essence and nature of a contract and to the ordinary course of life are void in law and in morality, even if they are hidden in it. People are bound to click on those software agreements in order to use the device. This is not consent, it is a necessity left without an alternative. There is no consent to what is unknown and to what is imposed. The rule: conditions that are contrary to the purpose of the contract and rest on deceit are void, and a compulsory signature does not take the place of real consent.</w:t>
+      </w:r>
+    </w:p>
+    <w:p>
+      <w:pPr>
+        <w:spacing w:line="360" w:lineRule="auto" w:after="160"/>
+      </w:pPr>
+      <w:r>
+        <w:t>The second claim: "We had no choice. To protect safety and to save the battery, we slowed down the device." The refutation, with an example: you take your car to the service for a routine check. The master, without telling you, welds an iron wedge under the gas pedal, and the car can no longer go over sixty kilometers an hour. When you take back the car and notice, you ask: "Why did you do this?" The master says: "Your brake pads are worn, if you drove fast you could have had an accident, I limited the engine for your safety." Is this good faith? No! What an honest master would do is clear. He says: "Brother, your brake pads are worn. Either change them, or drive at this speed," and leaves the choice and the decision to the owner of the goods. To slow down the device secretly from the customer and then to say "it was for your good" is not a lawful measure. It is a fraud that makes the customer believe that the device has broken down and forces him to buy a new model. If a state of necessity exists, that necessity is said openly. No work is done behind the back. The rule: necessity does not make lawful an interference in property without the knowledge and the will of its owner.</w:t>
+      </w:r>
+    </w:p>
+    <w:p>
+      <w:pPr>
+        <w:spacing w:line="360" w:lineRule="auto" w:after="160"/>
+      </w:pPr>
+      <w:r>
+        <w:t>The third claim: "We sold the device, but we did not sell the software inside it, we licensed it." The refutation, with an example: you buy the latest model car from a gallery. Two years later the producer shuts down the brain of the car by a remote signal and says: "We sold you the body and the engine block of the car, but the software that runs the engine was in our license. The license is over, the car no longer runs." Can such nonsense be accepted? Without that software, the car is nothing but a heap of iron. For whatever purpose a good was sold, the part that is necessary for that good to work is inside that sale. The software is bound to the hardware as the flesh is bound to the nail. To take the full sale price and then say "the software was rented" is the cunning of turning a sale into a lease by a play of words. The rule: in contracts, one looks not at the words but at the purpose and the meaning, and the element that follows the principal thing is in the ruling of the principal thing.</w:t>
+      </w:r>
+    </w:p>
+    <w:p>
+      <w:pPr>
+        <w:spacing w:line="360" w:lineRule="auto" w:after="160"/>
+      </w:pPr>
+      <w:r>
+        <w:t>The fourth claim: "We finance innovation. Without this, we cannot do research and development, and technology stops." The refutation, with an example: let us think of a pharmaceutical factory. It wants to develop a new cancer drug that will save the world, and this requires a very large research and development budget. To find this budget, the factory secretly cuts the active substance of the blood pressure drugs that it already sells by half. The patients are forced to buy twice the medicine, the factory earns twice the money, and with that money it researches the cancer drug. Even if the goal is to defeat cancer, can research and development be financed by secretly stealing from the pocket and the health of a patient? It cannot. However bright the next goal is, you cannot provide its financing by sentencing the customer secretly to defective goods. If your new model is really superior to the old one, you offer it to the customer openly, and the customer, by his own consent, comes and buys it. To deliberately kill the old goods is not a requirement of innovation. It is a pretext for running away from competition and from honesty. The rule: a lawful aim never makes an unlawful means lawful, and the general benefit cannot be obtained by trampling the right of a person.</w:t>
+      </w:r>
+    </w:p>
+    <w:p>
+      <w:pPr>
+        <w:spacing w:line="360" w:lineRule="auto" w:after="160"/>
+      </w:pPr>
+      <w:r>
+        <w:t>CONCLUSION.</w:t>
+      </w:r>
+    </w:p>
+    <w:p>
+      <w:pPr>
+        <w:spacing w:line="360" w:lineRule="auto" w:after="160"/>
+      </w:pPr>
+      <w:r>
+        <w:t>The matter, in all its aspects, is established, and the ruling is firmly set. One: to hide the life of goods is to give short weight on the scale. Two: to lock the repair and the part is to seize the property of another. Three: to do these under the cover of "technology," "security" or "contract" does not lighten the crime, it makes the fraud layered.</w:t>
+      </w:r>
+    </w:p>
+    <w:p>
+      <w:pPr>
+        <w:spacing w:line="360" w:lineRule="auto" w:after="160"/>
+      </w:pPr>
+      <w:r>
+        <w:t>If you are a producer, the rule is simple: if you will make cheap goods, you write their life on them and you sell them openly. You take your hand off the goods that you sold. You respect the owner's right of repair and his will. Every act that does not keep to these limits is not trade, it is organized usurpation. Thank you.</w:t>
       </w:r>
     </w:p>
     <w:sectPr>

</xml_diff>

<commit_message>
Konuşma metni: delil ve karşı delil yapısıyla, tekrarsız yeniden kuruldu
Co-Authored-By: Claude Sonnet 5.5 <noreply@anthropic.com>
Claude-Session: https://claude.ai/code/session_01Q71gHQtKJ86ZE2CtYTYSwP
</commit_message>
<xml_diff>
--- a/sunum/plan2/Konusma_Metni_Planned_Obsolescence.docx
+++ b/sunum/plan2/Konusma_Metni_Planned_Obsolescence.docx
@@ -15,7 +15,7 @@
         <w:spacing w:line="360" w:lineRule="auto" w:after="160"/>
       </w:pPr>
       <w:r>
-        <w:t>The method I will follow is this: I will lay the matter out with rational, experiential and realistic examples that leave no room for evasion. The talk has four parts. In Part One, I give our three evidences. In Part Two, I show the social and economic harms. In Part Three, I lay out the grounds of Islamic law that forbid the practice, sixteen grounds in all, and classify them. In Part Four, I refute, one by one, the four false claims that producers hide behind. After that I will give the conclusion.</w:t>
+        <w:t>The talk has two sides. On the first side stand our evidences, eight of them. On the second side stand the evidences of the other side, the producers, four of them, and I will refute each one. Every evidence has the same shape. First comes the claim. Then comes the proof that the effect follows from the cause. Then comes one example. Then comes the rule that governs it. I use real cases and arithmetic for the examples, and I claim only what the case itself proves.</w:t>
       </w:r>
     </w:p>
     <w:p>
@@ -23,7 +23,7 @@
         <w:spacing w:line="360" w:lineRule="auto" w:after="160"/>
       </w:pPr>
       <w:r>
-        <w:t>Trade is two people exchanging value by mutual consent. When one side knows what it receives while the other side hides what it gives, trade ends there, and theft and usurpation begin. The matter of planned obsolescence is not a complicated technology debate. The matter is this: the seller secretly steals the life of the goods he sells, and he does not take his hand off the property he has sold.</w:t>
+        <w:t>Trade is two people exchanging value by mutual consent. When one side knows what it receives while the other side hides what it gives, trade ends there, and theft and usurpation begin. Planned obsolescence is not a complicated technology debate. It is the case in which a seller secretly steals the life of the goods he sells, and does not take his hand off the property he has sold. By planned obsolescence I mean a choice by the maker that shortens the useful life of a product he has sold, or takes away the owner's power to extend that life. Ordinary wear is outside this definition, because nobody chose it. A short life that is printed on the box is outside it too, because the buyer chose it with his eyes open.</w:t>
       </w:r>
     </w:p>
     <w:p>
@@ -31,7 +31,7 @@
         <w:spacing w:line="360" w:lineRule="auto" w:after="160"/>
       </w:pPr>
       <w:r>
-        <w:t>PART ONE: OUR EVIDENCES.</w:t>
+        <w:t>OUR FIRST EVIDENCE: THE PRICE BUYS SOMETHING THE BUYER DOES NOT RECEIVE.</w:t>
       </w:r>
     </w:p>
     <w:p>
@@ -39,7 +39,7 @@
         <w:spacing w:line="360" w:lineRule="auto" w:after="160"/>
       </w:pPr>
       <w:r>
-        <w:t>Our first evidence is the hidden defect and gain without a counter-value. This is the principle of consent. Imagine you are building a house, and you order concrete of C30 standard from a concrete plant, concrete that should last fifty years. You pay the price of C30 down to the last penny. The owner of the plant, in his laboratory, uses an additive that he alone knows and that nobody outside can detect, and he adjusts the strength of the concrete so that it crumbles from the inside in ten years. Ten years later the building cracks and cannot be lived in. What happened here? You paid for fifty years of strength, and the producer secretly delivered goods of ten years. The price of the remaining forty years stayed in the producer's till. If the buyer had known this limit, would he have paid that money? No. To put into an electronic device a solder that, with normal use, could last five years but is knowingly made to fail in two, a battery that is made to swell, or software that counts the life of the device and locks it, is the same as secretly stealing strength from the concrete of a building. Every life that is hidden is advance payment stolen from the customer. The rule is this: a sale made with deceit and with gross price deception, gabn-i fâhiş, is void. The part in which the buyer's consent is missing is unjust gain for the seller, and it is forbidden.</w:t>
+        <w:t>The claim: a sale is valid only when what the buyer pays is matched by what he receives, and the part that is not matched is taken without right. The proof has four steps. A price is set by what the buyer expects to receive, and for a device that includes its ordinary life. The maker knows the life he chose, and the buyer cannot see it. The buyer pays for the expected life and receives a shorter one. So the part of the price that equals the missing life has no counter-value. This is arithmetic. If a device serves half the expected time, half of the price bought nothing.</w:t>
       </w:r>
     </w:p>
     <w:p>
@@ -47,7 +47,7 @@
         <w:spacing w:line="360" w:lineRule="auto" w:after="160"/>
       </w:pPr>
       <w:r>
-        <w:t>Our second evidence is causing harm on purpose and then producing a second gain from that harm. This is the principle of harm. Imagine you buy a brand-new combi boiler for your home. In the critical, hottest pipeline of the boiler, copper or brass is the technical standard. The producer, however, not to raise his profit but so that the device cracks from the heat and leaks water exactly when it completes its third year, puts a weak plastic part there. Three years later that part bursts. Water floods your home, your parquet swells, and the boiler stops working. You have to call the producer. He sells you that plastic part at an inflated price, and he also says: "This model is old, its repair costs more than it is worth, come, let us give you a new one." There is no natural wear here. The producer has knowingly planted a time bomb in the customer's property. He has harmed the customer, and out of the result of that harm he has sold the customer a second product or an inflated service. He has drawn a benefit from the disaster he himself caused. The rule is: ed-dararu yüzâl, harm is removed. Nobody can obtain a lawful gain from a harm that he caused through his own intentional and unjust act.</w:t>
+        <w:t>The same fact falls under three names in the law. First, the Qur'an says in Surah An-Nisa, verse 29: "O you who believe! Do not consume your wealth among yourselves by false ways." Taking a price with no counter-value is eating property by a false way, ekl-i emvâl bi'l-bâtıl. Second, the jurists define riba as an increase that has no counter-value in an exchange. I do not call this riba, but the unmatched part of the price has the same shape, and it falls under the same concern. Third, the jurists accept small gaps between price and value, and they draw the line between a small gap and a gross one, gabn-i fâhiş, anywhere from a twentieth of the value to a third, according to the school. A gross gap that comes with deceit spoils the contract.</w:t>
       </w:r>
     </w:p>
     <w:p>
@@ -55,7 +55,7 @@
         <w:spacing w:line="360" w:lineRule="auto" w:after="160"/>
       </w:pPr>
       <w:r>
-        <w:t>Our third evidence is trespass on property and taking it hostage. This is the principle of ownership. Imagine you set up a logistics company and you buy a brand-new truck for transport. You count out three million lira, and the license is registered in your name. Two years later the alternator or a simple sensor of the vehicle fails. Your experienced master at the industrial site obtains the same original part and fits it. But the engine of the truck does not start. Why? Because the producer has put a digital lock in the brain of the vehicle. He says: "If our authorized service does not come and connect its own encrypted diagnostic device, this vehicle does not run." The authorized service does not give this password and software to anyone outside. It comes, charges five times the market service fee for that two-minute operation, and keeps your vehicle waiting for days, causing you commercial loss. The usurpation here is this: the goods do not break every month, but every time the goods fail, or every time the time for routine maintenance comes, the real owner of the goods is made unable to dispose of his own property. Your right to choose your own master, to buy the part cheaply, and to operate your property as you wish is taken from your hand. The owner is removed from being the lord of his property and is turned into a hostage who waits in line at the producer's door at every repair. The rule is this: when the sale is complete, the seller's right to dispose of the goods falls entirely, and to restrict the lawful power of disposal of the owner over his property is usurpation. In the words of the rule, el-milkü bi-tamâmih, ownership is complete.</w:t>
+        <w:t>The example is Revolv, a smart-home hub sold with a lifetime subscription. In October 2014 Nest bought the company and stopped selling the hub. In April 2016 Nest announced that the hub would stop working on the fifteenth of May. Nest explained that lifetime meant the life of the device, and the maker ended the life of the device by its own decision. The customer had paid in full. After the fifteenth of May the hub was worth nothing. The part of the price that was meant to buy the time after that date had no counter-value, and the gap was the whole value, which is beyond any line any school has drawn. The rule: a sale made with deceit and gross price deception is void, and the part in which the buyer's consent is missing is unjust gain for the seller and it is forbidden.</w:t>
       </w:r>
     </w:p>
     <w:p>
@@ -63,7 +63,7 @@
         <w:spacing w:line="360" w:lineRule="auto" w:after="160"/>
       </w:pPr>
       <w:r>
-        <w:t>PART TWO: THE SOCIAL AND ECONOMIC HARMS.</w:t>
+        <w:t>OUR SECOND EVIDENCE: A HIDDEN ATTRIBUTE AND DECEIT.</w:t>
       </w:r>
     </w:p>
     <w:p>
@@ -71,7 +71,7 @@
         <w:spacing w:line="360" w:lineRule="auto" w:after="160"/>
       </w:pPr>
       <w:r>
-        <w:t>Planned obsolescence does not stay a deceit between individuals. When it becomes a practice of a whole sector, it produces the following harms, and the cause-and-effect link between the practice and each of them is established.</w:t>
+        <w:t>The claim: when the seller knows an attribute that sets the price and hides it, the sale rests on gharar and on taghrir, and it is corrupt. The proof: the expected life of a product sets its price. The seller alone knows the life he designed. The buyer has no way to see it from the product. A seller who stays silent where speaking was needed makes a statement by his silence, and the statement is: "this is what you expect." So the buyer gives his consent on a false picture, and the false picture was made by the seller's silence.</w:t>
       </w:r>
     </w:p>
     <w:p>
@@ -79,7 +79,7 @@
         <w:spacing w:line="360" w:lineRule="auto" w:after="160"/>
       </w:pPr>
       <w:r>
-        <w:t>The first harm is waste, and the burden of waste thrown on society. The cause-and-effect link: when the functional life of a device is lowered from six years to three, the production, the consumption of raw materials and the amount of waste that appears, to meet the same need, mathematically double. This is not a forecast. It is a direct result. While the producer earns profit from every extra sale, the cost of storing the doubled waste, of cleaning the lithium and heavy metals that mix into groundwater, and of the squandered natural resources, is placed not on the producer but on the whole of society. The example: think of the water meters of a city. Instead of a mechanical meter whose normal technical life is ten years, an electronic circuit is put inside that is designed to lock on purpose in three years. That city, which would have used one meter in ten years, consumes three meters. Two usable bodies go to the garbage. Needless spending comes out of the consumer's pocket, and the public dumps fill early. The real rule is Mecelle, Article 26: "Zarar-ı âm def'içün zarar-ı hâs ihtiyar olunur." That is, for the repelling of a general harm, a particular harm is chosen. The raw-material waste and the environmental damage the public carries is a general harm, while the producer's interest in earning from sales is a particular one. To prevent the general harm, this gate of profit of the producer is closed.</w:t>
+        <w:t>The texts agree. The Prophet, peace be upon him, forbade the sale that contains gharar, uncertainty about what is sold, and this was reported by Muslim. The Prophet also said: whoever deceives us is not one of us. He found wet grain under dry grain in a heap, and he asked the seller why he had not put it on top, so that people could see it. The buyer could not have found the wet grain himself, and the seller was still blamed for hiding it. A hidden limit on life is the wet grain at the bottom of the heap. A weak part put in knowingly, or a hidden counter that ends the life of the device, is deceit of exactly this kind. The Hanafi jurists add that an uncertainty which leads to quarrel invalidates the sale.</w:t>
       </w:r>
     </w:p>
     <w:p>
@@ -87,7 +87,7 @@
         <w:spacing w:line="360" w:lineRule="auto" w:after="160"/>
       </w:pPr>
       <w:r>
-        <w:t>The second harm is the deliberate destruction of the repair market, and the consumer's sentence to monopoly. The cause-and-effect link: when the producer does not release spare parts to the market, seals the part to the main board with software, and hides the repair schemes, it becomes physically impossible for the independent master to repair that device. The result is beyond dispute: the independent repair sector must withdraw from this field, competition ends, and the consumer bows to the single price set by the authorized service. The example: the main board of a combi boiler. When a ten-lira capacitor or relay on the board burns, an electronics master at the industrial site can find it in half an hour and replace it for a hundred lira. But if the producer covers the board with an unremovable chemical resin and encrypts the part, the master cannot touch the board. The authorized service comes and says: "This board cannot be repaired, the whole board will be replaced for eight thousand lira." A ten-lira fault is reflected to the consumer as eight thousand lira because of the physical obstacle that the producer has put there. The real rule is Mecelle, Article 100: "Bir kimsenin sa'yi kendi cihetinden tamam olan şeyi nakzetmeye matuf olursa o sa'y merduttur." The effort of a person to undo what is completed on his own side is rejected. By the contract of sale the seller has transferred the ownership of the goods to the buyer. After selling, to keep his control over the goods by blocking the ways of repair, and to try to make ownership meaningless in practice, is void, and the law rejects it.</w:t>
+        <w:t>The example is Apple. In late 2016 some iPhones shut down unexpectedly. In January 2017 Apple released an update that limited the peak performance of phones with aged batteries. Owners were not told. In December 2017 a benchmark developer measured the slowdown and published it, and Apple confirmed it and apologized. The engineering reason was real, because an aged battery can cause shutdowns. The wrong was the silence, and the French authority fined Apple for omitting the information. The rule: a sale in which the seller hides what sets the price is void for the part that was hidden, and the buyer has the right to undo it.</w:t>
       </w:r>
     </w:p>
     <w:p>
@@ -95,7 +95,7 @@
         <w:spacing w:line="360" w:lineRule="auto" w:after="160"/>
       </w:pPr>
       <w:r>
-        <w:t>The third harm is forcing a second sale before its time, which is a waste of capital. The cause-and-effect link: when the software support of a device with sound hardware is deliberately cut, or the device is made unable to work by an update, the consumer is forced to buy a new device although he has no real need. The capital that the consumer could have directed to another productive field, or to saving, is spent on replacing an instrument that is still working. The example: the barcode readers or handheld terminals that a small business uses. The case, the keys and the laser of the device work perfectly. But the main producer, with a compulsory update it sends, closes the connection to the central server for the old models. The device is left useless overnight. The owner of the business has to put the capital in his hand into a new fleet of devices, not because his existing devices broke down, but because the producer pulled the plug. The real rule is Mecelle, Article 99: "Men iste'cele şey'en kable evânihî ûkıbe bi-hırmânih." Whoever tries to obtain a thing before its time by an illegitimate means is punished by being deprived of that thing. A producer who deliberately kills the goods early and tries to obtain the second sale before its time cannot have this gain accepted as lawful.</w:t>
+        <w:t>OUR THIRD EVIDENCE: WEAKNESS PLANTED ON PURPOSE, AND THE SECOND PROFIT FROM IT.</w:t>
       </w:r>
     </w:p>
     <w:p>
@@ -103,7 +103,7 @@
         <w:spacing w:line="360" w:lineRule="auto" w:after="160"/>
       </w:pPr>
       <w:r>
-        <w:t>The fourth harm is the collapse of trust and enmity between the parties. This finding is one of the most basic grounds of prohibition in the law of contracts. One of the greatest wisdoms of the prohibition of deceit, usury and gambling in Islamic law is that they breed adâvet and bağzâ, that is, grudge, hatred and enmity, between the parties. The cause-and-effect link: when goods wear out by their nature, or break by accident, the buyer does not hold a grudge against the producer. He says: "It was fated like this, it is the nature of a human-made thing," and he accepts. But the moment the buyer learns that the failure was not natural wear, that the producer, to earn more money, deliberately put a suicide mechanism inside the device, or crippled his instrument by remote interference, the matter stops being a commercial one. In the buyer arises directly a feeling of having been betrayed, deep hatred, and a settled grudge against the seller. This grudge is not accidental. It is the inevitable reaction of the spirit that every person who is deceived shows by his nature. The bond of covenant between producer and buyer is broken, and enmity takes its place. The example: you call a water plumber to your home. The master repairs the pipe, takes his money and goes. If the pipe bursts six months later because of the lime in the water or the high pressure, you do not turn into an enemy of the master. You say: "The installation was old," and you call him again. But if you learn afterwards that the master smeared a weak adhesive that melts on the joint of the pipe, so that he would be called again after six months and earn money a second time, what awakens in your heart against that master from that moment? Fierce hatred, grudge and enmity awaken. You never let that master through your door again, and you call his name a thief. When planned obsolescence is exposed, the feeling of all consumers toward the producing company is exactly this feeling of grudge and ill will toward the plumber. The real rule of the principles of jurisprudence is: "Küllü muâmeletin tüeddî ile'n-nizâ'i ve'l-adâveti fe-hiye fâsideh." Every contract and every condition that leads to quarrel, to scheming and to enmity between the parties is corrupt and void. The main purpose of forbidding deceit in Islamic law is to prevent hypocrisy and grudge from being put between people. In Surah Al-Ma'idah, verse 91, where the reason for forbidding is explained, the words "Satan only wants to cause enmity and hatred between you" are the text for this truth.</w:t>
+        <w:t>The claim: nobody may cause harm and then profit from it. The proof has five steps. Natural wear comes from the fatigue of materials, and nobody chose it. Here the engineering effort goes in the opposite direction. It is spent to make the product fail, with a weak solder, a low-quality part, or a software lock that works at the time the maker has chosen. Remove the maker's choice, and the buyer keeps his product, and the maker does not get the second sale. So the maker's gain comes directly from the buyer's loss. The loss is real, because the buyer must pay again before he planned to. And a part, a code or a testing system whose only function is to end the product early has no lawful benefit at all. It is harm in itself, and the jurists forbid trade in what has no lawful use.</w:t>
       </w:r>
     </w:p>
     <w:p>
@@ -111,7 +111,7 @@
         <w:spacing w:line="360" w:lineRule="auto" w:after="160"/>
       </w:pPr>
       <w:r>
-        <w:t>PART THREE: THE GROUNDS OF ISLAMIC LAW.</w:t>
+        <w:t>The rule of the Mecelle is: there is no harm and no answering harm with harm, and harm is removed. No one can obtain a lawful gain from a harm that he caused through his own intentional and unjust act. The example is the Phoebus cartel. In 1925 the leading lamp makers formed it and fixed the life of a household bulb at one thousand hours. Before that, bulbs lasted about fifteen hundred hours or more. The cartel tested samples from its members and fined every member whose bulbs lasted longer. Nobody fines a bulb for lasting, and the only reason to fine it is to keep it from lasting. The arithmetic is plain. A household that needs three thousand hours of light needs three bulbs under a one-thousand-hour standard and two under a fifteen-hundred-hour standard. The extra bulb is the cartel's gain and the household's loss, and the buyer who wanted the longer-lasting bulb could not buy it from any member without that member paying a fine.</w:t>
       </w:r>
     </w:p>
     <w:p>
@@ -119,7 +119,7 @@
         <w:spacing w:line="360" w:lineRule="auto" w:after="160"/>
       </w:pPr>
       <w:r>
-        <w:t>Other basic grounds exist that corrupt contracts and commercial dealings and make them forbidden. In classical jurisprudence, especially in the Hanafi, Maliki and Shafi'i methods, all the prohibitions of trade rest on certain root grounds. Besides the public harm, the monopoly, the unjust gain and the enmity that we mentioned in Part Two, the other principal grounds that jurisprudence accepts in the field of dealings by agreement are these.</w:t>
+        <w:t>OUR FOURTH EVIDENCE: A SOLD THING IS CONTROLLED FROM AFAR.</w:t>
       </w:r>
     </w:p>
     <w:p>
@@ -127,7 +127,7 @@
         <w:spacing w:line="360" w:lineRule="auto" w:after="160"/>
       </w:pPr>
       <w:r>
-        <w:t>The first is ekl-i emvâl bi'l-bâtıl, taking property without a counter-value or without a lawful cause. It is the highest founding principle of contracts and a ground of prohibition in jurisprudence, and it rests directly on the text of the Qur'an: "O you who believe! Do not consume your wealth among yourselves by false, unlawful ways," Surah An-Nisa, verse 29. Its meaning in jurisprudence: in an exchange contract, the price one party takes has no real counter-value, ıvaz. Its application to the matter: the buyer pays ten thousand lira for the use value of five years, and the producer, through a hidden restriction, delivers him the value of two years. The price of the remaining three years stays, for the producer, without ıvaz, without a counter-value. In jurisprudence, every penny whose counter-value is not delivered falls under the ground of eating property by false means.</w:t>
+        <w:t>The claim: when the sale is complete, the seller's power of disposal over the goods falls entirely, and any control he keeps is taken from the owner. The proof: a sale moves ownership to the buyer, and ownership means the owner uses, repairs, lends and resells. A device that depends on the maker's server is not fully in the owner's hand. The maker can end its function with one decision, and the owner has no way to resist. Four effects follow from that single fact. The owner is made a hostage instead of an owner. The owner must buy another device. In law the buyer is free to refuse, but in fact the choice is not free, because the thing he could have kept was taken from him. The money he spends cannot be spent on anything else, so capital is withdrawn from productive use and goes to replacing a sound device. And the second purchase comes before its time.</w:t>
       </w:r>
     </w:p>
     <w:p>
@@ -135,7 +135,7 @@
         <w:spacing w:line="360" w:lineRule="auto" w:after="160"/>
       </w:pPr>
       <w:r>
-        <w:t>The second is el-gararü'l-fâhiş, a heavy uncertainty touching the essence of the contract. It is one of the basic grounds that the Prophet, peace be upon him, himself forbade: "The Messenger of God, peace be upon him, forbade the sale of gharar," that is, a sale that carries uncertainty and the risk of deceit. This was reported by Muslim. Its meaning in jurisprudence: the existence of the goods, their deliverability, or the basic qualities that directly determine the price, the life, the durability and the quality, are left unknown at the time of the contract. Its application: the designed life of a device is the most essential quality that determines the price of that goods. A limit on life that the producer knows and that the buyer has no possible way of knowing brings into the contract one-sided ignorance and heavy gharar. The buyer ties his money to an unknown, not knowing for how long the device will work.</w:t>
+        <w:t>The Mecelle has two rules for this. The first says that whoever tries to undo what is complete on his own side, his effort is rejected. The second says: "Men iste'cele şey'en kable evânihî ûkıbe bi-hırmânih." Whoever tries to obtain a thing before its time by an illegitimate means is punished by being deprived of it. The maker who ends a sound device brings forward the second sale, and the gain obtained like this is not accepted as lawful. In the words of the usul rule, el-milkü bi-tamâmih, ownership is complete.</w:t>
       </w:r>
     </w:p>
     <w:p>
@@ -143,7 +143,7 @@
         <w:spacing w:line="360" w:lineRule="auto" w:after="160"/>
       </w:pPr>
       <w:r>
-        <w:t>The third is eş-şartü'l-müfsid, or şartü'n-nâkız li-muktezâ'l-akd, a condition that is contrary to the essence of the contract. In jurisprudence, when a contract of sale, bey', is made, the muktezâ of the contract, its natural and legal result, is that ownership and the power of disposal pass entirely to the customer. Its meaning: during the contract, one of the parties puts a restriction that is entirely opposed to the nature of the contract and that yields a one-sided benefit. Its application: the clauses that the producer puts in the user agreements, such as "You bought this device but you cannot open it, you cannot take it to an independent repairer, you cannot fit third-party parts, the software belongs to me," are in the method of jurisprudence a şart-ı müfsid, a condition that spoils the contract. For the seller collects the full price of ownership, and does not give the buyer the right of disposal that ownership brings. A condition that negates the purpose of the contract is void in jurisprudence.</w:t>
+        <w:t>The example is Revolv again. When it switched off its hubs, every owner had to replace a hub that was physically sound. The hardware, the case and the sensors worked. Only the maker's server had been pulled. Each owner spent money that could have gone somewhere else, and the hubs all stopped on the same date. This shows one more thing. Whoever holds the switch holds the power, and a state or an industry whose machines depend on a foreign maker's server has placed that power outside its borders.</w:t>
       </w:r>
     </w:p>
     <w:p>
@@ -151,7 +151,7 @@
         <w:spacing w:line="360" w:lineRule="auto" w:after="160"/>
       </w:pPr>
       <w:r>
-        <w:t>The fourth is istismâr-ı iztırâr, or bey'u'l-mudtarr, the exploitation of distress and of monopoly. It is reported from Ali, may God be pleased with him, that the Messenger of God, peace be upon him, forbade the sale made by exploiting the situation of a person who is in distress and helpless. This is in Abu Dawud. Its meaning: creating an artificial narrowness and a state of compulsion in which the consumer, or one party, can reach no other alternative, and making him agree to inflated prices. Its application: when the producer does not sell spare parts outside and locks the repair software only to his own authorized service, the owner of the broken device is placed in the position of a mudtarr, a helpless person. He has no legal or practical way except to pay the inflated service fee that the producer dictates, so as not to throw the device away. This is the ground of exploiting a market narrowness that was created on purpose.</w:t>
+        <w:t>OUR FIFTH EVIDENCE: THE REPAIR IS CLOSED AND THE OWNER HAS ONE DOOR.</w:t>
       </w:r>
     </w:p>
     <w:p>
@@ -159,7 +159,7 @@
         <w:spacing w:line="360" w:lineRule="auto" w:after="160"/>
       </w:pPr>
       <w:r>
-        <w:t>The fifth is ta'lîlü'l-hürme bi-nev'i'l-ayn, that the object or the act is harmful in itself, the ground of mischief. In jurisprudence, if goods or an action by themselves harm the mind, life, descendants or property directly, their sale and production are forbidden without looking at any other condition. Wine, drugs and tools of deceit are examples. Its meaning: the subject of the contract produces not benefit but direct harm. Its application: the suicide counters that are placed inside the devices, whose only task is to deliberately break or slow the device after a certain time, the false update codes, and the rotten parts put in knowingly so that they wear out, are not, in jurisprudence, mütekavvim, that is, lawful and useful goods or deeds. To produce and sell a code or a design made only to cause harm is harm in itself. Lâ darara ve lâ dırâr: there is no harm and no answering harm with harm.</w:t>
+        <w:t>The claim: when the maker reserves the means of repair to himself, he spoils the sale, creates an artificial scarcity, exploits the owner's need and destroys the independent trade. The proof has four steps. A sale moves the power of disposal to the buyer, and a condition that takes that power back, such as "you cannot open the device, you cannot take it to an independent repairer, you cannot fit third-party parts," contradicts the nature of the contract. The jurists call it a corrupting condition, şart-ı fâsid, and it is void, because the seller collects the full price of ownership and does not give the right that ownership brings. Second, when the parts and the diagnostic software are held only by the maker, the scarcity is made by the maker. This is ihtikâr. The classical case is food, and some jurists, Abu Yusuf among them, extend it to anything whose withholding harms people. Third, when the only party who can repair is the party that sold the product, the owner has no choice but to accept that party's price and schedule. A report from Ali, may God be pleased with him, says the Prophet forbade the sale made to a man in distress, and this is reported by Abu Dawud. Fourth, the independent repair shops in the same towns are shut out of the work, and the work goes to the dealers. The independent trade is liquidated, and the owner has one place to take his machine.</w:t>
       </w:r>
     </w:p>
     <w:p>
@@ -167,7 +167,7 @@
         <w:spacing w:line="360" w:lineRule="auto" w:after="160"/>
       </w:pPr>
       <w:r>
-        <w:t>In summary. When all the grounds of prohibition in the field of dealings in jurisprudence are gathered, this list appears. One, riba: increase without counter-value, usury. Two, gharar and ignorance: uncertainty and risk. Three, ghish and taghrir: hiding a defect, deceit. Four, gabn-i fâhiş: a deceptive price difference far beyond the market rate. Five, ekl-i emvâl bi'l-bâtıl: unjust and unlawful acquisition of property. Six, şart-ı fâsid: a restrictive contract that destroys the essence of ownership. Seven, ihtikâr and exploitation of distress: monopoly and the exploitation of helplessness. Eight, ikrâh: compulsion that destroys consent. Nine, dırâr and mefsedet: direct harm to property, life or the environment. Ten, adâvet and münâzaa: leading to enmity and dispute in society. The practice of planned obsolescence touches not only one of the items on this list. It is a compound crime that touches at least six principal grounds of jurisprudence at the same time: gharar, taghrir, the corrupting condition, eating property by false means, monopoly, and enmity.</w:t>
+        <w:t>The example is John Deere. In January 2025 the Federal Trade Commission and five states sued Deere. They said that the software tools needed for the full range of electronic repairs were offered only to Deere's dealers, so farmers and independent shops could not complete those repairs. In July 2026 a stipulated order was filed under which Deere must, for ten years, give farmers and independent repairers resources equal to those it gives its dealers. The remedy shows what was taken. The rule: the one who sold cannot undo what he completed by closing the repair, and his effort to do it is rejected.</w:t>
       </w:r>
     </w:p>
     <w:p>
@@ -175,7 +175,7 @@
         <w:spacing w:line="360" w:lineRule="auto" w:after="160"/>
       </w:pPr>
       <w:r>
-        <w:t>In this part we will not reduce the act of planned obsolescence to a single abstract offence. We will lay on the table the sixteen separate grounds that the act touches, that spoil the contract and that disturb the economic order. We will divide these grounds into two bodies. The first body is the juristic and religious grounds: ten classical grounds that arise directly from the texts, the verses and the hadiths, and from the contract theory of the principles of jurisprudence. The second body is the rational, economic and engineering grounds: six rational grounds that the reason, the technical facts and the science of economics firmly establish through the link of cause and effect, even where jurisprudence does not mention them by text. After that, we will analyze the sixteen grounds in a classification of many aspects: by whose standpoint it is, that is, by the party addressed; by the nature of the harm it produces; and by which part of the contract it touches.</w:t>
+        <w:t>OUR SIXTH EVIDENCE: WASTE AND THE BURDEN PUT ON THE PUBLIC.</w:t>
       </w:r>
     </w:p>
     <w:p>
@@ -183,7 +183,7 @@
         <w:spacing w:line="360" w:lineRule="auto" w:after="160"/>
       </w:pPr>
       <w:r>
-        <w:t>First, the sixteen grounds, separated from each other and defined without metaphor. The first body is the juristic grounds, the basis of the rulings of classical law. They are the founding elements that, in Islamic law of obligations, make a contract void or defective and make the gain forbidden.</w:t>
+        <w:t>The claim: the benefit of an extra sale belongs to the maker, and the cost belongs to people who were not parties to the sale. The proof is arithmetic. When the life of a device falls from six years to three, two devices are made, shipped and disposed of where one was enough. The need is the same, the metals mined are doubled, the energy burned is doubled and the waste is doubled. These costs do not appear on the buyer's receipt, so they fall on the public. The United Nations Global E-waste Monitor counted sixty-two million tonnes of electronic waste in 2022 and found that less than a quarter was documented as properly collected and recycled. The report names shorter product life cycles, limited repair options and design shortcomings among the causes. Planned obsolescence belongs to those causes, and each unit it adds to the pile falls on someone who never agreed to carry it. The same arithmetic touches the national wallet. A country that imports its devices pays foreign currency for every replacement, so replacing at three years instead of six doubles the foreign currency spent for each year of service.</w:t>
       </w:r>
     </w:p>
     <w:p>
@@ -191,7 +191,7 @@
         <w:spacing w:line="360" w:lineRule="auto" w:after="160"/>
       </w:pPr>
       <w:r>
-        <w:t>One. Ekl-i emvâl bi'l-bâtıl, the ground of false and counter-valueless gain. It is established by the text of An-Nisa 29. In a sale, the price taken must be the counter-value of the goods delivered. When the money for a life of five years is collected and a life of two years is knowingly delivered, the money for the three years in between remains in law without a counter-value, and this is the acquisition of unjust property by a false way.</w:t>
+        <w:t>The Mecelle rules are three. For the repelling of a general harm, a particular harm is chosen, Article 26. The heavier harm is removed by the lighter, Article 27. And burdens go with benefits. The public's burden of waste is a general harm, while the maker's interest in sales is a particular one, so the gate of this profit is closed to prevent the general harm. The example is the six-year device replaced at three, which is the whole proof above, and which any listener can verify with a pencil.</w:t>
       </w:r>
     </w:p>
     <w:p>
@@ -199,7 +199,7 @@
         <w:spacing w:line="360" w:lineRule="auto" w:after="160"/>
       </w:pPr>
       <w:r>
-        <w:t>Two. El-gararü'l-fâhiş, the ground of heavy uncertainty. The most essential element that determines the price of the goods is the period of use. A limit that one side knows and that it is technically impossible for the other side to know brings heavy uncertainty directly into the contract.</w:t>
+        <w:t>OUR SEVENTH EVIDENCE: ENMITY BETWEEN THE PARTIES.</w:t>
       </w:r>
     </w:p>
     <w:p>
@@ -207,7 +207,7 @@
         <w:spacing w:line="360" w:lineRule="auto" w:after="160"/>
       </w:pPr>
       <w:r>
-        <w:t>Three. Et-taghrîr ve'l-ghish, the ground of deliberately hiding a defect and of actual deceit. It is established by hadith: "Men gaşşenâ fe-leyse minnâ," whoever deceives us is not one of us. To put a weak part knowingly into the goods, or to place a hidden counter inside, and to hide it from the customer, is an actual deceit no different from hiding wet wheat under the sack.</w:t>
+        <w:t>The claim: a practice that reliably produces enmity between buyer and seller is forbidden. The proof has two steps. When goods wear out by their nature or break by accident, the buyer does not hold a grudge. He says it was fated, and he accepts. But when the buyer learns that the failure was not natural wear and that the maker put the failure there, the matter stops being a commercial one, and the buyer takes the maker to be a betrayer. Disputes follow, and disputes can be counted. The Qur'an gives, in Surah Al-Ma'idah, verse 91, a reason for forbidding wine and gambling: Satan only wants to cause enmity and hatred between you. The real rule of the principles of jurisprudence is: "Küllü muâmeletin tüeddî ile'n-nizâ'i ve'l-adâveti fe-hiye fâsideh." Every contract and every condition that leads to quarrel and enmity between the parties is corrupt. The main purpose of forbidding deceit is to keep enmity out of society.</w:t>
       </w:r>
     </w:p>
     <w:p>
@@ -215,7 +215,7 @@
         <w:spacing w:line="360" w:lineRule="auto" w:after="160"/>
       </w:pPr>
       <w:r>
-        <w:t>Four. El-gabn-i fâhiş, the ground of a gross gap between value and price. It is the fixing of a price for a device that will turn into garbage after two years on the market rate of a device that will work five or six years. A gross price difference that combines with deceit, taghrir, spoils the contract.</w:t>
+        <w:t>The example is Apple once more. After the slowdown was exposed, Apple was fined twenty-five million euros in France. It settled a class action in the United States for up to five hundred million dollars, and it settled with thirty-four states and the District of Columbia for one hundred thirteen million dollars. Apple settled the American cases without admitting wrongdoing. The point is the number of disputes, not the verdict. These are the disputes that a hidden limit produces once buyers learn of it.</w:t>
       </w:r>
     </w:p>
     <w:p>
@@ -223,7 +223,7 @@
         <w:spacing w:line="360" w:lineRule="auto" w:after="160"/>
       </w:pPr>
       <w:r>
-        <w:t>Five. Eş-şartü'l-fâsid, the ground of the restrictive condition that is contrary to the purpose of the contract. The essence of a contract of sale, its muktezâ, is that the owner can do with his goods what he wishes. The producer's imposition "You bought the device, but you cannot open it, you cannot take it to an independent repairer," is a şart-ı fâsid that spoils the nature of the contract.</w:t>
+        <w:t>OUR EIGHTH EVIDENCE: THE COLLAPSE OF TRUST IN THE MARKET.</w:t>
       </w:r>
     </w:p>
     <w:p>
@@ -231,7 +231,7 @@
         <w:spacing w:line="360" w:lineRule="auto" w:after="160"/>
       </w:pPr>
       <w:r>
-        <w:t>Six. El-ihtikâr, the ground of deliberately blocking the supply of the market and becoming a monopoly. It is the producer's not releasing the spare parts and the fault-detection software to the market and holding them only in his own center, creating an artificial scarcity in a service that the people are compelled to use.</w:t>
+        <w:t>The claim: when cheating spreads, honest goods are driven out of the market. The proof has four steps. Buyers cannot judge the life of a product when they buy it. So they cannot pay more for a product that lasts longer. The honest maker who spends more to make a durable product cannot recover that cost in the price. The maker who cheats sells at a lower cost, and the honest maker either copies the cheating or leaves. This is the market of lemons, and its cause is the buyer's blindness about the life, which is exactly what planned obsolescence creates.</w:t>
       </w:r>
     </w:p>
     <w:p>
@@ -239,7 +239,7 @@
         <w:spacing w:line="360" w:lineRule="auto" w:after="160"/>
       </w:pPr>
       <w:r>
-        <w:t>Seven. İstismâr-ı iztırâr, or bey'u'l-mudtarr, the ground of reducing a person to helplessness and exploiting him. It is leaving the customer no other lawful channel to repair his device, and making him accept helplessly the inflated price list of the authorized service.</w:t>
+        <w:t>The example is again the Phoebus cartel. It fined the members whose bulbs lasted too long. The maker who built the better bulb was punished for building it, and the buyers lost the one signal they had.</w:t>
       </w:r>
     </w:p>
     <w:p>
@@ -247,7 +247,7 @@
         <w:spacing w:line="360" w:lineRule="auto" w:after="160"/>
       </w:pPr>
       <w:r>
-        <w:t>Eight. Riba şüphesi, or fadl hâlî ani'l-ıvaz, the ground of increase without counter-value. The broadest definition of riba in jurisprudence is "every increase that has no counter-value." Every advance surplus collected without a counter-value in period of service or durability comes close to this ground.</w:t>
+        <w:t>The sixteen grounds I listed along the way are all inside these eight evidences, and none is counted twice. The first evidence holds wealth without counter-value, the suspicion of riba and the gross price gap. The second holds gharar and taghrir. The third holds harm, deliberate weakness and the thing whose only function is harm. The fourth holds the taking of ownership hostage, forced replacement, the hasty second sale and the paralysis of capital. The fifth holds the corrupting condition, monopoly, the exploitation of distress and the liquidation of the independent trade. The sixth holds waste and the ecological burden. The seventh holds enmity and dispute. The eighth holds the loss of trust. Seen from what Islamic law protects, they strike at property, at the soundness of the contract and the freedom of will, at the peace of society, and at the physical world and its balance. Planned obsolescence touches at least six principal grounds at the same time: gharar, taghrir, the corrupting condition, eating property by false means, monopoly and enmity. It is therefore not a simple sale of a defective good and not a commercial manoeuvre acceptable in a free market.</w:t>
       </w:r>
     </w:p>
     <w:p>
@@ -255,7 +255,7 @@
         <w:spacing w:line="360" w:lineRule="auto" w:after="160"/>
       </w:pPr>
       <w:r>
-        <w:t>Nine. El-ikrâh-ı mülcî, the ground of actual compulsion. It is to remotely and deliberately slow down the software of a device in the consumer's hands, or to cut the server support, and so to bind him in fact to buy a new model. It is to cripple free will by indirect compulsion.</w:t>
+        <w:t>NOW THE EVIDENCES OF THE OTHER SIDE.</w:t>
       </w:r>
     </w:p>
     <w:p>
@@ -263,7 +263,7 @@
         <w:spacing w:line="360" w:lineRule="auto" w:after="160"/>
       </w:pPr>
       <w:r>
-        <w:t>Ten. Adâvet and münâzaa, the ground of producing enmity and ill will among people. It is the purpose of prohibition in Al-Ma'idah 91. When the hidden deceit is exposed, a natural hatred, grudge and enmity enter between buyer and seller. Every dealing that leads to dispute and hatred is against the spirit of jurisprudence.</w:t>
+        <w:t>The first evidence of the producers: "The customer accepted the terms of use, he has consented." The refutation: consent needs knowledge. Every Apple owner who tapped Install had accepted the update, and not one of them had agreed to a slower phone, because nobody had told them that the update would slow it. The French authority fined Apple for omitting the information. A signature on something whose effect was hidden is not consent to that effect. People are bound to click on those agreements in order to use the device, which is a necessity left without an alternative and not a choice. The rule: conditions that are contrary to the purpose of the contract and rest on deceit are void, and a compulsory signature does not take the place of real consent.</w:t>
       </w:r>
     </w:p>
     <w:p>
@@ -271,7 +271,7 @@
         <w:spacing w:line="360" w:lineRule="auto" w:after="160"/>
       </w:pPr>
       <w:r>
-        <w:t>The second body is the rational, economic and technical grounds, the grounds that reason and the facts establish. Even if these grounds do not appear as terms in the books of jurisprudence, they are material facts that reason, experience and the science of economics necessarily bring out through the link of cause and effect.</w:t>
+        <w:t>The second evidence: "We had no choice. To protect safety and to save the battery, we slowed down the device." The refutation: necessity excuses the limit. It does not excuse the hiding, and it does not take the decision from the owner. Apple's own history shows the difference. The shutdown problem was real, and in 2018 Apple solved the same problem by telling the owner, showing the health of the battery and letting him switch the limit off. If necessity had required silence, that fix could not exist. If a state of necessity exists, that necessity is said openly, and the choice is left to the owner. The rule: necessity does not make lawful an interference in property without the knowledge and the will of its owner, and it is measured by its extent.</w:t>
       </w:r>
     </w:p>
     <w:p>
@@ -279,7 +279,7 @@
         <w:spacing w:line="360" w:lineRule="auto" w:after="160"/>
       </w:pPr>
       <w:r>
-        <w:t>Eleven. Deliberately creating weakness by engineering, the ground of artificial suicide. Natural wear is born of the fatigue of materials. Here, the intelligence of engineering is spent not on strengthening but on placing a weak solder, a low-quality capacitor or a software lock that will make the device collapse exactly at the end of the warranty. The cause is directly intentional engineering.</w:t>
+        <w:t>The third evidence: "We sold the device, but we did not sell the software inside it, we licensed it." The refutation: the Revolv hub is a box that does nothing without the maker's server, and the customer paid for a working hub with a lifetime subscription. For whatever purpose a good was sold, the part that is necessary for that good to work is inside that sale. The software is bound to the hardware as the flesh is bound to the nail. To take the full sale price and then say that the software was rented is the cunning of turning a sale into a lease by a play of words, after the money has changed hands. If the maker wants to keep ownership, he must call the contract a lease and price it as rent. The rule: in contracts one looks not at the words but at the purpose and the meaning, and the element that follows the principal thing is in the ruling of the principal thing.</w:t>
       </w:r>
     </w:p>
     <w:p>
@@ -287,119 +287,7 @@
         <w:spacing w:line="360" w:lineRule="auto" w:after="160"/>
       </w:pPr>
       <w:r>
-        <w:t>Twelve. Taking ownership hostage, the ground of actual guardianship. To make a thing that you have collected the full price for work or not work by a remote password or by part matching is to usurp the owner's physical power of disposal over his property. The buyer is made not the owner but the hostage of the producer.</w:t>
-      </w:r>
-    </w:p>
-    <w:p>
-      <w:pPr>
-        <w:spacing w:line="360" w:lineRule="auto" w:after="160"/>
-      </w:pPr>
-      <w:r>
-        <w:t>Thirteen. Needless mining and the destruction of resources, the ground of total ecological waste. When hardware that would be produced once in six years is produced again every three years, it means two times as much lithium, copper and gold taken from under the ground, and two times as much energy burned. To consume natural resources recklessly and by deceit is a rational murder.</w:t>
-      </w:r>
-    </w:p>
-    <w:p>
-      <w:pPr>
-        <w:spacing w:line="360" w:lineRule="auto" w:after="160"/>
-      </w:pPr>
-      <w:r>
-        <w:t>Fourteen. The paralysis of capital accumulation and of investment power, the ground of real economic blockage. The capital of households or enterprises, which would go to a new production or to welfare, is spent on buying again hardware that works, because of artificial failures. Capital is withdrawn from productive investment and imprisoned in the cycle of consumption.</w:t>
-      </w:r>
-    </w:p>
-    <w:p>
-      <w:pPr>
-        <w:spacing w:line="360" w:lineRule="auto" w:after="160"/>
-      </w:pPr>
-      <w:r>
-        <w:t>Fifteen. The liquidation of the independent repair sector and of local craft, the ground of the destruction of tradesmen. Locking the part and the scheme leaves the electrician, the lathe worker and the board repairer of the local industrial site technically useless. Service monopolies wipe local labor off the market.</w:t>
-      </w:r>
-    </w:p>
-    <w:p>
-      <w:pPr>
-        <w:spacing w:line="360" w:lineRule="auto" w:after="160"/>
-      </w:pPr>
-      <w:r>
-        <w:t>Sixteen. The collapse of market trust, the lemon market and the suicide of trust. When cheating spreads, the consumer stops trusting the statement of any brand. The honest domestic manufacturer who makes a product that lasts ten years cannot hold on against those who sell cheap devices that die early through planned obsolescence, and honest goods are driven out of the market.</w:t>
-      </w:r>
-    </w:p>
-    <w:p>
-      <w:pPr>
-        <w:spacing w:line="360" w:lineRule="auto" w:after="160"/>
-      </w:pPr>
-      <w:r>
-        <w:t>Now the classification of the sixteen grounds in many aspects. These sixteen grounds do not stand side by side at random. When seen from different standpoints, they form certain blocks. First, they divide into ten juristic or Sharia grounds, from the text and the theory of contract: ekl-i emvâl bi'l-bâtıl, heavy gharar, taghrir and ghish, gabn-i fâhiş, şart-ı fâsid, ihtikâr, exploitation of distress, the suspicion of riba, ikrâh-ı mülcî, and enmity and dispute. And into six rational or economic grounds, from the facts, the technology and the economy: the artificial suicide design, the taking of ownership hostage, total ecological waste, the paralysis of capital accumulation, the liquidation of tradesmen and craft, and the suicide of trust, the lemon market.</w:t>
-      </w:r>
-    </w:p>
-    <w:p>
-      <w:pPr>
-        <w:spacing w:line="360" w:lineRule="auto" w:after="160"/>
-      </w:pPr>
-      <w:r>
-        <w:t>Aspect one: the party addressed, that is, against whom each ground is. The first standpoint is the consumer, the buyer, the one who sits directly at the table. It holds ekl-i emvâl bi'l-bâtıl, gharar, taghrir and ghish, gabn-i fâhiş, şart-ı fâsid, ikrâh-ı mülcî, the artificial suicide and the taking of ownership hostage. Its basic manifestation: the consumer's consent is crippled by deceit, his money is taken without counter-value, the power of disposal over the goods he bought is taken from his hand, and he is forced to new spending before his time. The second standpoint is the market and the tradesman, the working of trade and of manufacture. It holds ihtikâr, exploitation of distress, the liquidation of tradesmen and the suicide of trust. Its basic manifestation: the atmosphere of competition is strangled, the independent repair tradesmen are wiped from the market, the honest producer is punished by unfair competition, and general trust in the market collapses. The third standpoint is the public, the state and nature, the third persons who are not seen. It holds enmity and dispute, ecological waste and the paralysis of capital accumulation. Its basic manifestation: grudge and enmity enter society, national wealth melts through needless import and consumption, and the cost of the doubled waste and the destruction of raw material remains on all of nature and on future generations.</w:t>
-      </w:r>
-    </w:p>
-    <w:p>
-      <w:pPr>
-        <w:spacing w:line="360" w:lineRule="auto" w:after="160"/>
-      </w:pPr>
-      <w:r>
-        <w:t>Aspect two: the nature of the harm, that is, what is injured. This classification shows which of the five basic principles that jurisprudence aims to protect, the Maqasid al-Shari'a, the matter destroys. The first is the grounds that aim at the protection of property, hıfz-ı mâl: ekl-i emvâl bi'l-bâtıl, gabn-i fâhiş, the suspicion of riba and the paralysis of capital accumulation. Their nature: here a value is siphoned unjustly, directly, out of the pocket of the buyer or of the nation. The second is the grounds that aim at the soundness of the contract and the freedom of will: heavy gharar, taghrir and ghish, şart-ı fâsid, ikrâh-ı mülcî and the taking of ownership hostage. Their nature: here, before the loss of money, the mind, will and power of disposal over property of the person are crippled. A person is shown as having consented to a game to which he did not consent. The third is the grounds that aim at social morality and the peace of law: enmity and dispute, the suicide of trust, the lemon market, and the exploitation of distress. Their nature: beyond material loss, it is the decay of the feeling of trust in the community, of faithfulness to covenants and of the morality of lawful trade. The fourth is the grounds that aim at physical existence and the ecological balance: the artificial suicide design, total ecological waste and ihtikâr. Their nature: interfering in the natural balance of creation, the mîzân, so that a corruption against the nature of things is produced and nature is destroyed.</w:t>
-      </w:r>
-    </w:p>
-    <w:p>
-      <w:pPr>
-        <w:spacing w:line="360" w:lineRule="auto" w:after="160"/>
-      </w:pPr>
-      <w:r>
-        <w:t>Aspect three: time and manifestation, that is, when the harm is born. The first is the grounds born at the moment of contract, at the time of sale: the gross difference is hidden, which is gabn, the defect is covered, which is taghrir, the life is unknown, which is gharar, and restrictive clauses are made to be approved, which is şart-ı fâsid in the contract. The second is the grounds that work during the period of use: the suicide counter inside the device is working, which is the artificial weakness, and the owner's fitting of independent parts is blocked by software, which is the taking of ownership hostage, working from the inside. The third is the grounds born at the last phase, when the failure comes and support is cut: the consumer is forced to bow to the authorized service, which is iztırar; the device is made useless by software and he is bound to a new purchase, which is ikrah; the counter-valueless money in between stays in the producer's pocket, which is ekl-i bâtıl; when the customer understands that he was deceived, enmity begins, which is adâvet; and the sound body is thrown into the garbage and nature is poisoned, which is ecological waste.</w:t>
-      </w:r>
-    </w:p>
-    <w:p>
-      <w:pPr>
-        <w:spacing w:line="360" w:lineRule="auto" w:after="160"/>
-      </w:pPr>
-      <w:r>
-        <w:t>The binding ruling of this part. As is seen, planned obsolescence is neither a simple sale of a defective good, hıyârü'l-ayb, nor a commercial maneuver acceptable in a free market. This act, from the juristic standpoint, is the compound of ten Sharia grounds that spoil at the same time the pillar of the contract, which is consent; the justice of the price, which is gabn; the quality of the goods sold, which is gharar; and the result of ownership, which is the right of disposal. From the rational and economic standpoint, it is the execution of six rational grounds: it wastes the intelligence of engineering on rotting things, takes ownership hostage, evaporates capital, strangles local tradesmen and destroys nature. For this reason, this act is both in the theory of contract an illegitimate dealing that carries the contract to nullity, and from the standpoint of public law and morality an organized violation of rights whose prevention is obligatory.</w:t>
-      </w:r>
-    </w:p>
-    <w:p>
-      <w:pPr>
-        <w:spacing w:line="360" w:lineRule="auto" w:after="160"/>
-      </w:pPr>
-      <w:r>
-        <w:t>PART FOUR: THE CLAIMS OF PRODUCERS AND THEIR REFUTATION.</w:t>
-      </w:r>
-    </w:p>
-    <w:p>
-      <w:pPr>
-        <w:spacing w:line="360" w:lineRule="auto" w:after="160"/>
-      </w:pPr>
-      <w:r>
-        <w:t>The first claim: "The customer accepted the terms of use, he has consented." The refutation, with an example: you go to a hotel, and while you fill in the registration form they put in front of you a forty-page contract like an ant's prayer. You sign out of necessity. On page thirty-two, in small print, it says: "The hotel management reserves the right, while the guest sleeps, to enter the room and switch off the air conditioner, or to throw the guest's belongings off the balcony." At midnight, when they come and switch off the air conditioner, can they say: "You signed this, you had consented"? They cannot. For the articles that are contrary to the essence and nature of a contract and to the ordinary course of life are void in law and in morality, even if they are hidden in it. People are bound to click on those software agreements in order to use the device. This is not consent, it is a necessity left without an alternative. There is no consent to what is unknown and to what is imposed. The rule: conditions that are contrary to the purpose of the contract and rest on deceit are void, and a compulsory signature does not take the place of real consent.</w:t>
-      </w:r>
-    </w:p>
-    <w:p>
-      <w:pPr>
-        <w:spacing w:line="360" w:lineRule="auto" w:after="160"/>
-      </w:pPr>
-      <w:r>
-        <w:t>The second claim: "We had no choice. To protect safety and to save the battery, we slowed down the device." The refutation, with an example: you take your car to the service for a routine check. The master, without telling you, welds an iron wedge under the gas pedal, and the car can no longer go over sixty kilometers an hour. When you take back the car and notice, you ask: "Why did you do this?" The master says: "Your brake pads are worn, if you drove fast you could have had an accident, I limited the engine for your safety." Is this good faith? No! What an honest master would do is clear. He says: "Brother, your brake pads are worn. Either change them, or drive at this speed," and leaves the choice and the decision to the owner of the goods. To slow down the device secretly from the customer and then to say "it was for your good" is not a lawful measure. It is a fraud that makes the customer believe that the device has broken down and forces him to buy a new model. If a state of necessity exists, that necessity is said openly. No work is done behind the back. The rule: necessity does not make lawful an interference in property without the knowledge and the will of its owner.</w:t>
-      </w:r>
-    </w:p>
-    <w:p>
-      <w:pPr>
-        <w:spacing w:line="360" w:lineRule="auto" w:after="160"/>
-      </w:pPr>
-      <w:r>
-        <w:t>The third claim: "We sold the device, but we did not sell the software inside it, we licensed it." The refutation, with an example: you buy the latest model car from a gallery. Two years later the producer shuts down the brain of the car by a remote signal and says: "We sold you the body and the engine block of the car, but the software that runs the engine was in our license. The license is over, the car no longer runs." Can such nonsense be accepted? Without that software, the car is nothing but a heap of iron. For whatever purpose a good was sold, the part that is necessary for that good to work is inside that sale. The software is bound to the hardware as the flesh is bound to the nail. To take the full sale price and then say "the software was rented" is the cunning of turning a sale into a lease by a play of words. The rule: in contracts, one looks not at the words but at the purpose and the meaning, and the element that follows the principal thing is in the ruling of the principal thing.</w:t>
-      </w:r>
-    </w:p>
-    <w:p>
-      <w:pPr>
-        <w:spacing w:line="360" w:lineRule="auto" w:after="160"/>
-      </w:pPr>
-      <w:r>
-        <w:t>The fourth claim: "We finance innovation. Without this, we cannot do research and development, and technology stops." The refutation, with an example: let us think of a pharmaceutical factory. It wants to develop a new cancer drug that will save the world, and this requires a very large research and development budget. To find this budget, the factory secretly cuts the active substance of the blood pressure drugs that it already sells by half. The patients are forced to buy twice the medicine, the factory earns twice the money, and with that money it researches the cancer drug. Even if the goal is to defeat cancer, can research and development be financed by secretly stealing from the pocket and the health of a patient? It cannot. However bright the next goal is, you cannot provide its financing by sentencing the customer secretly to defective goods. If your new model is really superior to the old one, you offer it to the customer openly, and the customer, by his own consent, comes and buys it. To deliberately kill the old goods is not a requirement of innovation. It is a pretext for running away from competition and from honesty. The rule: a lawful aim never makes an unlawful means lawful, and the general benefit cannot be obtained by trampling the right of a person.</w:t>
+        <w:t>The fourth evidence, and the strongest: "We finance innovation. Without this we cannot do research and development, and technology stops." The refutation begins with the same logic taken into a shop. A chocolate maker shrinks every bar by a tenth, keeps the wrapper and the price, and says the money builds a new factory. The factory may be real, and every buyer was still cheated. A good use of money does not make a hidden way of taking it honest. The same applies to research, and four questions show it. If buyers would accept "this lasts two years, and the difference funds the next model," the maker loses nothing by saying so, and his silence shows that he expects a refusal. If he needs money, he can raise the price openly, offer a trade-in, or sell a cheaper line with the life printed on it. If the new product is better, buyers have a reason to buy it and the old one does not have to die first. If the new product is not better, the buyer pays twice for the same thing, and that is not research. And if research benefits everyone, then everyone should fund it in the open, and one class of buyers should not fund it in the dark. To deliberately kill the old goods is not a requirement of innovation, it is a pretext for running away from competition and from honesty. The rule: a lawful aim never makes an unlawful means lawful, and the general benefit cannot be obtained by trampling the right of a person.</w:t>
       </w:r>
     </w:p>
     <w:p>
@@ -415,7 +303,7 @@
         <w:spacing w:line="360" w:lineRule="auto" w:after="160"/>
       </w:pPr>
       <w:r>
-        <w:t>The matter, in all its aspects, is established, and the ruling is firmly set. One: to hide the life of goods is to give short weight on the scale. Two: to lock the repair and the part is to seize the property of another. Three: to do these under the cover of "technology," "security" or "contract" does not lighten the crime, it makes the fraud layered.</w:t>
+        <w:t>The matter, in all its aspects, is established, and the ruling is firmly set. One: to hide the life of goods is to give short weight on the scale. Two: to lock the repair and the part is to seize the property of another. Three: to send working goods to the waste pile is to violate the right of the public. Four: to do these under the cover of technology, security, license or innovation does not lighten the act, it makes the fraud layered.</w:t>
       </w:r>
     </w:p>
     <w:p>

</xml_diff>

<commit_message>
Konuşma metni: itirazlar işlendi, örnekler markasız ve umumi
Co-Authored-By: Claude Sonnet 5.5 <noreply@anthropic.com>
Claude-Session: https://claude.ai/code/session_01Q71gHQtKJ86ZE2CtYTYSwP
</commit_message>
<xml_diff>
--- a/sunum/plan2/Konusma_Metni_Planned_Obsolescence.docx
+++ b/sunum/plan2/Konusma_Metni_Planned_Obsolescence.docx
@@ -15,7 +15,7 @@
         <w:spacing w:line="360" w:lineRule="auto" w:after="160"/>
       </w:pPr>
       <w:r>
-        <w:t>The talk has two sides. On the first side stand our evidences, eight of them. On the second side stand the evidences of the other side, the producers, four of them, and I will refute each one. Every evidence has the same shape. First comes the claim. Then comes the proof that the effect follows from the cause. Then comes one example. Then comes the rule that governs it. I use real cases and arithmetic for the examples, and I claim only what the case itself proves.</w:t>
+        <w:t>The talk has two sides. On the first side stand our evidences, eight of them. On the second side stand the evidences of the other side, the producers, four of them, and I will refute each one. Every evidence has the same shape. First comes the claim. Then comes the proof that the effect follows from the cause. Then comes one example, and the example is a case that can happen to any buyer of any durable good, with no brand and no person in it, so that it covers the whole class of such cases. Last comes the rule.</w:t>
       </w:r>
     </w:p>
     <w:p>
@@ -23,7 +23,7 @@
         <w:spacing w:line="360" w:lineRule="auto" w:after="160"/>
       </w:pPr>
       <w:r>
-        <w:t>Trade is two people exchanging value by mutual consent. When one side knows what it receives while the other side hides what it gives, trade ends there, and theft and usurpation begin. Planned obsolescence is not a complicated technology debate. It is the case in which a seller secretly steals the life of the goods he sells, and does not take his hand off the property he has sold. By planned obsolescence I mean a choice by the maker that shortens the useful life of a product he has sold, or takes away the owner's power to extend that life. Ordinary wear is outside this definition, because nobody chose it. A short life that is printed on the box is outside it too, because the buyer chose it with his eyes open.</w:t>
+        <w:t>Trade is two people exchanging value by mutual consent. When one side knows what it receives while the other side hides what it gives, trade ends there, and theft and usurpation begin. Planned obsolescence is not a complicated technology debate. It is the practice in which a seller secretly steals the life of the goods he sells, and refuses to take his hand off the property he has sold. By planned obsolescence I mean a choice by the maker that shortens the useful life of a product he has sold, or takes away the owner's power to extend that life. Three things are outside this definition. First, ordinary wear, because nobody chose it. Second, a short life that is printed on the box or is the settled and known custom of that kind of goods. The Mecelle says that what is known by custom is as if it were stipulated, so the buyer who pays for a cheap article that everyone knows will not last has entered the contract with open eyes. Third, the real limit of hardware. When a new program needs more memory than an old device has, the maker may decline to give the new feature, and he may announce the end of updates. What he may not do is disable what already works, close the server a working device depends on, or lock the owner and others out of keeping the device alive. The maker may stop adding. He may not kill.</w:t>
       </w:r>
     </w:p>
     <w:p>
@@ -39,7 +39,7 @@
         <w:spacing w:line="360" w:lineRule="auto" w:after="160"/>
       </w:pPr>
       <w:r>
-        <w:t>The claim: a sale is valid only when what the buyer pays is matched by what he receives, and the part that is not matched is taken without right. The proof has four steps. A price is set by what the buyer expects to receive, and for a device that includes its ordinary life. The maker knows the life he chose, and the buyer cannot see it. The buyer pays for the expected life and receives a shorter one. So the part of the price that equals the missing life has no counter-value. This is arithmetic. If a device serves half the expected time, half of the price bought nothing.</w:t>
+        <w:t>The claim: a sale is sound only when what the buyer pays is matched by what he receives, and the part of the price that has no counter-value is taken without right. The proof has four steps. The price is set by what the buyer expects, and for a durable good that includes its ordinary life. The maker knows the limit he chose, and the buyer cannot see it. The buyer pays for the expected life and receives a shorter one. So the part of the price that equals the missing life has no counter-value. This is arithmetic: if a device is made to end at half the expected time, half of the price bought nothing. The Qur'an says in Surah An-Nisa, verse 29: "Do not consume your wealth among yourselves by false ways." Taking a price with no counter-value is eating property by a false way, ekl-i emvâl bi'l-bâtıl. The jurists also accept small gaps between price and value and treat a gross gap, gabn-i fâhiş, differently, drawing the line anywhere from a twentieth of the value to a third, according to the school.</w:t>
       </w:r>
     </w:p>
     <w:p>
@@ -47,7 +47,7 @@
         <w:spacing w:line="360" w:lineRule="auto" w:after="160"/>
       </w:pPr>
       <w:r>
-        <w:t>The same fact falls under three names in the law. First, the Qur'an says in Surah An-Nisa, verse 29: "O you who believe! Do not consume your wealth among yourselves by false ways." Taking a price with no counter-value is eating property by a false way, ekl-i emvâl bi'l-bâtıl. Second, the jurists define riba as an increase that has no counter-value in an exchange. I do not call this riba, but the unmatched part of the price has the same shape, and it falls under the same concern. Third, the jurists accept small gaps between price and value, and they draw the line between a small gap and a gross one, gabn-i fâhiş, anywhere from a twentieth of the value to a third, according to the school. A gross gap that comes with deceit spoils the contract.</w:t>
+        <w:t>The example: a maker sells a home controller together with a service promised for the life of the device. After two years the maker shuts the service down, and the controller becomes a dead box. The buyer paid in full, so the part of the price meant for the later years has no counter-value, and the gap is the whole value of those years. This is beyond every line any school has drawn. There is a second effect. The owner still needs a controller, so he must buy another. In law he is free to refuse, but in fact the choice is not free, because the thing he could have kept was taken from him. This is the ground of compulsion in fact, ikrâh-ı mülcî.</w:t>
       </w:r>
     </w:p>
     <w:p>
@@ -55,7 +55,7 @@
         <w:spacing w:line="360" w:lineRule="auto" w:after="160"/>
       </w:pPr>
       <w:r>
-        <w:t>The example is Revolv, a smart-home hub sold with a lifetime subscription. In October 2014 Nest bought the company and stopped selling the hub. In April 2016 Nest announced that the hub would stop working on the fifteenth of May. Nest explained that lifetime meant the life of the device, and the maker ended the life of the device by its own decision. The customer had paid in full. After the fifteenth of May the hub was worth nothing. The part of the price that was meant to buy the time after that date had no counter-value, and the gap was the whole value, which is beyond any line any school has drawn. The rule: a sale made with deceit and gross price deception is void, and the part in which the buyer's consent is missing is unjust gain for the seller and it is forbidden.</w:t>
+        <w:t>The rule: a sale made with deceit and with a gross gap between price and value is not void, because the buyer does take the goods and keep them. It is a valid sale that is not binding on the deceived buyer. The deceived buyer has the option to rescind the sale and recover his price, or to claim compensation for what is missing. The Hanafi position that Mecelle Article 356 follows is that this option exists where the gross gap comes with deceit, and the other schools give it even without deceit.</w:t>
       </w:r>
     </w:p>
     <w:p>
@@ -63,7 +63,7 @@
         <w:spacing w:line="360" w:lineRule="auto" w:after="160"/>
       </w:pPr>
       <w:r>
-        <w:t>OUR SECOND EVIDENCE: A HIDDEN ATTRIBUTE AND DECEIT.</w:t>
+        <w:t>OUR SECOND EVIDENCE: A CONCEALED ATTRIBUTE AND DECEIT.</w:t>
       </w:r>
     </w:p>
     <w:p>
@@ -71,7 +71,7 @@
         <w:spacing w:line="360" w:lineRule="auto" w:after="160"/>
       </w:pPr>
       <w:r>
-        <w:t>The claim: when the seller knows an attribute that sets the price and hides it, the sale rests on gharar and on taghrir, and it is corrupt. The proof: the expected life of a product sets its price. The seller alone knows the life he designed. The buyer has no way to see it from the product. A seller who stays silent where speaking was needed makes a statement by his silence, and the statement is: "this is what you expect." So the buyer gives his consent on a false picture, and the false picture was made by the seller's silence.</w:t>
+        <w:t>The claim: when the seller hides an attribute that sets the price, the sale is corrupted by gharar and by taghrir. The proof has four steps. The life of a device sets its price. The seller alone knows the limit he built in, and the buyer has no means of discovering it at the counter. A seller who stays silent where speaking was needed makes a statement by his silence, and the statement is that the goods conform to what is ordinary. So the buyer gives his consent on a false picture, and the seller made the false picture. The texts agree. The Prophet, peace be upon him, forbade the sale that contains gharar, which Muslim reports. He also said: whoever deceives us is not one of us. He found wet grain under dry grain in a heap, and he asked the seller why he had not put it on top, so that people could see it. The buyer could not have found the wet grain himself, and the seller was still blamed. A hidden limit on the life of a device is the wet grain at the bottom of the heap.</w:t>
       </w:r>
     </w:p>
     <w:p>
@@ -79,7 +79,7 @@
         <w:spacing w:line="360" w:lineRule="auto" w:after="160"/>
       </w:pPr>
       <w:r>
-        <w:t>The texts agree. The Prophet, peace be upon him, forbade the sale that contains gharar, uncertainty about what is sold, and this was reported by Muslim. The Prophet also said: whoever deceives us is not one of us. He found wet grain under dry grain in a heap, and he asked the seller why he had not put it on top, so that people could see it. The buyer could not have found the wet grain himself, and the seller was still blamed for hiding it. A hidden limit on life is the wet grain at the bottom of the heap. A weak part put in knowingly, or a hidden counter that ends the life of the device, is deceit of exactly this kind. The Hanafi jurists add that an uncertainty which leads to quarrel invalidates the sale.</w:t>
+        <w:t>The example: a maker pushes an update to devices whose batteries have aged, and the update quietly lowers their speed. The reason is real, because an aged battery can make a device shut down. But the maker tells nobody. Owners see slower devices, they conclude that the hardware is finished, and they buy new ones. Nobody can see the cause from the outside, and the maker alone knows it.</w:t>
       </w:r>
     </w:p>
     <w:p>
@@ -87,7 +87,7 @@
         <w:spacing w:line="360" w:lineRule="auto" w:after="160"/>
       </w:pPr>
       <w:r>
-        <w:t>The example is Apple. In late 2016 some iPhones shut down unexpectedly. In January 2017 Apple released an update that limited the peak performance of phones with aged batteries. Owners were not told. In December 2017 a benchmark developer measured the slowdown and published it, and Apple confirmed it and apologized. The engineering reason was real, because an aged battery can cause shutdowns. The wrong was the silence, and the French authority fined Apple for omitting the information. The rule: a sale in which the seller hides what sets the price is void for the part that was hidden, and the buyer has the right to undo it.</w:t>
+        <w:t>The rule: the sale is valid but the buyer has the option of defect and the option against deceit. He may rescind and recover the price, or claim compensation, and the one who hid the attribute is answerable for what the hiding caused.</w:t>
       </w:r>
     </w:p>
     <w:p>
@@ -95,7 +95,7 @@
         <w:spacing w:line="360" w:lineRule="auto" w:after="160"/>
       </w:pPr>
       <w:r>
-        <w:t>OUR THIRD EVIDENCE: WEAKNESS PLANTED ON PURPOSE, AND THE SECOND PROFIT FROM IT.</w:t>
+        <w:t>OUR THIRD EVIDENCE: A WEAKNESS PLANTED ON PURPOSE, AND THE GAIN THAT COMES FROM IT.</w:t>
       </w:r>
     </w:p>
     <w:p>
@@ -103,7 +103,7 @@
         <w:spacing w:line="360" w:lineRule="auto" w:after="160"/>
       </w:pPr>
       <w:r>
-        <w:t>The claim: nobody may cause harm and then profit from it. The proof has five steps. Natural wear comes from the fatigue of materials, and nobody chose it. Here the engineering effort goes in the opposite direction. It is spent to make the product fail, with a weak solder, a low-quality part, or a software lock that works at the time the maker has chosen. Remove the maker's choice, and the buyer keeps his product, and the maker does not get the second sale. So the maker's gain comes directly from the buyer's loss. The loss is real, because the buyer must pay again before he planned to. And a part, a code or a testing system whose only function is to end the product early has no lawful benefit at all. It is harm in itself, and the jurists forbid trade in what has no lawful use.</w:t>
+        <w:t>The claim: nobody may cause harm on purpose and then profit from it. The proof has five steps. Natural wear comes from the fatigue of materials, and nobody designs it. Here the engineering effort goes the other way: it is spent to make the product fail at a point the maker chose. Remove that choice, and the buyer keeps his product while the maker loses the second sale. So the maker's gain comes directly from the buyer's loss, and the loss is real, because the buyer pays again before he planned to. A part or a counter whose only function is to end the product early has no lawful benefit at all, and the jurists forbid trade in what has no lawful use. That is the ground of harm in itself, dırâr. The same fact has two further effects. The money the owner spends early cannot be spent anywhere else, which paralyses the capital of households and businesses. And the second purchase is hastened.</w:t>
       </w:r>
     </w:p>
     <w:p>
@@ -111,7 +111,15 @@
         <w:spacing w:line="360" w:lineRule="auto" w:after="160"/>
       </w:pPr>
       <w:r>
-        <w:t>The rule of the Mecelle is: there is no harm and no answering harm with harm, and harm is removed. No one can obtain a lawful gain from a harm that he caused through his own intentional and unjust act. The example is the Phoebus cartel. In 1925 the leading lamp makers formed it and fixed the life of a household bulb at one thousand hours. Before that, bulbs lasted about fifteen hundred hours or more. The cartel tested samples from its members and fined every member whose bulbs lasted longer. Nobody fines a bulb for lasting, and the only reason to fine it is to keep it from lasting. The arithmetic is plain. A household that needs three thousand hours of light needs three bulbs under a one-thousand-hour standard and two under a fifteen-hundred-hour standard. The extra bulb is the cartel's gain and the household's loss, and the buyer who wanted the longer-lasting bulb could not buy it from any member without that member paying a fine.</w:t>
+        <w:t>The rules are two. The Mecelle says there is no harm and no answering harm with harm, and harm is removed. Nobody can obtain a lawful gain from a harm that he caused by his own intentional and unjust act. The second rule, Mecelle Article 99, says: "Men iste'cele şey'en kable evânihî ûkıbe bi-hırmânih." Whoever hastens something before its time by an illegitimate means is deprived of it. The classical case is the heir who kills the one he inherits from in order to inherit early. I do not ask a court to confiscate anything. I use the rule by analogy, as the jurists use it: the reason is hastening a benefit before its time by an illegitimate means, and that reason is present when a maker shortens the life of a product to hasten the second sale. The gain from the hastened sale is not accepted as lawful, and it must be returned to the one it was taken from.</w:t>
+      </w:r>
+    </w:p>
+    <w:p>
+      <w:pPr>
+        <w:spacing w:line="360" w:lineRule="auto" w:after="160"/>
+      </w:pPr>
+      <w:r>
+        <w:t>The example: a printer is sold with a counter inside it. When the counter reaches a set number, it declares the cartridge empty and refuses to print, although a tenth of the ink is still in it. The counter has no other function. The owner buys a new cartridge before the time, and the ink that was left is wasted.</w:t>
       </w:r>
     </w:p>
     <w:p>
@@ -127,7 +135,7 @@
         <w:spacing w:line="360" w:lineRule="auto" w:after="160"/>
       </w:pPr>
       <w:r>
-        <w:t>The claim: when the sale is complete, the seller's power of disposal over the goods falls entirely, and any control he keeps is taken from the owner. The proof: a sale moves ownership to the buyer, and ownership means the owner uses, repairs, lends and resells. A device that depends on the maker's server is not fully in the owner's hand. The maker can end its function with one decision, and the owner has no way to resist. Four effects follow from that single fact. The owner is made a hostage instead of an owner. The owner must buy another device. In law the buyer is free to refuse, but in fact the choice is not free, because the thing he could have kept was taken from him. The money he spends cannot be spent on anything else, so capital is withdrawn from productive use and goes to replacing a sound device. And the second purchase comes before its time.</w:t>
+        <w:t>The claim: when the sale is complete, the seller's power of disposal over the goods ends entirely, and any control he keeps is taken from the owner. The proof: a sale moves ownership to the buyer, and ownership means that the owner uses, alters, repairs, lends and resells. When a maker keeps a remote switch over a thing he has sold, the owner has the thing but not the power over it. By acting on the device after the sale, the maker acts in the property of another. The Mecelle says that nobody may act in another's property without his permission, and nobody may take another's property without a lawful cause. It also says that whoever tries to undo what is complete on his own side, his effort is rejected. The usul rule is el-milkü bi-tamâmih, ownership is complete.</w:t>
       </w:r>
     </w:p>
     <w:p>
@@ -135,7 +143,7 @@
         <w:spacing w:line="360" w:lineRule="auto" w:after="160"/>
       </w:pPr>
       <w:r>
-        <w:t>The Mecelle has two rules for this. The first says that whoever tries to undo what is complete on his own side, his effort is rejected. The second says: "Men iste'cele şey'en kable evânihî ûkıbe bi-hırmânih." Whoever tries to obtain a thing before its time by an illegitimate means is punished by being deprived of it. The maker who ends a sound device brings forward the second sale, and the gain obtained like this is not accepted as lawful. In the words of the usul rule, el-milkü bi-tamâmih, ownership is complete.</w:t>
+        <w:t>The example: a device is sold with an advertised feature, and many buyers choose it because of that feature. After the sale a mandatory update removes the feature from every device in the country. The device still works, but it is no longer the device that was bought. The buyer cannot refuse the update and keep the feature, because the maker set the update to be a condition of using the device at all.</w:t>
       </w:r>
     </w:p>
     <w:p>
@@ -143,7 +151,7 @@
         <w:spacing w:line="360" w:lineRule="auto" w:after="160"/>
       </w:pPr>
       <w:r>
-        <w:t>The example is Revolv again. When it switched off its hubs, every owner had to replace a hub that was physically sound. The hardware, the case and the sensors worked. Only the maker's server had been pulled. Each owner spent money that could have gone somewhere else, and the hubs all stopped on the same date. This shows one more thing. Whoever holds the switch holds the power, and a state or an industry whose machines depend on a foreign maker's server has placed that power outside its borders.</w:t>
+        <w:t>The rule: the act is a trespass on property, and the owner may demand the restoration of what was taken or compensation for its value. The maker may offer a protective update, and he may do it openly and with the owner's choice, but he may not remove what he sold.</w:t>
       </w:r>
     </w:p>
     <w:p>
@@ -159,7 +167,7 @@
         <w:spacing w:line="360" w:lineRule="auto" w:after="160"/>
       </w:pPr>
       <w:r>
-        <w:t>The claim: when the maker reserves the means of repair to himself, he spoils the sale, creates an artificial scarcity, exploits the owner's need and destroys the independent trade. The proof has four steps. A sale moves the power of disposal to the buyer, and a condition that takes that power back, such as "you cannot open the device, you cannot take it to an independent repairer, you cannot fit third-party parts," contradicts the nature of the contract. The jurists call it a corrupting condition, şart-ı fâsid, and it is void, because the seller collects the full price of ownership and does not give the right that ownership brings. Second, when the parts and the diagnostic software are held only by the maker, the scarcity is made by the maker. This is ihtikâr. The classical case is food, and some jurists, Abu Yusuf among them, extend it to anything whose withholding harms people. Third, when the only party who can repair is the party that sold the product, the owner has no choice but to accept that party's price and schedule. A report from Ali, may God be pleased with him, says the Prophet forbade the sale made to a man in distress, and this is reported by Abu Dawud. Fourth, the independent repair shops in the same towns are shut out of the work, and the work goes to the dealers. The independent trade is liquidated, and the owner has one place to take his machine.</w:t>
+        <w:t>The claim: when the maker reserves the means of repair to himself, he spoils the sale, creates an artificial scarcity, exploits the owner's need and drives out the independent trade. The proof has four steps. A sale gives the buyer the power of disposal, and a condition that takes it back, such as "you may not open the device, you may not take it to an independent repairer, you may not fit third-party parts," contradicts the nature of the contract. The jurists call such a condition a corrupting condition, şart-ı fâsid, and it is void, because the seller collects the full price of ownership and does not give what ownership brings. Second, when the diagnostic software and the parts are given only to the maker's own dealers, the scarcity is made by the maker. I do not say that this is ihtikâr in its classical form. Classical ihtikâr is hoarding goods that people need, and here the maker does not hoard what he bought from the market, he refuses to sell the means. The juristic name of the act is a refusal to sell joined to a corrupting condition. But it produces the same harm as ihtikâr, which is an artificial scarcity of what people need, and some jurists, Abu Yusuf among them, extend the ban on ihtikâr to anything whose withholding harms people. Third, when the only party who can repair is the party that sold, the owner has no choice but to accept that party's price and schedule. A report from Ali, may God be pleased with him, says that the Prophet forbade the sale made to a man in distress, which Abu Dawud reports. Fourth, the independent repair shops are shut out of the work, and the work goes to the dealers.</w:t>
       </w:r>
     </w:p>
     <w:p>
@@ -167,7 +175,15 @@
         <w:spacing w:line="360" w:lineRule="auto" w:after="160"/>
       </w:pPr>
       <w:r>
-        <w:t>The example is John Deere. In January 2025 the Federal Trade Commission and five states sued Deere. They said that the software tools needed for the full range of electronic repairs were offered only to Deere's dealers, so farmers and independent shops could not complete those repairs. In July 2026 a stipulated order was filed under which Deere must, for ten years, give farmers and independent repairers resources equal to those it gives its dealers. The remedy shows what was taken. The rule: the one who sold cannot undo what he completed by closing the repair, and his effort to do it is rejected.</w:t>
+        <w:t>The example: a farm machine is sold, and its diagnostic software is sold only to the maker's dealers. In the middle of the harvest season a pump fails. An independent mechanic could fix it in an hour, but he cannot read the fault. The owner waits for the dealer and pays the dealer's price. The independent mechanic, in every town where such machines are used, loses the work.</w:t>
+      </w:r>
+    </w:p>
+    <w:p>
+      <w:pPr>
+        <w:spacing w:line="360" w:lineRule="auto" w:after="160"/>
+      </w:pPr>
+      <w:r>
+        <w:t>The rule: the one who sold cannot undo what he completed by closing the repair, and his effort to do so is rejected. The condition is void, and the owner may repair his own property wherever he wishes.</w:t>
       </w:r>
     </w:p>
     <w:p>
@@ -183,7 +199,7 @@
         <w:spacing w:line="360" w:lineRule="auto" w:after="160"/>
       </w:pPr>
       <w:r>
-        <w:t>The claim: the benefit of an extra sale belongs to the maker, and the cost belongs to people who were not parties to the sale. The proof is arithmetic. When the life of a device falls from six years to three, two devices are made, shipped and disposed of where one was enough. The need is the same, the metals mined are doubled, the energy burned is doubled and the waste is doubled. These costs do not appear on the buyer's receipt, so they fall on the public. The United Nations Global E-waste Monitor counted sixty-two million tonnes of electronic waste in 2022 and found that less than a quarter was documented as properly collected and recycled. The report names shorter product life cycles, limited repair options and design shortcomings among the causes. Planned obsolescence belongs to those causes, and each unit it adds to the pile falls on someone who never agreed to carry it. The same arithmetic touches the national wallet. A country that imports its devices pays foreign currency for every replacement, so replacing at three years instead of six doubles the foreign currency spent for each year of service.</w:t>
+        <w:t>The claim: the benefit of an extra sale belongs to the maker, and the cost belongs to people who were not parties to the sale. The proof is arithmetic. To deliver a given number of years of service, a device that lasts three years must be made, shipped and thrown away twice as often as a device that lasts six years. The number of units doubles. Each unit carries its own metals, its own energy and its own disposal. These costs do not appear on the buyer's receipt, so they fall on the public. The United Nations Global E-waste Monitor counted sixty-two million tonnes of electronic waste in 2022 and found that less than a quarter was documented as properly collected and recycled. It lists shorter product life cycles, limited repair options and design shortcomings among the causes. This arithmetic applies to devices that are replaced because they failed or were disabled. A buyer who replaces a working device by his own taste is outside the claim, because nobody took his device from him. The same arithmetic touches the national wallet. A country that imports its devices pays foreign currency for every replacement, so a device replaced at three years instead of six costs twice the foreign currency for the same years of service.</w:t>
       </w:r>
     </w:p>
     <w:p>
@@ -191,7 +207,15 @@
         <w:spacing w:line="360" w:lineRule="auto" w:after="160"/>
       </w:pPr>
       <w:r>
-        <w:t>The Mecelle rules are three. For the repelling of a general harm, a particular harm is chosen, Article 26. The heavier harm is removed by the lighter, Article 27. And burdens go with benefits. The public's burden of waste is a general harm, while the maker's interest in sales is a particular one, so the gate of this profit is closed to prevent the general harm. The example is the six-year device replaced at three, which is the whole proof above, and which any listener can verify with a pencil.</w:t>
+        <w:t>The rules of the Mecelle are these. For the repelling of a general harm, a particular harm is chosen, Article 26. The heavier harm is removed by the lighter, Article 27. And burdens go with benefits. The waste and the squandered resources are a general harm. The maker's interest in the extra sale is a particular one. To prevent the general harm, this gate of profit is closed.</w:t>
+      </w:r>
+    </w:p>
+    <w:p>
+      <w:pPr>
+        <w:spacing w:line="360" w:lineRule="auto" w:after="160"/>
+      </w:pPr>
+      <w:r>
+        <w:t>The example: a city buys a device for each household, and the device is designed to last three years where it could have lasted six. In twelve years the city buys four devices for each household instead of two, and it disposes of two more devices for each household, and a pencil is enough to check it.</w:t>
       </w:r>
     </w:p>
     <w:p>
@@ -207,7 +231,7 @@
         <w:spacing w:line="360" w:lineRule="auto" w:after="160"/>
       </w:pPr>
       <w:r>
-        <w:t>The claim: a practice that reliably produces enmity between buyer and seller is forbidden. The proof has two steps. When goods wear out by their nature or break by accident, the buyer does not hold a grudge. He says it was fated, and he accepts. But when the buyer learns that the failure was not natural wear and that the maker put the failure there, the matter stops being a commercial one, and the buyer takes the maker to be a betrayer. Disputes follow, and disputes can be counted. The Qur'an gives, in Surah Al-Ma'idah, verse 91, a reason for forbidding wine and gambling: Satan only wants to cause enmity and hatred between you. The real rule of the principles of jurisprudence is: "Küllü muâmeletin tüeddî ile'n-nizâ'i ve'l-adâveti fe-hiye fâsideh." Every contract and every condition that leads to quarrel and enmity between the parties is corrupt. The main purpose of forbidding deceit is to keep enmity out of society.</w:t>
+        <w:t>The claim: a practice that reliably produces enmity between buyer and seller is forbidden. The proof has two steps. When goods wear out by their nature or break by accident, the buyer holds no grudge. He says it was fated, and he accepts. But when he learns that the failure was put there, the matter stops being a commercial one. He takes the maker to be a betrayer, and the relation between them turns into dispute, complaint and lawsuit. The Qur'an says in Surah Al-Ma'idah, verse 91, as the reason for forbidding wine and gambling: Satan only wants to cause enmity and hatred between you. The rule of the principles of jurisprudence is: "Küllü muâmeletin tüeddî ile'n-nizâ'i ve'l-adâveti fe-hiye fâsideh." Every contract and every condition that leads to quarrel and enmity between the parties is corrupt. The Hanafi jurists apply the same reasoning when they say that an uncertainty which leads to quarrel invalidates the sale. The main purpose of forbidding deceit is to keep enmity out of society.</w:t>
       </w:r>
     </w:p>
     <w:p>
@@ -215,7 +239,7 @@
         <w:spacing w:line="360" w:lineRule="auto" w:after="160"/>
       </w:pPr>
       <w:r>
-        <w:t>The example is Apple once more. After the slowdown was exposed, Apple was fined twenty-five million euros in France. It settled a class action in the United States for up to five hundred million dollars, and it settled with thirty-four states and the District of Columbia for one hundred thirteen million dollars. Apple settled the American cases without admitting wrongdoing. The point is the number of disputes, not the verdict. These are the disputes that a hidden limit produces once buyers learn of it.</w:t>
+        <w:t>The example: a washing machine has a controller that counts the cycles and stops the machine at a set number, long before any part has worn. For years every owner takes the stop as fate. Then a repair worker opens one controller and finds the counter. The news goes from owner to owner. They compare, they complain, they sue, and none of them will buy from that maker again. The cause of the dispute is not the failure. It is the discovery that the failure was chosen.</w:t>
       </w:r>
     </w:p>
     <w:p>
@@ -223,7 +247,7 @@
         <w:spacing w:line="360" w:lineRule="auto" w:after="160"/>
       </w:pPr>
       <w:r>
-        <w:t>OUR EIGHTH EVIDENCE: THE COLLAPSE OF TRUST IN THE MARKET.</w:t>
+        <w:t>OUR EIGHTH EVIDENCE: THE LOSS OF TRUST IN THE MARKET.</w:t>
       </w:r>
     </w:p>
     <w:p>
@@ -231,7 +255,7 @@
         <w:spacing w:line="360" w:lineRule="auto" w:after="160"/>
       </w:pPr>
       <w:r>
-        <w:t>The claim: when cheating spreads, honest goods are driven out of the market. The proof has four steps. Buyers cannot judge the life of a product when they buy it. So they cannot pay more for a product that lasts longer. The honest maker who spends more to make a durable product cannot recover that cost in the price. The maker who cheats sells at a lower cost, and the honest maker either copies the cheating or leaves. This is the market of lemons, and its cause is the buyer's blindness about the life, which is exactly what planned obsolescence creates.</w:t>
+        <w:t>The claim: when cheating spreads, honest goods are driven out of the market. The proof has four steps. Buyers cannot judge the life of a product when they buy it. So they cannot pay a higher price for a product that lasts longer, because they cannot see that it does. The honest maker who spends more to make a durable product cannot recover that cost in the price. The maker who builds in a short life sells at a lower cost, and he takes the buyers. The honest maker copies him or leaves the market. Economists call this the market for lemons, and its cause is the blindness of the buyer about the life, which is exactly what planned obsolescence creates.</w:t>
       </w:r>
     </w:p>
     <w:p>
@@ -239,7 +263,7 @@
         <w:spacing w:line="360" w:lineRule="auto" w:after="160"/>
       </w:pPr>
       <w:r>
-        <w:t>The example is again the Phoebus cartel. It fined the members whose bulbs lasted too long. The maker who built the better bulb was punished for building it, and the buyers lost the one signal they had.</w:t>
+        <w:t>The example: two makers sell the same lamp. One builds it to last twice as long and prices it higher. The other builds it to last half as long and prices it lower. A buyer at the shelf sees two lamps that look the same. He buys the cheaper one, and after a few seasons the maker of the durable lamp stops making it, and the buyers lose the one signal they had.</w:t>
       </w:r>
     </w:p>
     <w:p>
@@ -247,7 +271,15 @@
         <w:spacing w:line="360" w:lineRule="auto" w:after="160"/>
       </w:pPr>
       <w:r>
-        <w:t>The sixteen grounds I listed along the way are all inside these eight evidences, and none is counted twice. The first evidence holds wealth without counter-value, the suspicion of riba and the gross price gap. The second holds gharar and taghrir. The third holds harm, deliberate weakness and the thing whose only function is harm. The fourth holds the taking of ownership hostage, forced replacement, the hasty second sale and the paralysis of capital. The fifth holds the corrupting condition, monopoly, the exploitation of distress and the liquidation of the independent trade. The sixth holds waste and the ecological burden. The seventh holds enmity and dispute. The eighth holds the loss of trust. Seen from what Islamic law protects, they strike at property, at the soundness of the contract and the freedom of will, at the peace of society, and at the physical world and its balance. Planned obsolescence touches at least six principal grounds at the same time: gharar, taghrir, the corrupting condition, eating property by false means, monopoly and enmity. It is therefore not a simple sale of a defective good and not a commercial manoeuvre acceptable in a free market.</w:t>
+        <w:t>THE SIXTEEN GROUNDS ACCOUNTED FOR.</w:t>
+      </w:r>
+    </w:p>
+    <w:p>
+      <w:pPr>
+        <w:spacing w:line="360" w:lineRule="auto" w:after="160"/>
+      </w:pPr>
+      <w:r>
+        <w:t>The grounds I named are sixteen: ten from the texts and the law of contract, six from reason and the facts. None is counted twice, and each sits in one evidence. The ten from the texts and the law of contract are these. Eating property by false means, gross difference between price and value, and compulsion in fact sit in the first evidence. Gharar and taghrir sit in the second. Harm in itself sits in the third. The corrupting condition, the harm of ihtikâr, and the exploitation of distress sit in the fifth. Enmity and dispute sit in the seventh. The six from reason and the facts are these. The deliberate weakness and the paralysis of capital sit in the third. The taking of ownership hostage sits in the fourth. The liquidation of the independent repair trade sits in the fifth. The ecological waste sits in the sixth. The loss of market trust sits in the eighth. Seen from what Islamic law protects, they strike at property, at the soundness of the contract and the freedom of will, at the peace of society, and at the physical world and its balance. Planned obsolescence touches at least six principal grounds at the same time: gharar, taghrir, the corrupting condition, eating property by false means, the harm of ihtikâr and enmity. It is therefore not a simple sale of a defective good and not a commercial manoeuvre acceptable in a free market.</w:t>
       </w:r>
     </w:p>
     <w:p>
@@ -263,7 +295,7 @@
         <w:spacing w:line="360" w:lineRule="auto" w:after="160"/>
       </w:pPr>
       <w:r>
-        <w:t>The first evidence of the producers: "The customer accepted the terms of use, he has consented." The refutation: consent needs knowledge. Every Apple owner who tapped Install had accepted the update, and not one of them had agreed to a slower phone, because nobody had told them that the update would slow it. The French authority fined Apple for omitting the information. A signature on something whose effect was hidden is not consent to that effect. People are bound to click on those agreements in order to use the device, which is a necessity left without an alternative and not a choice. The rule: conditions that are contrary to the purpose of the contract and rest on deceit are void, and a compulsory signature does not take the place of real consent.</w:t>
+        <w:t>The first evidence of the producers: "The customer accepted the terms of use. He has consented." The refutation: consent needs knowledge. Take an owner who sees an update marked "performance improvements" and taps Install. He accepted an update, and he did not accept a slower device, because nobody told him that the update would slow it. A signature on something whose effect was hidden is not consent to that effect. And when clicking through a page nobody reads is the only way to make one's own property work, the click is a necessity left without an alternative and not a choice. The rule: conditions that are contrary to the purpose of the contract and rest on deceit are void, and a compulsory signature does not take the place of real consent.</w:t>
       </w:r>
     </w:p>
     <w:p>
@@ -271,7 +303,7 @@
         <w:spacing w:line="360" w:lineRule="auto" w:after="160"/>
       </w:pPr>
       <w:r>
-        <w:t>The second evidence: "We had no choice. To protect safety and to save the battery, we slowed down the device." The refutation: necessity excuses the limit. It does not excuse the hiding, and it does not take the decision from the owner. Apple's own history shows the difference. The shutdown problem was real, and in 2018 Apple solved the same problem by telling the owner, showing the health of the battery and letting him switch the limit off. If necessity had required silence, that fix could not exist. If a state of necessity exists, that necessity is said openly, and the choice is left to the owner. The rule: necessity does not make lawful an interference in property without the knowledge and the will of its owner, and it is measured by its extent.</w:t>
+        <w:t>The second evidence: "We had no choice. For safety and to protect the battery, we limited the device." The refutation: necessity excuses the limit. It does not excuse the hiding, and it does not take the decision from the owner. The same maker could have said to the owner: "Your battery has aged. If I limit the speed, the device will not shut down. Do you want the limit?" and the owner could have chosen. If the maker had told him and given him the switch, no wrong would have been done. A protective update that is announced and can be switched off is honest. The same update done in the dark is the wrong. And a maker who has genuinely reached the limit of the hardware may say so, stop adding features, and announce the end of updates with a date. What he may not do is remove what works. The rule: necessity is measured by its extent, and necessity does not cancel another man's right.</w:t>
       </w:r>
     </w:p>
     <w:p>
@@ -279,7 +311,7 @@
         <w:spacing w:line="360" w:lineRule="auto" w:after="160"/>
       </w:pPr>
       <w:r>
-        <w:t>The third evidence: "We sold the device, but we did not sell the software inside it, we licensed it." The refutation: the Revolv hub is a box that does nothing without the maker's server, and the customer paid for a working hub with a lifetime subscription. For whatever purpose a good was sold, the part that is necessary for that good to work is inside that sale. The software is bound to the hardware as the flesh is bound to the nail. To take the full sale price and then say that the software was rented is the cunning of turning a sale into a lease by a play of words, after the money has changed hands. If the maker wants to keep ownership, he must call the contract a lease and price it as rent. The rule: in contracts one looks not at the words but at the purpose and the meaning, and the element that follows the principal thing is in the ruling of the principal thing.</w:t>
+        <w:t>The third evidence: "We sold the device, but we did not sell the software inside it. We licensed it." The refutation has two parts. First, I do not contest the licensing of independent programs that a buyer later installs on a computer. A program of that kind is separate from the machine and can be licensed. My objection is to the software embedded in the device, which the hardware cannot work without. Take a machine whose control program is written into its own board. Without that program the machine is a heap of metal and plastic. The software is bound to the hardware as the flesh is bound to the nail. The Mecelle says that what follows a thing in existence follows it in the ruling, Article 47, and that what follows cannot be given a separate ruling, Article 48. The device is the principal thing, so the embedded software that cannot be separated from it goes with the sale. Second, the owner of the code keeps his rights over the code. He keeps the right to copy it and to sell it to others, and the buyer does not ask for the source or for the secret. The buyer asks only to use and to keep the device he paid for. To take the full price of a sale, and then to say that the code that runs the device was rented, is the cunning of changing a sale into a lease by a play of words. In contracts, meaning counts, not wording. If the maker wants to keep ownership, he must call the contract a lease and price it as rent.</w:t>
       </w:r>
     </w:p>
     <w:p>
@@ -287,7 +319,7 @@
         <w:spacing w:line="360" w:lineRule="auto" w:after="160"/>
       </w:pPr>
       <w:r>
-        <w:t>The fourth evidence, and the strongest: "We finance innovation. Without this we cannot do research and development, and technology stops." The refutation begins with the same logic taken into a shop. A chocolate maker shrinks every bar by a tenth, keeps the wrapper and the price, and says the money builds a new factory. The factory may be real, and every buyer was still cheated. A good use of money does not make a hidden way of taking it honest. The same applies to research, and four questions show it. If buyers would accept "this lasts two years, and the difference funds the next model," the maker loses nothing by saying so, and his silence shows that he expects a refusal. If he needs money, he can raise the price openly, offer a trade-in, or sell a cheaper line with the life printed on it. If the new product is better, buyers have a reason to buy it and the old one does not have to die first. If the new product is not better, the buyer pays twice for the same thing, and that is not research. And if research benefits everyone, then everyone should fund it in the open, and one class of buyers should not fund it in the dark. To deliberately kill the old goods is not a requirement of innovation, it is a pretext for running away from competition and from honesty. The rule: a lawful aim never makes an unlawful means lawful, and the general benefit cannot be obtained by trampling the right of a person.</w:t>
+        <w:t>The fourth evidence, and the strongest: "We finance innovation. Without replacement sales we cannot pay for research, and technology stops." The refutation: take the same logic into a shop. A chocolate maker shrinks every bar by a tenth, keeps the wrapper and the price, and says the money builds a new factory. The factory may be real, and every buyer was still cheated. A good use of money does not make a hidden way of taking it honest. Research is the same, and four questions show it. If buyers would accept "this lasts two years, and the difference funds the next model," the maker loses nothing by saying so, and his silence shows that he expects a refusal. If he needs money, he can raise the price openly, offer a trade-in, or sell a cheaper line with the life printed on it. If the new product is better, buyers have a reason to buy it, and the old one does not have to die first. If it is not better, the buyer pays twice for the same thing, and that is not research. A last answer comes from the one who says that old devices hold back the ecosystem. If the old hardware cannot carry the new program, the maker does not give the new program to it, and nobody objects. He freezes the old version, and the device keeps doing what it did. Progress does not need the destruction of what someone else owns. And if research benefits everyone, then everyone should fund it in the open, and one class of buyers should not fund it in the dark. The rule: a good end does not make a forbidden means lawful, and the property of one man may not be taken without a lawful cause for the benefit of others.</w:t>
       </w:r>
     </w:p>
     <w:p>
@@ -303,7 +335,7 @@
         <w:spacing w:line="360" w:lineRule="auto" w:after="160"/>
       </w:pPr>
       <w:r>
-        <w:t>The matter, in all its aspects, is established, and the ruling is firmly set. One: to hide the life of goods is to give short weight on the scale. Two: to lock the repair and the part is to seize the property of another. Three: to send working goods to the waste pile is to violate the right of the public. Four: to do these under the cover of technology, security, license or innovation does not lighten the act, it makes the fraud layered.</w:t>
+        <w:t>The matter, in all its aspects, is established, and the ruling is firmly set. One: to hide the life of goods is to give short weight on the scale. Two: to lock the repair and the part is to seize the property of another. Three: to send working goods to the waste pile is to violate the right of the public. Four: to do these under the cover of technology, safety, license or innovation does not lighten the act, it makes the fraud layered.</w:t>
       </w:r>
     </w:p>
     <w:p>
@@ -311,7 +343,7 @@
         <w:spacing w:line="360" w:lineRule="auto" w:after="160"/>
       </w:pPr>
       <w:r>
-        <w:t>If you are a producer, the rule is simple: if you will make cheap goods, you write their life on them and you sell them openly. You take your hand off the goods that you sold. You respect the owner's right of repair and his will. Every act that does not keep to these limits is not trade, it is organized usurpation. Thank you.</w:t>
+        <w:t>If you are a producer, the rule is simple. If you will make cheap goods, you write their life on them and you sell them openly. If your hardware reaches its limit, you say so and you announce the end of updates. You take your hand off the goods that you sold. You respect the owner's right to repair, and his will. Every act that does not keep to these limits is not trade, it is organized usurpation. Thank you.</w:t>
       </w:r>
     </w:p>
     <w:sectPr>

</xml_diff>

<commit_message>
Konuşma metni: jüri itirazlarının doğru olanları işlendi
Co-Authored-By: Claude Sonnet 5.5 <noreply@anthropic.com>
Claude-Session: https://claude.ai/code/session_01Q71gHQtKJ86ZE2CtYTYSwP
</commit_message>
<xml_diff>
--- a/sunum/plan2/Konusma_Metni_Planned_Obsolescence.docx
+++ b/sunum/plan2/Konusma_Metni_Planned_Obsolescence.docx
@@ -15,7 +15,7 @@
         <w:spacing w:line="360" w:lineRule="auto" w:after="160"/>
       </w:pPr>
       <w:r>
-        <w:t>The talk has two sides. On the first side stand our evidences, eight of them. On the second side stand the evidences of the other side, the producers, four of them, and I will refute each one. Every evidence has the same shape. First comes the claim. Then comes the proof that the effect follows from the cause. Then comes one example, and the example is a case that can happen to any buyer of any durable good, with no brand and no person in it, so that it covers the whole class of such cases. Last comes the rule.</w:t>
+        <w:t>The talk has two sides. On the first side stand our evidences, eight of them. On the second side stand the evidences of the other side, the producers, four of them, and I will refute each one. Every evidence has the same shape. First comes the claim. Then comes the proof that the effect follows from the cause. Then comes one example. The examples are cases that can happen to any buyer of any durable good, and I name no brand and no person in them, so that each example covers the whole class of such cases. Last comes the rule.</w:t>
       </w:r>
     </w:p>
     <w:p>
@@ -23,7 +23,7 @@
         <w:spacing w:line="360" w:lineRule="auto" w:after="160"/>
       </w:pPr>
       <w:r>
-        <w:t>Trade is two people exchanging value by mutual consent. When one side knows what it receives while the other side hides what it gives, trade ends there, and theft and usurpation begin. Planned obsolescence is not a complicated technology debate. It is the practice in which a seller secretly steals the life of the goods he sells, and refuses to take his hand off the property he has sold. By planned obsolescence I mean a choice by the maker that shortens the useful life of a product he has sold, or takes away the owner's power to extend that life. Three things are outside this definition. First, ordinary wear, because nobody chose it. Second, a short life that is printed on the box or is the settled and known custom of that kind of goods. The Mecelle says that what is known by custom is as if it were stipulated, so the buyer who pays for a cheap article that everyone knows will not last has entered the contract with open eyes. Third, the real limit of hardware. When a new program needs more memory than an old device has, the maker may decline to give the new feature, and he may announce the end of updates. What he may not do is disable what already works, close the server a working device depends on, or lock the owner and others out of keeping the device alive. The maker may stop adding. He may not kill.</w:t>
+        <w:t>Trade is two people exchanging value by mutual consent. When one side knows what it receives while the other side hides what it gives, trade ends there, and theft begins. Planned obsolescence is not a complicated technology debate. It is the practice in which a seller takes the life of the goods he sells without telling the buyer, and does not take his hand off the property he has sold. By planned obsolescence I mean a choice by the maker that shortens the useful life of a product he makes or sells, or takes away the owner's power to extend that life. The choice may be made in the factory before any sale, or after the sale by a remote act on the device. Four things are outside this definition. First, ordinary wear, because nobody chose it. Second, a short life that is printed on the box or is the settled and known custom of that kind of goods. The Mecelle says that what is known by custom is as if it were stipulated, so the buyer who pays for a cheap article that everyone knows will not last has entered the contract with open eyes. Third, the real limit of hardware. When a new program needs more memory than an old device has, the maker may decline to give the new feature, and he may declare the end of updates. Fourth, the loss of a function because an independent third party changed its own service, unless the maker built the device to depend on that service and did not say so. The maker may stop adding. He may end a service that he declared would end, with notice, and leaving the device working or giving the owner what he needs to keep it alive. He may not kill.</w:t>
       </w:r>
     </w:p>
     <w:p>
@@ -39,7 +39,7 @@
         <w:spacing w:line="360" w:lineRule="auto" w:after="160"/>
       </w:pPr>
       <w:r>
-        <w:t>The claim: a sale is sound only when what the buyer pays is matched by what he receives, and the part of the price that has no counter-value is taken without right. The proof has four steps. The price is set by what the buyer expects, and for a durable good that includes its ordinary life. The maker knows the limit he chose, and the buyer cannot see it. The buyer pays for the expected life and receives a shorter one. So the part of the price that equals the missing life has no counter-value. This is arithmetic: if a device is made to end at half the expected time, half of the price bought nothing. The Qur'an says in Surah An-Nisa, verse 29: "Do not consume your wealth among yourselves by false ways." Taking a price with no counter-value is eating property by a false way, ekl-i emvâl bi'l-bâtıl. The jurists also accept small gaps between price and value and treat a gross gap, gabn-i fâhiş, differently, drawing the line anywhere from a twentieth of the value to a third, according to the school.</w:t>
+        <w:t>The claim: a sale is sound only when what the buyer pays is matched by what he receives, and the part of the price that has no counter-value is taken without right. The proof has four steps. The price is set by what the buyer expects, and for a durable good that includes its ordinary life. At the time of the sale the maker already knows the limit he chose, and the buyer cannot see it. The buyer pays for the expected life and receives a shorter one. So a part of the price has no counter-value, and that part is the use value of the missing time. Value is not spread evenly over the years of a device's life, so I do not say that half the life is exactly half the price. The exact share is set by those who know the trade, as the jurists set it by the experts of the trade. What is certain is that a part exists and that it belongs to the buyer.</w:t>
       </w:r>
     </w:p>
     <w:p>
@@ -47,7 +47,7 @@
         <w:spacing w:line="360" w:lineRule="auto" w:after="160"/>
       </w:pPr>
       <w:r>
-        <w:t>The example: a maker sells a home controller together with a service promised for the life of the device. After two years the maker shuts the service down, and the controller becomes a dead box. The buyer paid in full, so the part of the price meant for the later years has no counter-value, and the gap is the whole value of those years. This is beyond every line any school has drawn. There is a second effect. The owner still needs a controller, so he must buy another. In law he is free to refuse, but in fact the choice is not free, because the thing he could have kept was taken from him. This is the ground of compulsion in fact, ikrâh-ı mülcî.</w:t>
+        <w:t>The Qur'an says in Surah An-Nisa, verse 29: "Do not consume your wealth among yourselves by false ways." Taking a price with no counter-value is eating property by a false way, ekl-i emvâl bi'l-bâtıl. The jurists also treat a gross gap between price and value, gabn-i fâhiş. The gap is measured at the time of the contract. The jurists accept small gaps and draw the line between a small gap and a gross one anywhere from a twentieth of the value to a third, according to the school.</w:t>
       </w:r>
     </w:p>
     <w:p>
@@ -55,7 +55,15 @@
         <w:spacing w:line="360" w:lineRule="auto" w:after="160"/>
       </w:pPr>
       <w:r>
-        <w:t>The rule: a sale made with deceit and with a gross gap between price and value is not void, because the buyer does take the goods and keep them. It is a valid sale that is not binding on the deceived buyer. The deceived buyer has the option to rescind the sale and recover his price, or to claim compensation for what is missing. The Hanafi position that Mecelle Article 356 follows is that this option exists where the gross gap comes with deceit, and the other schools give it even without deceit.</w:t>
+        <w:t>The example: a device is sold with a service stated to last ten years, and the price is set for ten years. From the day of the sale the maker's own plan is that the service ends in the second year. In the second year he ends it, and the device becomes a dead box. The gap was there on the day of the contract, because what was delivered, two years of service, stood against a price set for ten. Most of the value is missing, which is beyond every line that any school has drawn.</w:t>
+      </w:r>
+    </w:p>
+    <w:p>
+      <w:pPr>
+        <w:spacing w:line="360" w:lineRule="auto" w:after="160"/>
+      </w:pPr>
+      <w:r>
+        <w:t>The rule: a sale made with deceit and with a gross gap between price and value is not void, because the buyer does take the goods and keep them. It is a valid sale that is not binding on the deceived buyer. In the Hanafi view that Mecelle Article 356 follows, the deceived buyer may rescind the sale and recover his price, or keep the goods at the full price. Compensation for the missing part is due only when the goods can no longer be returned. The Hanbali school gives the buyer a choice between returning the goods and keeping them with compensation. The schools differ about a gross gap taken alone. They agree that concealment of a defect gives the buyer the option.</w:t>
       </w:r>
     </w:p>
     <w:p>
@@ -71,7 +79,7 @@
         <w:spacing w:line="360" w:lineRule="auto" w:after="160"/>
       </w:pPr>
       <w:r>
-        <w:t>The claim: when the seller hides an attribute that sets the price, the sale is corrupted by gharar and by taghrir. The proof has four steps. The life of a device sets its price. The seller alone knows the limit he built in, and the buyer has no means of discovering it at the counter. A seller who stays silent where speaking was needed makes a statement by his silence, and the statement is that the goods conform to what is ordinary. So the buyer gives his consent on a false picture, and the seller made the false picture. The texts agree. The Prophet, peace be upon him, forbade the sale that contains gharar, which Muslim reports. He also said: whoever deceives us is not one of us. He found wet grain under dry grain in a heap, and he asked the seller why he had not put it on top, so that people could see it. The buyer could not have found the wet grain himself, and the seller was still blamed. A hidden limit on the life of a device is the wet grain at the bottom of the heap.</w:t>
+        <w:t>The claim: when the seller hides an attribute that sets the price, the sale is corrupted by gharar and by taghrir. The proof has four steps. The life of a device sets its price. The seller alone knows the limit he built in, and the buyer has no means of discovering it at the counter. A seller who stays silent where speaking was needed makes a statement by his silence, and the statement is that the goods conform to what is ordinary. So the buyer gives his consent on a false picture, and the seller made the false picture. The texts agree. The Prophet, peace be upon him, forbade the sale that contains gharar, which Muslim reports. He also said: whoever deceives us is not one of us. He found wet grain under dry grain in a heap, and he asked the seller why he had not put it on top, so that people could see it. The buyer could not have found the wet grain himself, and the seller was still blamed. A hidden limit on the life of a device is the wet grain at the bottom of the heap. The Hanafi jurists add that an uncertainty about the goods which leads to quarrel invalidates the sale, and a hidden life limit is such an uncertainty.</w:t>
       </w:r>
     </w:p>
     <w:p>
@@ -79,7 +87,7 @@
         <w:spacing w:line="360" w:lineRule="auto" w:after="160"/>
       </w:pPr>
       <w:r>
-        <w:t>The example: a maker pushes an update to devices whose batteries have aged, and the update quietly lowers their speed. The reason is real, because an aged battery can make a device shut down. But the maker tells nobody. Owners see slower devices, they conclude that the hardware is finished, and they buy new ones. Nobody can see the cause from the outside, and the maker alone knows it.</w:t>
+        <w:t>The example: a maker designs the power management of a device so that, when its battery has aged, the device lowers its own speed. The maker does not say so. The reason is real, because an aged battery can make a device shut down. Buyers buy the device, and after some years the speed drops. Owners see a slower device, they conclude that the hardware is finished, and they buy new ones. Nobody can see the cause from the outside, and the maker alone knows it.</w:t>
       </w:r>
     </w:p>
     <w:p>
@@ -87,7 +95,7 @@
         <w:spacing w:line="360" w:lineRule="auto" w:after="160"/>
       </w:pPr>
       <w:r>
-        <w:t>The rule: the sale is valid but the buyer has the option of defect and the option against deceit. He may rescind and recover the price, or claim compensation, and the one who hid the attribute is answerable for what the hiding caused.</w:t>
+        <w:t>The rule: because the limit was designed into the device that was sold, it is a defect hidden at the time of the sale. The buyer has the option of defect. He may return the device and recover the price, or keep it at the full price, and where return is impossible he has the compensation that the Hanafi view allows. If the limit was not planned at the sale and was imposed later, the matter is not a defect of the sale. It is a wrong done to the owner's property, and the fourth evidence governs it.</w:t>
       </w:r>
     </w:p>
     <w:p>
@@ -103,7 +111,7 @@
         <w:spacing w:line="360" w:lineRule="auto" w:after="160"/>
       </w:pPr>
       <w:r>
-        <w:t>The claim: nobody may cause harm on purpose and then profit from it. The proof has five steps. Natural wear comes from the fatigue of materials, and nobody designs it. Here the engineering effort goes the other way: it is spent to make the product fail at a point the maker chose. Remove that choice, and the buyer keeps his product while the maker loses the second sale. So the maker's gain comes directly from the buyer's loss, and the loss is real, because the buyer pays again before he planned to. A part or a counter whose only function is to end the product early has no lawful benefit at all, and the jurists forbid trade in what has no lawful use. That is the ground of harm in itself, dırâr. The same fact has two further effects. The money the owner spends early cannot be spent anywhere else, which paralyses the capital of households and businesses. And the second purchase is hastened.</w:t>
+        <w:t>The claim: nobody may cause harm on purpose and then profit from it. The proof has five steps. Natural wear comes from the fatigue of materials, and nobody designs it. Here the engineering effort goes the other way: it is spent to make the product fail at a point the maker chose. Remove that choice, and the buyer keeps his product while the maker loses the second sale. So the maker's gain comes directly from the buyer's loss. The loss is real, because the buyer pays again before he planned to. And the harm has a second face. The money that the owner spends early on replacing a working device cannot be spent anywhere else. This is not stagnation of capital. It is the misallocation of capital: the money that would have gone to education, health or productive investment goes to replacing what should not have failed. A counter or a part whose only function is to stop a sound product, and for which the maker can name no protective purpose, has no lawful benefit. If a protective purpose exists, the maker states it and tells the owner.</w:t>
       </w:r>
     </w:p>
     <w:p>
@@ -111,7 +119,7 @@
         <w:spacing w:line="360" w:lineRule="auto" w:after="160"/>
       </w:pPr>
       <w:r>
-        <w:t>The rules are two. The Mecelle says there is no harm and no answering harm with harm, and harm is removed. Nobody can obtain a lawful gain from a harm that he caused by his own intentional and unjust act. The second rule, Mecelle Article 99, says: "Men iste'cele şey'en kable evânihî ûkıbe bi-hırmânih." Whoever hastens something before its time by an illegitimate means is deprived of it. The classical case is the heir who kills the one he inherits from in order to inherit early. I do not ask a court to confiscate anything. I use the rule by analogy, as the jurists use it: the reason is hastening a benefit before its time by an illegitimate means, and that reason is present when a maker shortens the life of a product to hasten the second sale. The gain from the hastened sale is not accepted as lawful, and it must be returned to the one it was taken from.</w:t>
+        <w:t>The rules are two. The Mecelle says there is no harm and no answering harm with harm, and harm is removed. Nobody can obtain a lawful gain from a harm that he caused by his own intentional and unjust act. The second rule, Mecelle Article 99, says: "Men iste'cele şey'en kable evânihî ûkıbe bi-hırmânih." Whoever hastens something before its time by an illegitimate means is deprived of it. The classical case is the heir who kills the one he inherits from in order to inherit early. I use the rule by analogy, as the jurists use it. The reason is hastening a benefit before its time by an illegitimate means, and that reason is present when a maker shortens the life of a product to hasten the second sale. I do not ask the state to seize anything. The state takes nothing in this rule. The buyer who paid again has a private claim to recover from the maker what the hastening cost him. The maker who caused the failure by his own planning is liable. A maker who only causes a loss is liable when he intended it, as Article 93 says, and the word planned supplies the intent.</w:t>
       </w:r>
     </w:p>
     <w:p>
@@ -119,7 +127,7 @@
         <w:spacing w:line="360" w:lineRule="auto" w:after="160"/>
       </w:pPr>
       <w:r>
-        <w:t>The example: a printer is sold with a counter inside it. When the counter reaches a set number, it declares the cartridge empty and refuses to print, although a tenth of the ink is still in it. The counter has no other function. The owner buys a new cartridge before the time, and the ink that was left is wasted.</w:t>
+        <w:t>The example: a maker fits a plastic gear in a machine where a metal gear was available for a few coins more. The maker's own tests show that the plastic gear fails at about thirty months, and that the metal gear would last for many years. He chooses the plastic gear. At thirty months the machine stops, and the owner, who had planned to use it for ten years, must buy another.</w:t>
       </w:r>
     </w:p>
     <w:p>
@@ -127,7 +135,7 @@
         <w:spacing w:line="360" w:lineRule="auto" w:after="160"/>
       </w:pPr>
       <w:r>
-        <w:t>OUR FOURTH EVIDENCE: A SOLD THING IS CONTROLLED FROM AFAR.</w:t>
+        <w:t>OUR FOURTH EVIDENCE: THE OWNER'S PROPERTY IS ACTED ON FROM AFAR.</w:t>
       </w:r>
     </w:p>
     <w:p>
@@ -135,7 +143,7 @@
         <w:spacing w:line="360" w:lineRule="auto" w:after="160"/>
       </w:pPr>
       <w:r>
-        <w:t>The claim: when the sale is complete, the seller's power of disposal over the goods ends entirely, and any control he keeps is taken from the owner. The proof: a sale moves ownership to the buyer, and ownership means that the owner uses, alters, repairs, lends and resells. When a maker keeps a remote switch over a thing he has sold, the owner has the thing but not the power over it. By acting on the device after the sale, the maker acts in the property of another. The Mecelle says that nobody may act in another's property without his permission, and nobody may take another's property without a lawful cause. It also says that whoever tries to undo what is complete on his own side, his effort is rejected. The usul rule is el-milkü bi-tamâmih, ownership is complete.</w:t>
+        <w:t>The claim: when the sale is complete, the seller's power of disposal over the goods ends entirely, and any act he does on the goods afterwards is an act in another man's property. The proof: a sale moves ownership to the buyer, and ownership means that the owner uses, alters, repairs, lends and resells. When a maker keeps a remote way to act on a thing he has sold, the owner has the thing but not the power over it. The Mecelle says that nobody may act in another man's property without his permission, and nobody may take another man's property without a lawful cause, Articles 96 and 97. It also says that whoever tries to undo what is complete on his own side, his effort is rejected, Article 100. I do not call this usurpation in the strict sense that the Hanafi school gives that word, because the classical rule concerns the taking of the physical thing. I call it what the Mecelle calls it: an act of disposal in the property of another without permission, and the owner has a claim against it.</w:t>
       </w:r>
     </w:p>
     <w:p>
@@ -143,7 +151,7 @@
         <w:spacing w:line="360" w:lineRule="auto" w:after="160"/>
       </w:pPr>
       <w:r>
-        <w:t>The example: a device is sold with an advertised feature, and many buyers choose it because of that feature. After the sale a mandatory update removes the feature from every device in the country. The device still works, but it is no longer the device that was bought. The buyer cannot refuse the update and keep the feature, because the maker set the update to be a condition of using the device at all.</w:t>
+        <w:t>The example: a device is sold, and its battery wears out after some years, as batteries do. The owner buys a replacement battery from any maker, because he wants to keep the device alive. A later update sent from afar makes the device refuse every battery that the maker did not sell. The owner's power to extend the life of what he owns has been taken away after the sale, by an act on the device itself.</w:t>
       </w:r>
     </w:p>
     <w:p>
@@ -151,7 +159,7 @@
         <w:spacing w:line="360" w:lineRule="auto" w:after="160"/>
       </w:pPr>
       <w:r>
-        <w:t>The rule: the act is a trespass on property, and the owner may demand the restoration of what was taken or compensation for its value. The maker may offer a protective update, and he may do it openly and with the owner's choice, but he may not remove what he sold.</w:t>
+        <w:t>The rule: the maker who acts on the device with his own hand is the direct actor, mübâşir, and the direct actor is liable even without intent, as Article 92 says. The owner may demand that the act be undone and may claim compensation for what it cost him. A protective update is not forbidden. If keeping the device as it is would endanger life, the maker may and must limit it at once, and then tell the owner and offer the remedy. But he may not do it in the dark for his own profit.</w:t>
       </w:r>
     </w:p>
     <w:p>
@@ -167,7 +175,7 @@
         <w:spacing w:line="360" w:lineRule="auto" w:after="160"/>
       </w:pPr>
       <w:r>
-        <w:t>The claim: when the maker reserves the means of repair to himself, he spoils the sale, creates an artificial scarcity, exploits the owner's need and drives out the independent trade. The proof has four steps. A sale gives the buyer the power of disposal, and a condition that takes it back, such as "you may not open the device, you may not take it to an independent repairer, you may not fit third-party parts," contradicts the nature of the contract. The jurists call such a condition a corrupting condition, şart-ı fâsid, and it is void, because the seller collects the full price of ownership and does not give what ownership brings. Second, when the diagnostic software and the parts are given only to the maker's own dealers, the scarcity is made by the maker. I do not say that this is ihtikâr in its classical form. Classical ihtikâr is hoarding goods that people need, and here the maker does not hoard what he bought from the market, he refuses to sell the means. The juristic name of the act is a refusal to sell joined to a corrupting condition. But it produces the same harm as ihtikâr, which is an artificial scarcity of what people need, and some jurists, Abu Yusuf among them, extend the ban on ihtikâr to anything whose withholding harms people. Third, when the only party who can repair is the party that sold, the owner has no choice but to accept that party's price and schedule. A report from Ali, may God be pleased with him, says that the Prophet forbade the sale made to a man in distress, which Abu Dawud reports. Fourth, the independent repair shops are shut out of the work, and the work goes to the dealers.</w:t>
+        <w:t>The claim: when the maker reserves the means of repair to himself, he spoils the sale, creates an artificial scarcity, exploits the owner's need and drives out the independent trade. The proof has four steps. A sale gives the buyer the power of disposal, and a condition that takes it back, such as "you may not open the device, you may not take it to an independent repairer, you may not fit third-party parts," contradicts the nature of the contract. The jurists call such a condition a corrupting condition, şart-ı fâsid, and it is void, because the seller collects the full price of ownership and does not give what ownership brings. Second, when the diagnostic software, the fault codes and the parts are given only to the maker's own dealers, the scarcity is made by the maker. I do not say that this is ihtikâr in its classical form. Classical ihtikâr is hoarding goods that people need, and here the maker does not hoard what he bought from the market, he refuses to sell the means. The juristic name of the act is a refusal to sell joined to a corrupting condition. But it produces the same harm as ihtikâr, which is an artificial scarcity of what people need, and some jurists, Abu Yusuf among them, extend the ban on ihtikâr to anything whose withholding harms people. Third, when the only party who can repair is the party that sold, the owner has no choice but to accept that party's price and schedule. A report from Ali, may God be pleased with him, says that the Prophet forbade the sale made to a man in distress, which Abu Dawud reports. Fourth, the independent repair shops are shut out of the work, and the work goes to the dealers.</w:t>
       </w:r>
     </w:p>
     <w:p>
@@ -175,7 +183,15 @@
         <w:spacing w:line="360" w:lineRule="auto" w:after="160"/>
       </w:pPr>
       <w:r>
-        <w:t>The example: a farm machine is sold, and its diagnostic software is sold only to the maker's dealers. In the middle of the harvest season a pump fails. An independent mechanic could fix it in an hour, but he cannot read the fault. The owner waits for the dealer and pays the dealer's price. The independent mechanic, in every town where such machines are used, loses the work.</w:t>
+        <w:t>The owner and the independent mechanic do not ask for the maker's source code or his trade secret. The maker keeps his copyright and his secret. They ask for the fault codes and the repair tools, on reasonable terms, as a seller gives to those who can use what he sells.</w:t>
+      </w:r>
+    </w:p>
+    <w:p>
+      <w:pPr>
+        <w:spacing w:line="360" w:lineRule="auto" w:after="160"/>
+      </w:pPr>
+      <w:r>
+        <w:t>The example: a farm machine is sold, and its diagnostic tool is sold only to the maker's dealers. In the middle of the harvest season a pump fails. An independent mechanic could fix it in an hour, but he cannot read the fault. The owner waits for the dealer and pays the dealer's price. The independent mechanic, in every town where such machines are used, loses the work.</w:t>
       </w:r>
     </w:p>
     <w:p>
@@ -199,7 +215,7 @@
         <w:spacing w:line="360" w:lineRule="auto" w:after="160"/>
       </w:pPr>
       <w:r>
-        <w:t>The claim: the benefit of an extra sale belongs to the maker, and the cost belongs to people who were not parties to the sale. The proof is arithmetic. To deliver a given number of years of service, a device that lasts three years must be made, shipped and thrown away twice as often as a device that lasts six years. The number of units doubles. Each unit carries its own metals, its own energy and its own disposal. These costs do not appear on the buyer's receipt, so they fall on the public. The United Nations Global E-waste Monitor counted sixty-two million tonnes of electronic waste in 2022 and found that less than a quarter was documented as properly collected and recycled. It lists shorter product life cycles, limited repair options and design shortcomings among the causes. This arithmetic applies to devices that are replaced because they failed or were disabled. A buyer who replaces a working device by his own taste is outside the claim, because nobody took his device from him. The same arithmetic touches the national wallet. A country that imports its devices pays foreign currency for every replacement, so a device replaced at three years instead of six costs twice the foreign currency for the same years of service.</w:t>
+        <w:t>The claim: the benefit of an extra sale belongs to the maker, and the cost belongs to people who were not parties to the sale. The proof is arithmetic. To deliver a given number of years of service, a device that lasts three years must be made, shipped and thrown away twice as often as a device that lasts six years. The number of units doubles. Each unit carries its own metals, its own energy and its own disposal. These costs do not appear on the buyer's receipt, so they fall on the public. The United Nations Global E-waste Monitor counted sixty-two million tonnes of electronic waste in 2022 and found that less than a quarter was documented as properly collected and recycled. It lists shorter product life cycles, limited repair options and design shortcomings among the causes. The arithmetic applies to a device that is replaced because it failed or was disabled. A buyer who replaces a working device by his own taste is outside the claim, because nobody took his device from him. The same arithmetic touches the national wallet. A country that imports its devices pays foreign currency for every replacement, so a device replaced at three years instead of six costs twice the foreign currency for the same years of service.</w:t>
       </w:r>
     </w:p>
     <w:p>
@@ -207,7 +223,7 @@
         <w:spacing w:line="360" w:lineRule="auto" w:after="160"/>
       </w:pPr>
       <w:r>
-        <w:t>The rules of the Mecelle are these. For the repelling of a general harm, a particular harm is chosen, Article 26. The heavier harm is removed by the lighter, Article 27. And burdens go with benefits. The waste and the squandered resources are a general harm. The maker's interest in the extra sale is a particular one. To prevent the general harm, this gate of profit is closed.</w:t>
+        <w:t>A question of responsibility arises. The owner is the one who carries the device to the waste. The maker is the one who made it end. When the maker disables the device by a remote act, he is the direct actor on the device. When the device fails by its design, he is the cause, and the Mecelle says that a cause is liable if he intended the result, and planning is the intent. So the maker is responsible in both cases, and the buyer who carries the device away is only the last hand.</w:t>
       </w:r>
     </w:p>
     <w:p>
@@ -215,7 +231,7 @@
         <w:spacing w:line="360" w:lineRule="auto" w:after="160"/>
       </w:pPr>
       <w:r>
-        <w:t>The example: a city buys a device for each household, and the device is designed to last three years where it could have lasted six. In twelve years the city buys four devices for each household instead of two, and it disposes of two more devices for each household, and a pencil is enough to check it.</w:t>
+        <w:t>The rules of the Mecelle are three. For the repelling of a general harm, a particular harm is chosen, Article 26. The heavier harm is removed by the lighter, Article 27. And burdens go with benefits. The waste and the squandered resources are a general harm. The maker's interest in the extra sale is a particular one. To prevent the general harm, this gate of profit is closed.</w:t>
       </w:r>
     </w:p>
     <w:p>
@@ -223,7 +239,7 @@
         <w:spacing w:line="360" w:lineRule="auto" w:after="160"/>
       </w:pPr>
       <w:r>
-        <w:t>OUR SEVENTH EVIDENCE: ENMITY BETWEEN THE PARTIES.</w:t>
+        <w:t>The example: a hundred thousand households of a city each buy the same device. The device is made to last three years where it could have lasted six. In twelve years each household has bought four devices instead of two, and the city has thrown away two hundred thousand devices more than the other case, and a pencil is enough to check it.</w:t>
       </w:r>
     </w:p>
     <w:p>
@@ -231,7 +247,7 @@
         <w:spacing w:line="360" w:lineRule="auto" w:after="160"/>
       </w:pPr>
       <w:r>
-        <w:t>The claim: a practice that reliably produces enmity between buyer and seller is forbidden. The proof has two steps. When goods wear out by their nature or break by accident, the buyer holds no grudge. He says it was fated, and he accepts. But when he learns that the failure was put there, the matter stops being a commercial one. He takes the maker to be a betrayer, and the relation between them turns into dispute, complaint and lawsuit. The Qur'an says in Surah Al-Ma'idah, verse 91, as the reason for forbidding wine and gambling: Satan only wants to cause enmity and hatred between you. The rule of the principles of jurisprudence is: "Küllü muâmeletin tüeddî ile'n-nizâ'i ve'l-adâveti fe-hiye fâsideh." Every contract and every condition that leads to quarrel and enmity between the parties is corrupt. The Hanafi jurists apply the same reasoning when they say that an uncertainty which leads to quarrel invalidates the sale. The main purpose of forbidding deceit is to keep enmity out of society.</w:t>
+        <w:t>OUR SEVENTH EVIDENCE: THE WISDOM OF THE BAN IS ENMITY, AND THE PRACTICE BREEDS IT.</w:t>
       </w:r>
     </w:p>
     <w:p>
@@ -239,7 +255,31 @@
         <w:spacing w:line="360" w:lineRule="auto" w:after="160"/>
       </w:pPr>
       <w:r>
-        <w:t>The example: a washing machine has a controller that counts the cycles and stops the machine at a set number, long before any part has worn. For years every owner takes the stop as fate. Then a repair worker opens one controller and finds the counter. The news goes from owner to owner. They compare, they complain, they sue, and none of them will buy from that maker again. The cause of the dispute is not the failure. It is the discovery that the failure was chosen.</w:t>
+        <w:t>The claim: the practice produces the very enmity that the prohibition of deceit exists to prevent. I say this in its proper place. Enmity is not a ground of the ruling. A ground has to be visible and measurable, and a feeling is not. The ground is deceit, and I have proved it in the second evidence. Enmity is the wisdom, hikmet, behind the ban, and the wisdom shows what is at stake. The Qur'an says in Surah Al-Ma'idah, verse 91, as the reason for forbidding wine and gambling: Satan only wants to cause enmity and hatred between you. The same purpose stands behind the ban on deceit, which is to keep enmity out of society.</w:t>
+      </w:r>
+    </w:p>
+    <w:p>
+      <w:pPr>
+        <w:spacing w:line="360" w:lineRule="auto" w:after="160"/>
+      </w:pPr>
+      <w:r>
+        <w:t>The proof has two steps. When goods wear out by their nature or break by accident, the buyer holds no grudge. He says it was fated, and he accepts. But when he learns that the failure was put there, he stops seeing the maker as a seller and begins to see him as a betrayer. This is the effect that can be seen and counted: complaints, claims and lawsuits.</w:t>
+      </w:r>
+    </w:p>
+    <w:p>
+      <w:pPr>
+        <w:spacing w:line="360" w:lineRule="auto" w:after="160"/>
+      </w:pPr>
+      <w:r>
+        <w:t>The example: a washing machine has a controller that counts the cycles and stops the machine at a set number, long before any part has worn, and the maker can name no safety purpose for it. For years every owner takes the stop as fate. Then a repair worker opens one controller and finds the counter. The news goes from owner to owner. They compare, they complain, they claim, and none of them will buy from that maker again. The cause of the dispute is not the failure. It is the discovery that the failure was chosen.</w:t>
+      </w:r>
+    </w:p>
+    <w:p>
+      <w:pPr>
+        <w:spacing w:line="360" w:lineRule="auto" w:after="160"/>
+      </w:pPr>
+      <w:r>
+        <w:t>The rule: the ruling rests on the ground, which is deceit, and it is not weakened because the wisdom is a feeling. The wisdom confirms what the ground already proves. It is not an extra ground, and I do not count it among them.</w:t>
       </w:r>
     </w:p>
     <w:p>
@@ -255,7 +295,7 @@
         <w:spacing w:line="360" w:lineRule="auto" w:after="160"/>
       </w:pPr>
       <w:r>
-        <w:t>The claim: when cheating spreads, honest goods are driven out of the market. The proof has four steps. Buyers cannot judge the life of a product when they buy it. So they cannot pay a higher price for a product that lasts longer, because they cannot see that it does. The honest maker who spends more to make a durable product cannot recover that cost in the price. The maker who builds in a short life sells at a lower cost, and he takes the buyers. The honest maker copies him or leaves the market. Economists call this the market for lemons, and its cause is the blindness of the buyer about the life, which is exactly what planned obsolescence creates.</w:t>
+        <w:t>The claim: when cheating spreads, honest goods are driven out of the market. The proof has five steps. Buyers cannot judge the life of a product when they buy it. The price in the market is set by what buyers can see. So a product that lasts longer cannot be sold at a higher price, because the buyer cannot see that it lasts longer. The maker who builds in a short life has a lower cost. He can sell at a lower price, or he can sell at the same price and earn more. The honest maker, with a higher cost, either lowers his price and loses money, or keeps his price and loses buyers. A warranty does not rescue him. A warranty is a promise about repair for a period, and it does not tell the buyer how long the product will live. A maker who plans the end of the product can set the end just after the warranty. Economists call this the market for lemons, and its cause is the buyer's blindness about the life, which is exactly what planned obsolescence creates.</w:t>
       </w:r>
     </w:p>
     <w:p>
@@ -263,7 +303,7 @@
         <w:spacing w:line="360" w:lineRule="auto" w:after="160"/>
       </w:pPr>
       <w:r>
-        <w:t>The example: two makers sell the same lamp. One builds it to last twice as long and prices it higher. The other builds it to last half as long and prices it lower. A buyer at the shelf sees two lamps that look the same. He buys the cheaper one, and after a few seasons the maker of the durable lamp stops making it, and the buyers lose the one signal they had.</w:t>
+        <w:t>The example: two makers sell the same lamp, and the two lamps look the same on the shelf. One has built it to last twice as long and the other has built it to last half as long. The shelf price is the same. The short-life maker earns more on each lamp, and the durable maker earns less. After a few seasons the durable maker either copies the other or leaves, and the buyers have lost the one signal they had.</w:t>
       </w:r>
     </w:p>
     <w:p>
@@ -271,7 +311,7 @@
         <w:spacing w:line="360" w:lineRule="auto" w:after="160"/>
       </w:pPr>
       <w:r>
-        <w:t>THE SIXTEEN GROUNDS ACCOUNTED FOR.</w:t>
+        <w:t>The rule: harm is removed, and a private gain is not chosen over a harm that falls on the public, Articles 20 and 26. The authority that guards the market has the duty, hisbah, to forbid practices that drive honest dealing out of the market.</w:t>
       </w:r>
     </w:p>
     <w:p>
@@ -279,7 +319,15 @@
         <w:spacing w:line="360" w:lineRule="auto" w:after="160"/>
       </w:pPr>
       <w:r>
-        <w:t>The grounds I named are sixteen: ten from the texts and the law of contract, six from reason and the facts. None is counted twice, and each sits in one evidence. The ten from the texts and the law of contract are these. Eating property by false means, gross difference between price and value, and compulsion in fact sit in the first evidence. Gharar and taghrir sit in the second. Harm in itself sits in the third. The corrupting condition, the harm of ihtikâr, and the exploitation of distress sit in the fifth. Enmity and dispute sit in the seventh. The six from reason and the facts are these. The deliberate weakness and the paralysis of capital sit in the third. The taking of ownership hostage sits in the fourth. The liquidation of the independent repair trade sits in the fifth. The ecological waste sits in the sixth. The loss of market trust sits in the eighth. Seen from what Islamic law protects, they strike at property, at the soundness of the contract and the freedom of will, at the peace of society, and at the physical world and its balance. Planned obsolescence touches at least six principal grounds at the same time: gharar, taghrir, the corrupting condition, eating property by false means, the harm of ihtikâr and enmity. It is therefore not a simple sale of a defective good and not a commercial manoeuvre acceptable in a free market.</w:t>
+        <w:t>THE GROUNDS ACCOUNTED FOR.</w:t>
+      </w:r>
+    </w:p>
+    <w:p>
+      <w:pPr>
+        <w:spacing w:line="360" w:lineRule="auto" w:after="160"/>
+      </w:pPr>
+      <w:r>
+        <w:t>The grounds I named are fourteen, and I have placed each one in one evidence only. Nine come from the texts and the law of contract. Eating property by false means and the gross gap between price and value sit in the first evidence. Gharar and taghrir sit in the second. Harm sits in the third. The unauthorised act of disposal in another's property sits in the fourth. The corrupting condition, the harm of ihtikâr and the exploitation of distress sit in the fifth. Five come from reason and the facts. The deliberate weakness and the misallocation of capital sit in the third. The loss of the independent repair trade sits in the fifth. The ecological waste sits in the sixth. The loss of market trust sits in the eighth. Enmity is the wisdom of the ban and is not counted. Seen from what Islamic law protects, these grounds strike at property, at the soundness of the contract and the freedom of will, at the peace of society, and at the physical world and its balance. Planned obsolescence touches at least six of them at once: gharar, taghrir, eating property by false means, the corrupting condition, the harm of ihtikâr and the unauthorised act in another's property. It is therefore not a simple sale of a defective good and not a commercial manoeuvre acceptable in a free market.</w:t>
       </w:r>
     </w:p>
     <w:p>
@@ -295,7 +343,7 @@
         <w:spacing w:line="360" w:lineRule="auto" w:after="160"/>
       </w:pPr>
       <w:r>
-        <w:t>The first evidence of the producers: "The customer accepted the terms of use. He has consented." The refutation: consent needs knowledge. Take an owner who sees an update marked "performance improvements" and taps Install. He accepted an update, and he did not accept a slower device, because nobody told him that the update would slow it. A signature on something whose effect was hidden is not consent to that effect. And when clicking through a page nobody reads is the only way to make one's own property work, the click is a necessity left without an alternative and not a choice. The rule: conditions that are contrary to the purpose of the contract and rest on deceit are void, and a compulsory signature does not take the place of real consent.</w:t>
+        <w:t>The first evidence of the producers: "The customer accepted the terms of use. He has consented." The refutation has two parts. First, if the terms were shown before the purchase, and the buyer could refuse them, return the device and take his money back, then the click is a choice, and the maker is right. I do not contest that. Second, my refutation concerns the other terms: the terms that appear only after the money is paid, the terms that do not say what the update will do, and the terms that are shown at a moment when return is no longer possible. Take an owner who has used his device for three years and sees an update marked "performance improvements" and taps Install. He accepted an update. He did not accept a slower device, because nobody told him that the update would slow it, and there is no refund at that moment. A signature on something whose effect was hidden is not consent to that effect. The rule: conditions that are contrary to the purpose of the contract and rest on deceit are void, and a forced agreement does not take the place of real consent.</w:t>
       </w:r>
     </w:p>
     <w:p>
@@ -303,7 +351,7 @@
         <w:spacing w:line="360" w:lineRule="auto" w:after="160"/>
       </w:pPr>
       <w:r>
-        <w:t>The second evidence: "We had no choice. For safety and to protect the battery, we limited the device." The refutation: necessity excuses the limit. It does not excuse the hiding, and it does not take the decision from the owner. The same maker could have said to the owner: "Your battery has aged. If I limit the speed, the device will not shut down. Do you want the limit?" and the owner could have chosen. If the maker had told him and given him the switch, no wrong would have been done. A protective update that is announced and can be switched off is honest. The same update done in the dark is the wrong. And a maker who has genuinely reached the limit of the hardware may say so, stop adding features, and announce the end of updates with a date. What he may not do is remove what works. The rule: necessity is measured by its extent, and necessity does not cancel another man's right.</w:t>
+        <w:t>The second evidence: "We had no choice. For safety and to protect the battery, we limited the device." The refutation: necessity permits the act. It does not permit silence, and it does not remove the duty to make the owner whole. The Mecelle says that necessity does not cancel another man's right, Article 33. The classical example is the starving man who eats another's bread. He may eat it, and he must pay for it afterwards. So when the maker really finds that an aged battery endangers life, he may and must limit the device at once. Then he must tell the owner, and offer a new battery at his own cost, and make good the loss. A protective update that is announced and offered with a remedy is honest. The same update done in the dark, with the owner left to think his device has died, is the wrong. And a maker who has genuinely reached the limit of the hardware may say so, stop adding features, and announce the end of updates with a date. What he may not do is remove what works without a real danger and without telling the owner. The rule: necessity is measured by its extent, and it does not cancel another man's right.</w:t>
       </w:r>
     </w:p>
     <w:p>
@@ -311,7 +359,7 @@
         <w:spacing w:line="360" w:lineRule="auto" w:after="160"/>
       </w:pPr>
       <w:r>
-        <w:t>The third evidence: "We sold the device, but we did not sell the software inside it. We licensed it." The refutation has two parts. First, I do not contest the licensing of independent programs that a buyer later installs on a computer. A program of that kind is separate from the machine and can be licensed. My objection is to the software embedded in the device, which the hardware cannot work without. Take a machine whose control program is written into its own board. Without that program the machine is a heap of metal and plastic. The software is bound to the hardware as the flesh is bound to the nail. The Mecelle says that what follows a thing in existence follows it in the ruling, Article 47, and that what follows cannot be given a separate ruling, Article 48. The device is the principal thing, so the embedded software that cannot be separated from it goes with the sale. Second, the owner of the code keeps his rights over the code. He keeps the right to copy it and to sell it to others, and the buyer does not ask for the source or for the secret. The buyer asks only to use and to keep the device he paid for. To take the full price of a sale, and then to say that the code that runs the device was rented, is the cunning of changing a sale into a lease by a play of words. In contracts, meaning counts, not wording. If the maker wants to keep ownership, he must call the contract a lease and price it as rent.</w:t>
+        <w:t>The third evidence: "We sold the device, but we did not sell the software inside it. We licensed it." The refutation has three parts, because there are three kinds of software. First, I do not contest the licensing of independent programs that a buyer later installs on a computer. They are separate from the machine and can be licensed. Second, the software embedded in the device, which the hardware cannot work without, is different. Take a machine whose control program is written into its own board. Without that program the machine is a heap of metal and plastic. The Mecelle says that what follows a thing in existence follows it in the ruling, Article 47, and that what follows cannot be given a separate ruling, Article 48. The device is the principal thing, so the embedded software that cannot be separated from it goes with the sale. The owner of the code keeps his copyright and his secret. The buyer asks only to use and keep the device he paid for. Third, there is the function that lives on the maker's server and not in the device. The maker says: "The device is in your home, but the service is mine." That is true, and it is answered by a different rule. If the service was part of what was sold, the maker owes it for the period he stated at the sale. After that period he may end it, with notice, and without leaving the device a dead box if he can help it. In contracts, meaning counts, not wording. If the maker wants to keep ownership, he must call the contract a lease and price it as rent.</w:t>
       </w:r>
     </w:p>
     <w:p>
@@ -319,7 +367,7 @@
         <w:spacing w:line="360" w:lineRule="auto" w:after="160"/>
       </w:pPr>
       <w:r>
-        <w:t>The fourth evidence, and the strongest: "We finance innovation. Without replacement sales we cannot pay for research, and technology stops." The refutation: take the same logic into a shop. A chocolate maker shrinks every bar by a tenth, keeps the wrapper and the price, and says the money builds a new factory. The factory may be real, and every buyer was still cheated. A good use of money does not make a hidden way of taking it honest. Research is the same, and four questions show it. If buyers would accept "this lasts two years, and the difference funds the next model," the maker loses nothing by saying so, and his silence shows that he expects a refusal. If he needs money, he can raise the price openly, offer a trade-in, or sell a cheaper line with the life printed on it. If the new product is better, buyers have a reason to buy it, and the old one does not have to die first. If it is not better, the buyer pays twice for the same thing, and that is not research. A last answer comes from the one who says that old devices hold back the ecosystem. If the old hardware cannot carry the new program, the maker does not give the new program to it, and nobody objects. He freezes the old version, and the device keeps doing what it did. Progress does not need the destruction of what someone else owns. And if research benefits everyone, then everyone should fund it in the open, and one class of buyers should not fund it in the dark. The rule: a good end does not make a forbidden means lawful, and the property of one man may not be taken without a lawful cause for the benefit of others.</w:t>
+        <w:t>The fourth evidence, and the strongest: "We finance innovation. Without replacement sales we cannot pay for research, and technology stops." The refutation: here is the practice in its plainest form. A lamp maker builds a lamp to last half as long as he could, tells no one, and says that the second sale pays for next year's better lamp. The buyer paid for a lamp with an ordinary life and received half. The money for the missing half was taken from him for a purpose that he never heard of, and that is the same wrong whatever the purpose is. Four questions show that the defense fails. If buyers would accept "this lasts two years, and the difference funds the next model," the maker loses nothing by saying so, and his silence shows that he expects a refusal. If he needs money, he can raise the price openly, offer a trade-in, or sell a cheaper line with the life printed on it. If the new product is better, buyers have a reason to buy it, and the old one does not have to die first. If it is not better, the buyer pays twice for the same thing, and that is not research. A last answer comes from the one who says that old devices hold back the ecosystem. If the old hardware cannot carry the new program, the maker does not give the new program to it, and nobody objects. He freezes the old version, and the device keeps doing what it did. Progress does not need the end of what someone else owns. And if research benefits everyone, then everyone should fund it in the open, and one class of buyers should not fund it in the dark. The rule: a good end does not make a forbidden means lawful, and the property of one man may not be taken without a lawful cause for the benefit of others.</w:t>
       </w:r>
     </w:p>
     <w:p>
@@ -335,7 +383,7 @@
         <w:spacing w:line="360" w:lineRule="auto" w:after="160"/>
       </w:pPr>
       <w:r>
-        <w:t>The matter, in all its aspects, is established, and the ruling is firmly set. One: to hide the life of goods is to give short weight on the scale. Two: to lock the repair and the part is to seize the property of another. Three: to send working goods to the waste pile is to violate the right of the public. Four: to do these under the cover of technology, safety, license or innovation does not lighten the act, it makes the fraud layered.</w:t>
+        <w:t>The matter, in all its aspects, is established, and the ruling is firmly set. One: to hide the life of goods is to give short weight on the scale. Two: to lock the repair and the part is to take from the owner what the sale gave him. Three: to cause working goods to end up on the waste pile is to harm the public. Four: to do these under the cover of technology, safety, license or innovation does not lighten the act, it makes the deceit layered.</w:t>
       </w:r>
     </w:p>
     <w:p>
@@ -343,7 +391,7 @@
         <w:spacing w:line="360" w:lineRule="auto" w:after="160"/>
       </w:pPr>
       <w:r>
-        <w:t>If you are a producer, the rule is simple. If you will make cheap goods, you write their life on them and you sell them openly. If your hardware reaches its limit, you say so and you announce the end of updates. You take your hand off the goods that you sold. You respect the owner's right to repair, and his will. Every act that does not keep to these limits is not trade, it is organized usurpation. Thank you.</w:t>
+        <w:t>If you are a producer, the rule is simple. If you will make cheap goods, you write their life on them and you sell them openly. If your hardware reaches its limit, you say so and you announce the end of updates and of services with a date. If a real danger requires you to limit a device, you do it openly, you offer the remedy, and you make the owner whole. You take your hand off the goods that you sold. You respect the owner's right to repair, and his will. Every act that does not keep to these limits is not trade. Thank you.</w:t>
       </w:r>
     </w:p>
     <w:sectPr>

</xml_diff>

<commit_message>
Konuşma metni: tam tecrit edilmiş dört model üzerine baştan kuruldu
Co-Authored-By: Claude Sonnet 5.5 <noreply@anthropic.com>
Claude-Session: https://claude.ai/code/session_01Q71gHQtKJ86ZE2CtYTYSwP
</commit_message>
<xml_diff>
--- a/sunum/plan2/Konusma_Metni_Planned_Obsolescence.docx
+++ b/sunum/plan2/Konusma_Metni_Planned_Obsolescence.docx
@@ -15,7 +15,7 @@
         <w:spacing w:line="360" w:lineRule="auto" w:after="160"/>
       </w:pPr>
       <w:r>
-        <w:t>The talk has two sides. On the first side stand our evidences, eight of them. On the second side stand the evidences of the other side, the producers, four of them, and I will refute each one. Every evidence has the same shape. First comes the claim. Then comes the proof that the effect follows from the cause. Then comes one example. The examples are cases that can happen to any buyer of any durable good, and I name no brand and no person in them, so that each example covers the whole class of such cases. Last comes the rule.</w:t>
+        <w:t>I will not argue from objects. A machine, a part, a battery or a program carries its own physics, its own safety rules and its own laws, and the moment I name one of them, the argument turns into a debate about that thing and I lose the principle. So I will take the principle out of every object. In the language of the jurists this is the purification of the ground, tenkîh-i menât: I remove the brand, the model and the material, and I keep only what the ruling really depends on. What remains is a model with parties, a contract, ownership and a few variables. Every example in this talk is built only on this model and on its four forms.</w:t>
       </w:r>
     </w:p>
     <w:p>
@@ -23,7 +23,47 @@
         <w:spacing w:line="360" w:lineRule="auto" w:after="160"/>
       </w:pPr>
       <w:r>
-        <w:t>Trade is two people exchanging value by mutual consent. When one side knows what it receives while the other side hides what it gives, trade ends there, and theft begins. Planned obsolescence is not a complicated technology debate. It is the practice in which a seller takes the life of the goods he sells without telling the buyer, and does not take his hand off the property he has sold. By planned obsolescence I mean a choice by the maker that shortens the useful life of a product he makes or sells, or takes away the owner's power to extend that life. The choice may be made in the factory before any sale, or after the sale by a remote act on the device. Four things are outside this definition. First, ordinary wear, because nobody chose it. Second, a short life that is printed on the box or is the settled and known custom of that kind of goods. The Mecelle says that what is known by custom is as if it were stipulated, so the buyer who pays for a cheap article that everyone knows will not last has entered the contract with open eyes. Third, the real limit of hardware. When a new program needs more memory than an old device has, the maker may decline to give the new feature, and he may declare the end of updates. Fourth, the loss of a function because an independent third party changed its own service, unless the maker built the device to depend on that service and did not say so. The maker may stop adding. He may end a service that he declared would end, with notice, and leaving the device working or giving the owner what he needs to keep it alive. He may not kill.</w:t>
+        <w:t>Here are the variables. The seller is S. The buyer is B. The durable good that is sold is X. The price that B pays is P. The expected life of X, which nature, the science of materials and the custom of the market give it, is E. The limit that S puts on the life of X without telling B is L, and L is shorter than E. And there is one filter that I call the technical filter. It stands for every legitimate reason that an engineer, a safety rule or a law can give for a limit: protection of the good, protection of life, noise, weight, cost, an emission rule, a cyber-security need. I call it T, and I say T equals zero when no such reason exists.</w:t>
+      </w:r>
+    </w:p>
+    <w:p>
+      <w:pPr>
+        <w:spacing w:line="360" w:lineRule="auto" w:after="160"/>
+      </w:pPr>
+      <w:r>
+        <w:t>The axiom is this: planned obsolescence begins where T equals zero. Where the maker has a technical, safety or legal reason, the claim of necessity belongs to him, and I answer it in the second side of this talk. Where he has none, where the only difference between the good that lasts E and the good that ends at L is that the second one ends early, there is no engineering shelter for him to hide in. And because the maker holds the facts, the burden of naming the reason is on him. The Mecelle says the proof is on the claimant, and here the one who claims necessity is the maker. If he can name no reason, T is zero.</w:t>
+      </w:r>
+    </w:p>
+    <w:p>
+      <w:pPr>
+        <w:spacing w:line="360" w:lineRule="auto" w:after="160"/>
+      </w:pPr>
+      <w:r>
+        <w:t>By planned obsolescence I mean a choice by the maker that shortens the useful life of a good he makes or sells, or takes away the owner's power to extend that life, where T is zero. The choice may be made before any sale, in the making of the good, or after the sale, by an act on it. Four things are outside this definition. First, ordinary wear, because nobody chose it. Second, a short life that is printed on the box or is the settled and known custom of that kind of goods, because the Mecelle says that what is known by custom is as if it were stipulated. Third, the real limit of the hardware: when a new program needs more than an old device has, the maker may decline to give the new feature and may declare the end of updates. Fourth, the loss of a function because an independent third party changed its own service, unless the maker built the good to depend on that service and did not say so. The maker may stop adding. He may end a service that he declared would end, with notice, leaving the good working or giving the owner what he needs to keep it alive. He may not kill.</w:t>
+      </w:r>
+    </w:p>
+    <w:p>
+      <w:pPr>
+        <w:spacing w:line="360" w:lineRule="auto" w:after="160"/>
+      </w:pPr>
+      <w:r>
+        <w:t>The talk has two sides. On the first side stand our evidences, eight of them, built on four models. On the second side stand the evidences of the other side, the producers, four of them, and I will refute each one. Every evidence has the same shape: the claim, the proof that the effect follows from the cause, the instance in the model, and the rule.</w:t>
+      </w:r>
+    </w:p>
+    <w:p>
+      <w:pPr>
+        <w:spacing w:line="360" w:lineRule="auto" w:after="160"/>
+      </w:pPr>
+      <w:r>
+        <w:t>MODEL ONE: THE LIMIT PLANTED BEFORE THE SALE.</w:t>
+      </w:r>
+    </w:p>
+    <w:p>
+      <w:pPr>
+        <w:spacing w:line="360" w:lineRule="auto" w:after="160"/>
+      </w:pPr>
+      <w:r>
+        <w:t>Here is the model. S makes X. In making it, S has two technical choices, A one and A two. A one gives X the expected life E. A two gives X a life that ends at L. Between A one and A two there is no difference in cost, weight, noise, safety or law, so T is zero. S chooses A two only so that X ends early and the second sale comes sooner. B, at the time of the sale, which I call t zero, looks at the market and at custom, expects E, and pays P. To have numbers, let E be ten units of time and L be four. P was set for ten.</w:t>
       </w:r>
     </w:p>
     <w:p>
@@ -39,7 +79,7 @@
         <w:spacing w:line="360" w:lineRule="auto" w:after="160"/>
       </w:pPr>
       <w:r>
-        <w:t>The claim: a sale is sound only when what the buyer pays is matched by what he receives, and the part of the price that has no counter-value is taken without right. The proof has four steps. The price is set by what the buyer expects, and for a durable good that includes its ordinary life. At the time of the sale the maker already knows the limit he chose, and the buyer cannot see it. The buyer pays for the expected life and receives a shorter one. So a part of the price has no counter-value, and that part is the use value of the missing time. Value is not spread evenly over the years of a device's life, so I do not say that half the life is exactly half the price. The exact share is set by those who know the trade, as the jurists set it by the experts of the trade. What is certain is that a part exists and that it belongs to the buyer.</w:t>
+        <w:t>The claim: a sale is sound only when what the buyer pays is matched by what he receives, and the part of the price that has no counter-value is taken without right. The proof has four steps. The price is set by what the buyer expects, and for a durable good that includes its ordinary life. At t zero S already knows the limit he chose, and B cannot see it. B pays for ten units and receives four. So a part of the price has no counter-value, and that part is the use value of the six missing units. Value is not spread evenly over the units of life, so I do not say that six tenths of the price is the exact share. The exact share is set by those who know the trade, as the jurists set value by the experts of the trade. What is established is that a part exists, and that it belongs to B.</w:t>
       </w:r>
     </w:p>
     <w:p>
@@ -47,7 +87,7 @@
         <w:spacing w:line="360" w:lineRule="auto" w:after="160"/>
       </w:pPr>
       <w:r>
-        <w:t>The Qur'an says in Surah An-Nisa, verse 29: "Do not consume your wealth among yourselves by false ways." Taking a price with no counter-value is eating property by a false way, ekl-i emvâl bi'l-bâtıl. The jurists also treat a gross gap between price and value, gabn-i fâhiş. The gap is measured at the time of the contract. The jurists accept small gaps and draw the line between a small gap and a gross one anywhere from a twentieth of the value to a third, according to the school.</w:t>
+        <w:t>The Qur'an says in Surah An-Nisa, verse 29: "Do not consume your wealth among yourselves by false ways." Taking a price with no counter-value is eating property by a false way, ekl-i emvâl bi'l-bâtıl. The jurists also treat a gross gap between price and value, gabn-i fâhiş, and they measure it at the time of the contract. In the model the gap exists at t zero, because the limit was planted before the sale. The schools accept small gaps and draw the line between a small gap and a gross one anywhere from a twentieth of the value to a third. Six units out of ten is beyond every line that any school has drawn.</w:t>
       </w:r>
     </w:p>
     <w:p>
@@ -55,15 +95,7 @@
         <w:spacing w:line="360" w:lineRule="auto" w:after="160"/>
       </w:pPr>
       <w:r>
-        <w:t>The example: a device is sold with a service stated to last ten years, and the price is set for ten years. From the day of the sale the maker's own plan is that the service ends in the second year. In the second year he ends it, and the device becomes a dead box. The gap was there on the day of the contract, because what was delivered, two years of service, stood against a price set for ten. Most of the value is missing, which is beyond every line that any school has drawn.</w:t>
-      </w:r>
-    </w:p>
-    <w:p>
-      <w:pPr>
-        <w:spacing w:line="360" w:lineRule="auto" w:after="160"/>
-      </w:pPr>
-      <w:r>
-        <w:t>The rule: a sale made with deceit and with a gross gap between price and value is not void, because the buyer does take the goods and keep them. It is a valid sale that is not binding on the deceived buyer. In the Hanafi view that Mecelle Article 356 follows, the deceived buyer may rescind the sale and recover his price, or keep the goods at the full price. Compensation for the missing part is due only when the goods can no longer be returned. The Hanbali school gives the buyer a choice between returning the goods and keeping them with compensation. The schools differ about a gross gap taken alone. They agree that concealment of a defect gives the buyer the option.</w:t>
+        <w:t>The rule: a sale made with deceit and with a gross gap between price and value is not void, because B does take the good and keep it. It is a valid sale that is not binding on the deceived buyer. In the Hanafi view that Mecelle Article 356 follows, B may rescind the sale and recover P, or keep X at the full price. Compensation for the missing part is due only when X can no longer be returned. The Hanbali school gives B a choice between returning X and keeping it with compensation. The schools differ about a gross gap taken alone. They agree that concealment of a defect gives the buyer the option.</w:t>
       </w:r>
     </w:p>
     <w:p>
@@ -79,7 +111,7 @@
         <w:spacing w:line="360" w:lineRule="auto" w:after="160"/>
       </w:pPr>
       <w:r>
-        <w:t>The claim: when the seller hides an attribute that sets the price, the sale is corrupted by gharar and by taghrir. The proof has four steps. The life of a device sets its price. The seller alone knows the limit he built in, and the buyer has no means of discovering it at the counter. A seller who stays silent where speaking was needed makes a statement by his silence, and the statement is that the goods conform to what is ordinary. So the buyer gives his consent on a false picture, and the seller made the false picture. The texts agree. The Prophet, peace be upon him, forbade the sale that contains gharar, which Muslim reports. He also said: whoever deceives us is not one of us. He found wet grain under dry grain in a heap, and he asked the seller why he had not put it on top, so that people could see it. The buyer could not have found the wet grain himself, and the seller was still blamed. A hidden limit on the life of a device is the wet grain at the bottom of the heap. The Hanafi jurists add that an uncertainty about the goods which leads to quarrel invalidates the sale, and a hidden life limit is such an uncertainty.</w:t>
+        <w:t>The claim: when the seller hides an attribute that sets the price, the sale is corrupted by gharar and by taghrir. The proof has four steps. The life of X sets its price. S alone knows L, and B has no means of discovering it at t zero. A seller who stays silent where speaking was needed makes a statement by his silence, and the statement is that the good conforms to what is ordinary. So B gives his consent on a false picture, and S made the false picture. The texts agree. The Prophet, peace be upon him, forbade the sale that contains gharar, which Muslim reports. He also said: whoever deceives us is not one of us. He found wet grain under dry grain in a heap, and he asked the seller why he had not put it on top, so that people could see it. The buyer could not have found the wet grain himself, and the seller was still blamed. L is the wet grain at the bottom of the heap. The Hanafi jurists add that an uncertainty about the goods which leads to quarrel invalidates the sale, and a hidden L is such an uncertainty.</w:t>
       </w:r>
     </w:p>
     <w:p>
@@ -87,7 +119,7 @@
         <w:spacing w:line="360" w:lineRule="auto" w:after="160"/>
       </w:pPr>
       <w:r>
-        <w:t>The example: a maker designs the power management of a device so that, when its battery has aged, the device lowers its own speed. The maker does not say so. The reason is real, because an aged battery can make a device shut down. Buyers buy the device, and after some years the speed drops. Owners see a slower device, they conclude that the hardware is finished, and they buy new ones. Nobody can see the cause from the outside, and the maker alone knows it.</w:t>
+        <w:t>The instance: B can look at X as long as he wishes and will never find the number four. The number is in S's plan, and S says nothing.</w:t>
       </w:r>
     </w:p>
     <w:p>
@@ -95,7 +127,7 @@
         <w:spacing w:line="360" w:lineRule="auto" w:after="160"/>
       </w:pPr>
       <w:r>
-        <w:t>The rule: because the limit was designed into the device that was sold, it is a defect hidden at the time of the sale. The buyer has the option of defect. He may return the device and recover the price, or keep it at the full price, and where return is impossible he has the compensation that the Hanafi view allows. If the limit was not planned at the sale and was imposed later, the matter is not a defect of the sale. It is a wrong done to the owner's property, and the fourth evidence governs it.</w:t>
+        <w:t>The rule: because L was planted before the sale, it is a defect hidden at t zero. B has the option of defect. He may return X and recover P, or keep X at the full price, and where return is impossible he has the compensation that the Hanafi view allows. If L had not been planned at t zero and were imposed later, the matter would not be a defect of the sale. It would be an act in the property of another, and Model Two governs it.</w:t>
       </w:r>
     </w:p>
     <w:p>
@@ -103,7 +135,7 @@
         <w:spacing w:line="360" w:lineRule="auto" w:after="160"/>
       </w:pPr>
       <w:r>
-        <w:t>OUR THIRD EVIDENCE: A WEAKNESS PLANTED ON PURPOSE, AND THE GAIN THAT COMES FROM IT.</w:t>
+        <w:t>OUR THIRD EVIDENCE: HARM DONE ON PURPOSE, AND THE GAIN THAT COMES FROM IT.</w:t>
       </w:r>
     </w:p>
     <w:p>
@@ -111,7 +143,7 @@
         <w:spacing w:line="360" w:lineRule="auto" w:after="160"/>
       </w:pPr>
       <w:r>
-        <w:t>The claim: nobody may cause harm on purpose and then profit from it. The proof has five steps. Natural wear comes from the fatigue of materials, and nobody designs it. Here the engineering effort goes the other way: it is spent to make the product fail at a point the maker chose. Remove that choice, and the buyer keeps his product while the maker loses the second sale. So the maker's gain comes directly from the buyer's loss. The loss is real, because the buyer pays again before he planned to. And the harm has a second face. The money that the owner spends early on replacing a working device cannot be spent anywhere else. This is not stagnation of capital. It is the misallocation of capital: the money that would have gone to education, health or productive investment goes to replacing what should not have failed. A counter or a part whose only function is to stop a sound product, and for which the maker can name no protective purpose, has no lawful benefit. If a protective purpose exists, the maker states it and tells the owner.</w:t>
+        <w:t>The claim: nobody may cause harm on purpose and then profit from it. The proof has five steps. Natural wear comes from the fatigue of materials, and nobody designs it. Here S's choice goes the other way: it is made so that X fails at L. Remove that choice, and B keeps X for ten units while S loses the second sale. So S's gain comes directly from B's loss. The loss is real, because B pays again at four units, six units before he planned to. A limit for which S can name no protective purpose has no lawful benefit. If a protective purpose exists, T is not zero, and S states it and tells B. And the harm has a second face. The price that B pays again cannot be spent anywhere else. This is not stagnation of capital. It is misallocation of capital: money that would have gone to education, health or productive investment goes to replacing what should not have failed.</w:t>
       </w:r>
     </w:p>
     <w:p>
@@ -119,7 +151,7 @@
         <w:spacing w:line="360" w:lineRule="auto" w:after="160"/>
       </w:pPr>
       <w:r>
-        <w:t>The rules are two. The Mecelle says there is no harm and no answering harm with harm, and harm is removed. Nobody can obtain a lawful gain from a harm that he caused by his own intentional and unjust act. The second rule, Mecelle Article 99, says: "Men iste'cele şey'en kable evânihî ûkıbe bi-hırmânih." Whoever hastens something before its time by an illegitimate means is deprived of it. The classical case is the heir who kills the one he inherits from in order to inherit early. I use the rule by analogy, as the jurists use it. The reason is hastening a benefit before its time by an illegitimate means, and that reason is present when a maker shortens the life of a product to hasten the second sale. I do not ask the state to seize anything. The state takes nothing in this rule. The buyer who paid again has a private claim to recover from the maker what the hastening cost him. The maker who caused the failure by his own planning is liable. A maker who only causes a loss is liable when he intended it, as Article 93 says, and the word planned supplies the intent.</w:t>
+        <w:t>The rules are two. The Mecelle says there is no harm and no answering harm with harm, and harm is removed. Nobody can obtain a lawful gain from a harm that he caused by his own intentional and unjust act. The second rule, Mecelle Article 99, says: "Men iste'cele şey'en kable evânihî ûkıbe bi-hırmânih." Whoever hastens something before its time by an illegitimate means is deprived of it. The classical case is the heir who kills the one he inherits from in order to inherit early. I use the rule by analogy, as the jurists use it. The reason is hastening a benefit before its time by an illegitimate means, and that reason is present when S brings the second sale from ten units to four. I do not ask the state to seize anything. The state takes nothing in this rule. B has a private claim to recover from S what the hastening cost him. S, as the one whose planning caused the failure, is a causer, and Article 93 says that a causer is liable when he intended the result. The word planned supplies the intent.</w:t>
       </w:r>
     </w:p>
     <w:p>
@@ -127,7 +159,23 @@
         <w:spacing w:line="360" w:lineRule="auto" w:after="160"/>
       </w:pPr>
       <w:r>
-        <w:t>The example: a maker fits a plastic gear in a machine where a metal gear was available for a few coins more. The maker's own tests show that the plastic gear fails at about thirty months, and that the metal gear would last for many years. He chooses the plastic gear. At thirty months the machine stops, and the owner, who had planned to use it for ten years, must buy another.</w:t>
+        <w:t>The instance: at four units, B buys a second X. The second purchase was meant for the eleventh unit, and S moved it seven units forward.</w:t>
+      </w:r>
+    </w:p>
+    <w:p>
+      <w:pPr>
+        <w:spacing w:line="360" w:lineRule="auto" w:after="160"/>
+      </w:pPr>
+      <w:r>
+        <w:t>MODEL TWO: THE ACT ON THE GOOD AFTER THE SALE.</w:t>
+      </w:r>
+    </w:p>
+    <w:p>
+      <w:pPr>
+        <w:spacing w:line="360" w:lineRule="auto" w:after="160"/>
+      </w:pPr>
+      <w:r>
+        <w:t>The model: the sale is complete at t zero, and ownership and possession are wholly with B. No danger to life, no law and no security need arises, so T is zero. X does everything that was delivered. At a later time t one, S uses a channel that he kept, and he removes a function of X, or lowers its performance, or makes X refuse what the owner puts in to keep it alive, such as a replacement part that the owner bought elsewhere.</w:t>
       </w:r>
     </w:p>
     <w:p>
@@ -143,7 +191,7 @@
         <w:spacing w:line="360" w:lineRule="auto" w:after="160"/>
       </w:pPr>
       <w:r>
-        <w:t>The claim: when the sale is complete, the seller's power of disposal over the goods ends entirely, and any act he does on the goods afterwards is an act in another man's property. The proof: a sale moves ownership to the buyer, and ownership means that the owner uses, alters, repairs, lends and resells. When a maker keeps a remote way to act on a thing he has sold, the owner has the thing but not the power over it. The Mecelle says that nobody may act in another man's property without his permission, and nobody may take another man's property without a lawful cause, Articles 96 and 97. It also says that whoever tries to undo what is complete on his own side, his effort is rejected, Article 100. I do not call this usurpation in the strict sense that the Hanafi school gives that word, because the classical rule concerns the taking of the physical thing. I call it what the Mecelle calls it: an act of disposal in the property of another without permission, and the owner has a claim against it.</w:t>
+        <w:t>The claim: when the sale is complete, S's power of disposal over X ends entirely, and any act he does on X afterwards is an act in another man's property. The proof: a sale moves ownership to B, and ownership means that the owner uses, alters, repairs, lends and resells. When S keeps a way to act on X, B has the thing but not the power over it. The Mecelle says that nobody may act in another man's property without his permission, and nobody may take another man's property without a lawful cause, Articles 96 and 97. It also says that whoever tries to undo what is complete on his own side, his effort is rejected, Article 100. I do not call this usurpation in the strict sense that the Hanafi school gives that word, because the classical rule concerns the taking of the physical thing. I call it what the Mecelle calls it: an act of disposal in the property of another without permission, and the owner has a claim against it.</w:t>
       </w:r>
     </w:p>
     <w:p>
@@ -151,7 +199,7 @@
         <w:spacing w:line="360" w:lineRule="auto" w:after="160"/>
       </w:pPr>
       <w:r>
-        <w:t>The example: a device is sold, and its battery wears out after some years, as batteries do. The owner buys a replacement battery from any maker, because he wants to keep the device alive. A later update sent from afar makes the device refuse every battery that the maker did not sell. The owner's power to extend the life of what he owns has been taken away after the sale, by an act on the device itself.</w:t>
+        <w:t>The instance: at t one, X is working as delivered. S sends a change. B can no longer use the part he bought to extend X's life, and the power that the sale gave him is gone, by S's own act on X.</w:t>
       </w:r>
     </w:p>
     <w:p>
@@ -159,7 +207,23 @@
         <w:spacing w:line="360" w:lineRule="auto" w:after="160"/>
       </w:pPr>
       <w:r>
-        <w:t>The rule: the maker who acts on the device with his own hand is the direct actor, mübâşir, and the direct actor is liable even without intent, as Article 92 says. The owner may demand that the act be undone and may claim compensation for what it cost him. A protective update is not forbidden. If keeping the device as it is would endanger life, the maker may and must limit it at once, and then tell the owner and offer the remedy. But he may not do it in the dark for his own profit.</w:t>
+        <w:t>The rule: S acted on X with his own hand, so he is the direct actor, mübâşir, and the direct actor is liable even without intent, as Article 92 says. B may demand that the act be undone and may claim compensation for what it cost him. A protective act is not forbidden. If keeping X as it is would endanger life, T is not zero, and S may and must limit X at once, and then tell B and offer the remedy. But he may not act in the dark for his own profit.</w:t>
+      </w:r>
+    </w:p>
+    <w:p>
+      <w:pPr>
+        <w:spacing w:line="360" w:lineRule="auto" w:after="160"/>
+      </w:pPr>
+      <w:r>
+        <w:t>MODEL THREE: THE REPAIR IS CLOSED.</w:t>
+      </w:r>
+    </w:p>
+    <w:p>
+      <w:pPr>
+        <w:spacing w:line="360" w:lineRule="auto" w:after="160"/>
+      </w:pPr>
+      <w:r>
+        <w:t>The model: X has an ordinary fault. B, or an independent expert, can fix it. B asks for nothing that belongs to S's copyright, patent or trade secret. He asks only for the fault information and the means of repair, and the replacement part meets every standard, so T is zero. S withholds the fault information, or locks X with a check that rejects anything that did not come from S's own supply.</w:t>
       </w:r>
     </w:p>
     <w:p>
@@ -175,7 +239,7 @@
         <w:spacing w:line="360" w:lineRule="auto" w:after="160"/>
       </w:pPr>
       <w:r>
-        <w:t>The claim: when the maker reserves the means of repair to himself, he spoils the sale, creates an artificial scarcity, exploits the owner's need and drives out the independent trade. The proof has four steps. A sale gives the buyer the power of disposal, and a condition that takes it back, such as "you may not open the device, you may not take it to an independent repairer, you may not fit third-party parts," contradicts the nature of the contract. The jurists call such a condition a corrupting condition, şart-ı fâsid, and it is void, because the seller collects the full price of ownership and does not give what ownership brings. Second, when the diagnostic software, the fault codes and the parts are given only to the maker's own dealers, the scarcity is made by the maker. I do not say that this is ihtikâr in its classical form. Classical ihtikâr is hoarding goods that people need, and here the maker does not hoard what he bought from the market, he refuses to sell the means. The juristic name of the act is a refusal to sell joined to a corrupting condition. But it produces the same harm as ihtikâr, which is an artificial scarcity of what people need, and some jurists, Abu Yusuf among them, extend the ban on ihtikâr to anything whose withholding harms people. Third, when the only party who can repair is the party that sold, the owner has no choice but to accept that party's price and schedule. A report from Ali, may God be pleased with him, says that the Prophet forbade the sale made to a man in distress, which Abu Dawud reports. Fourth, the independent repair shops are shut out of the work, and the work goes to the dealers.</w:t>
+        <w:t>The claim: when S reserves the means of repair to himself, he spoils the sale, creates an artificial scarcity, exploits the owner's need and drives out the independent trade. The proof has four steps. A sale gives B the power of disposal, and a condition that takes it back, such as "you may not open it, you may not take it to an independent expert, you may not fit a part that did not come from me," contradicts the nature of the contract. The jurists call such a condition a corrupting condition, şart-ı fâsid, and it is void, because S collects the full price of ownership and does not give what ownership brings. Second, when the fault information and the repair means are given only to S's own dealers, the scarcity is made by S. I do not say that this is ihtikâr in its classical form. Classical ihtikâr is hoarding goods that people need, and here S does not hoard what he bought from the market, he refuses to sell the means. The juristic name of the act is a refusal to sell joined to a corrupting condition. But it produces the same harm as ihtikâr, which is an artificial scarcity of what people need, and some jurists, Abu Yusuf among them, extend the ban on ihtikâr to anything whose withholding harms people. Third, when the only party who can repair is the party that sold, B has no choice but to accept that party's price and schedule. A report from Ali, may God be pleased with him, says that the Prophet forbade the sale made to a man in distress, which Abu Dawud reports. Fourth, the independent experts are shut out of the work, and the work goes to S's dealers.</w:t>
       </w:r>
     </w:p>
     <w:p>
@@ -183,7 +247,7 @@
         <w:spacing w:line="360" w:lineRule="auto" w:after="160"/>
       </w:pPr>
       <w:r>
-        <w:t>The owner and the independent mechanic do not ask for the maker's source code or his trade secret. The maker keeps his copyright and his secret. They ask for the fault codes and the repair tools, on reasonable terms, as a seller gives to those who can use what he sells.</w:t>
+        <w:t>In the model B and the independent expert do not ask for S's source code or secret. S keeps his copyright and his secret. They ask for the fault information and the repair means, on reasonable terms, as a seller gives to those who can use what he sells.</w:t>
       </w:r>
     </w:p>
     <w:p>
@@ -191,7 +255,7 @@
         <w:spacing w:line="360" w:lineRule="auto" w:after="160"/>
       </w:pPr>
       <w:r>
-        <w:t>The example: a farm machine is sold, and its diagnostic tool is sold only to the maker's dealers. In the middle of the harvest season a pump fails. An independent mechanic could fix it in an hour, but he cannot read the fault. The owner waits for the dealer and pays the dealer's price. The independent mechanic, in every town where such machines are used, loses the work.</w:t>
+        <w:t>The instance: the fault costs the independent expert one unit of effort to fix. S's door costs B ten units, and B has no other door.</w:t>
       </w:r>
     </w:p>
     <w:p>
@@ -199,7 +263,23 @@
         <w:spacing w:line="360" w:lineRule="auto" w:after="160"/>
       </w:pPr>
       <w:r>
-        <w:t>The rule: the one who sold cannot undo what he completed by closing the repair, and his effort to do so is rejected. The condition is void, and the owner may repair his own property wherever he wishes.</w:t>
+        <w:t>The rule: the one who sold cannot undo what he completed by closing the repair, and his effort to do so is rejected. The condition is void, and B may repair his own property wherever he wishes.</w:t>
+      </w:r>
+    </w:p>
+    <w:p>
+      <w:pPr>
+        <w:spacing w:line="360" w:lineRule="auto" w:after="160"/>
+      </w:pPr>
+      <w:r>
+        <w:t>MODEL FOUR: THE SECTOR.</w:t>
+      </w:r>
+    </w:p>
+    <w:p>
+      <w:pPr>
+        <w:spacing w:line="360" w:lineRule="auto" w:after="160"/>
+      </w:pPr>
+      <w:r>
+        <w:t>The model: Models One, Two and Three stop being the act of a single seller and become the general practice of a sector, so that every S in it does them. The replacement of X by the taste of B, and the real technical leaps that make a new good better, are outside this model. Only the replacement that comes from the failure or the disabling of X is inside it.</w:t>
       </w:r>
     </w:p>
     <w:p>
@@ -215,7 +295,7 @@
         <w:spacing w:line="360" w:lineRule="auto" w:after="160"/>
       </w:pPr>
       <w:r>
-        <w:t>The claim: the benefit of an extra sale belongs to the maker, and the cost belongs to people who were not parties to the sale. The proof is arithmetic. To deliver a given number of years of service, a device that lasts three years must be made, shipped and thrown away twice as often as a device that lasts six years. The number of units doubles. Each unit carries its own metals, its own energy and its own disposal. These costs do not appear on the buyer's receipt, so they fall on the public. The United Nations Global E-waste Monitor counted sixty-two million tonnes of electronic waste in 2022 and found that less than a quarter was documented as properly collected and recycled. It lists shorter product life cycles, limited repair options and design shortcomings among the causes. The arithmetic applies to a device that is replaced because it failed or was disabled. A buyer who replaces a working device by his own taste is outside the claim, because nobody took his device from him. The same arithmetic touches the national wallet. A country that imports its devices pays foreign currency for every replacement, so a device replaced at three years instead of six costs twice the foreign currency for the same years of service.</w:t>
+        <w:t>The claim: the benefit of the extra sale belongs to S, and the cost belongs to people who were not parties to the sale. The proof is arithmetic. To deliver a given number of units of service, a good that ends at L must be made, shipped and discarded E over L times as often as a good that lasts E. Let E be six units and L be three. The number of units made and discarded doubles. Each unit carries its own materials, its own energy and its own disposal. These costs do not appear on B's receipt, so they fall on the public. The United Nations Global E-waste Monitor counted sixty-two million tonnes of electronic waste in 2022 and found that less than a quarter was documented as properly collected and recycled. It lists shorter product life cycles, limited repair options and design shortcomings among the causes. The arithmetic applies to a good that is replaced because it failed or was disabled. A buyer who replaces a working good by his own taste is outside the model, because nobody took his good from him. The same arithmetic touches the national wallet. A country that imports X pays foreign currency for every replacement, so a replacement at three units instead of six costs twice the foreign currency for the same units of service.</w:t>
       </w:r>
     </w:p>
     <w:p>
@@ -223,7 +303,7 @@
         <w:spacing w:line="360" w:lineRule="auto" w:after="160"/>
       </w:pPr>
       <w:r>
-        <w:t>A question of responsibility arises. The owner is the one who carries the device to the waste. The maker is the one who made it end. When the maker disables the device by a remote act, he is the direct actor on the device. When the device fails by its design, he is the cause, and the Mecelle says that a cause is liable if he intended the result, and planning is the intent. So the maker is responsible in both cases, and the buyer who carries the device away is only the last hand.</w:t>
+        <w:t>A question of responsibility arises. B is the one who carries X to the waste. S is the one who made it end. When S disables X by an act, he is the direct actor on X. When X fails by his planning, he is the causer, and the Mecelle says that a causer is liable if he intended the result, and planning is the intent. So S is responsible in both cases, and B who carries X away is only the last hand.</w:t>
       </w:r>
     </w:p>
     <w:p>
@@ -231,7 +311,7 @@
         <w:spacing w:line="360" w:lineRule="auto" w:after="160"/>
       </w:pPr>
       <w:r>
-        <w:t>The rules of the Mecelle are three. For the repelling of a general harm, a particular harm is chosen, Article 26. The heavier harm is removed by the lighter, Article 27. And burdens go with benefits. The waste and the squandered resources are a general harm. The maker's interest in the extra sale is a particular one. To prevent the general harm, this gate of profit is closed.</w:t>
+        <w:t>The rules of the Mecelle are three. For the repelling of a general harm, a particular harm is chosen, Article 26. The heavier harm is removed by the lighter, Article 27. And burdens go with benefits. The waste and the squandered resources are a general harm. S's interest in the extra sale is a particular one. To prevent the general harm, this gate of profit is closed.</w:t>
       </w:r>
     </w:p>
     <w:p>
@@ -239,7 +319,7 @@
         <w:spacing w:line="360" w:lineRule="auto" w:after="160"/>
       </w:pPr>
       <w:r>
-        <w:t>The example: a hundred thousand households of a city each buy the same device. The device is made to last three years where it could have lasted six. In twelve years each household has bought four devices instead of two, and the city has thrown away two hundred thousand devices more than the other case, and a pencil is enough to check it.</w:t>
+        <w:t>The instance: N households each need X for twelve units of time. With E equal to six, each buys two. With L equal to three, each buys four. The sector has made and discarded two N more goods, and a pencil is enough to check it.</w:t>
       </w:r>
     </w:p>
     <w:p>
@@ -255,7 +335,7 @@
         <w:spacing w:line="360" w:lineRule="auto" w:after="160"/>
       </w:pPr>
       <w:r>
-        <w:t>The claim: the practice produces the very enmity that the prohibition of deceit exists to prevent. I say this in its proper place. Enmity is not a ground of the ruling. A ground has to be visible and measurable, and a feeling is not. The ground is deceit, and I have proved it in the second evidence. Enmity is the wisdom, hikmet, behind the ban, and the wisdom shows what is at stake. The Qur'an says in Surah Al-Ma'idah, verse 91, as the reason for forbidding wine and gambling: Satan only wants to cause enmity and hatred between you. The same purpose stands behind the ban on deceit, which is to keep enmity out of society.</w:t>
+        <w:t>The claim: the practice produces the very enmity that the prohibition of deceit exists to prevent. I say this in its proper place. Enmity is not a ground of the ruling. A ground has to be visible and measurable, and a feeling is not. The ground is deceit, and I proved it in the second evidence. Enmity is the wisdom, hikmet, behind the ban, and it shows what is at stake. The Qur'an says in Surah Al-Ma'idah, verse 91, as the reason for forbidding wine and gambling: Satan only wants to cause enmity and hatred between you. The same purpose stands behind the ban on deceit, which is to keep enmity out of society.</w:t>
       </w:r>
     </w:p>
     <w:p>
@@ -263,7 +343,7 @@
         <w:spacing w:line="360" w:lineRule="auto" w:after="160"/>
       </w:pPr>
       <w:r>
-        <w:t>The proof has two steps. When goods wear out by their nature or break by accident, the buyer holds no grudge. He says it was fated, and he accepts. But when he learns that the failure was put there, he stops seeing the maker as a seller and begins to see him as a betrayer. This is the effect that can be seen and counted: complaints, claims and lawsuits.</w:t>
+        <w:t>The proof has two steps. When a good ends by its nature, B holds no grudge. He says it was fated, and he accepts. But when B learns that the end was chosen, he stops seeing S as a seller and begins to see him as a betrayer. This is the effect that can be seen and counted: complaints, claims and lawsuits.</w:t>
       </w:r>
     </w:p>
     <w:p>
@@ -271,7 +351,7 @@
         <w:spacing w:line="360" w:lineRule="auto" w:after="160"/>
       </w:pPr>
       <w:r>
-        <w:t>The example: a washing machine has a controller that counts the cycles and stops the machine at a set number, long before any part has worn, and the maker can name no safety purpose for it. For years every owner takes the stop as fate. Then a repair worker opens one controller and finds the counter. The news goes from owner to owner. They compare, they complain, they claim, and none of them will buy from that maker again. The cause of the dispute is not the failure. It is the discovery that the failure was chosen.</w:t>
+        <w:t>The instance: in the sector, B one learns of L. He tells B two, and B two tells B three. In a short time all of them compare, complain and claim, and none of them will buy from S again. The cause of the dispute is not the end of X. It is the discovery that the end was chosen.</w:t>
       </w:r>
     </w:p>
     <w:p>
@@ -295,7 +375,7 @@
         <w:spacing w:line="360" w:lineRule="auto" w:after="160"/>
       </w:pPr>
       <w:r>
-        <w:t>The claim: when cheating spreads, honest goods are driven out of the market. The proof has five steps. Buyers cannot judge the life of a product when they buy it. The price in the market is set by what buyers can see. So a product that lasts longer cannot be sold at a higher price, because the buyer cannot see that it lasts longer. The maker who builds in a short life has a lower cost. He can sell at a lower price, or he can sell at the same price and earn more. The honest maker, with a higher cost, either lowers his price and loses money, or keeps his price and loses buyers. A warranty does not rescue him. A warranty is a promise about repair for a period, and it does not tell the buyer how long the product will live. A maker who plans the end of the product can set the end just after the warranty. Economists call this the market for lemons, and its cause is the buyer's blindness about the life, which is exactly what planned obsolescence creates.</w:t>
+        <w:t>The claim: when the practice spreads, honest goods are driven out of the market. The proof has five steps. Buyers cannot judge the life of a good when they buy it. The price in the market is set by what buyers can see. So a good that lasts longer cannot be sold at a higher price, because the buyer cannot see that it lasts longer. The seller who plants L has a lower cost. He can sell at a lower price, or he can sell at the same price and earn more. The honest seller, with a higher cost, either lowers his price and loses money, or keeps his price and loses buyers. A warranty does not rescue him. A warranty is a promise about repair for a period, and it does not tell the buyer how long the good will live. A seller who plans the end can set the end just after the warranty. Economists call this the market for lemons, and its cause is the buyer's blindness about the life, which is exactly what the planted limit creates.</w:t>
       </w:r>
     </w:p>
     <w:p>
@@ -303,7 +383,7 @@
         <w:spacing w:line="360" w:lineRule="auto" w:after="160"/>
       </w:pPr>
       <w:r>
-        <w:t>The example: two makers sell the same lamp, and the two lamps look the same on the shelf. One has built it to last twice as long and the other has built it to last half as long. The shelf price is the same. The short-life maker earns more on each lamp, and the durable maker earns less. After a few seasons the durable maker either copies the other or leaves, and the buyers have lost the one signal they had.</w:t>
+        <w:t>The instance: two sellers, S one and S two, put X on the same shelf at the same price. S one built it for E, S two built it for L. S two earns more on each unit. After a few seasons S one either copies S two or leaves, and the buyers have lost the one signal they had.</w:t>
       </w:r>
     </w:p>
     <w:p>
@@ -327,7 +407,7 @@
         <w:spacing w:line="360" w:lineRule="auto" w:after="160"/>
       </w:pPr>
       <w:r>
-        <w:t>The grounds I named are fourteen, and I have placed each one in one evidence only. Nine come from the texts and the law of contract. Eating property by false means and the gross gap between price and value sit in the first evidence. Gharar and taghrir sit in the second. Harm sits in the third. The unauthorised act of disposal in another's property sits in the fourth. The corrupting condition, the harm of ihtikâr and the exploitation of distress sit in the fifth. Five come from reason and the facts. The deliberate weakness and the misallocation of capital sit in the third. The loss of the independent repair trade sits in the fifth. The ecological waste sits in the sixth. The loss of market trust sits in the eighth. Enmity is the wisdom of the ban and is not counted. Seen from what Islamic law protects, these grounds strike at property, at the soundness of the contract and the freedom of will, at the peace of society, and at the physical world and its balance. Planned obsolescence touches at least six of them at once: gharar, taghrir, eating property by false means, the corrupting condition, the harm of ihtikâr and the unauthorised act in another's property. It is therefore not a simple sale of a defective good and not a commercial manoeuvre acceptable in a free market.</w:t>
+        <w:t>The grounds I named are fourteen, and I have placed each one in one evidence only. Nine come from the texts and the law of contract. Eating property by false means and the gross gap between price and value sit in the first evidence. Gharar and taghrir sit in the second. Harm sits in the third. The unauthorised act of disposal in another's property sits in the fourth. The corrupting condition, the harm of ihtikâr and the exploitation of distress sit in the fifth. Five come from reason and the facts. The deliberate limit and the misallocation of capital sit in the third. The loss of the independent repair trade sits in the fifth. The ecological waste sits in the sixth. The loss of market trust sits in the eighth. Enmity is the wisdom of the ban and is not counted. Seen from what Islamic law protects, these grounds strike at property, at the soundness of the contract and the freedom of will, at the peace of society, and at the physical world and its balance. The practice touches at least six of them at once: gharar, taghrir, eating property by false means, the corrupting condition, the harm of ihtikâr and the unauthorised act in another's property. It is therefore not a simple sale of a defective good and not a commercial manoeuvre acceptable in a free market.</w:t>
       </w:r>
     </w:p>
     <w:p>
@@ -343,7 +423,7 @@
         <w:spacing w:line="360" w:lineRule="auto" w:after="160"/>
       </w:pPr>
       <w:r>
-        <w:t>The first evidence of the producers: "The customer accepted the terms of use. He has consented." The refutation has two parts. First, if the terms were shown before the purchase, and the buyer could refuse them, return the device and take his money back, then the click is a choice, and the maker is right. I do not contest that. Second, my refutation concerns the other terms: the terms that appear only after the money is paid, the terms that do not say what the update will do, and the terms that are shown at a moment when return is no longer possible. Take an owner who has used his device for three years and sees an update marked "performance improvements" and taps Install. He accepted an update. He did not accept a slower device, because nobody told him that the update would slow it, and there is no refund at that moment. A signature on something whose effect was hidden is not consent to that effect. The rule: conditions that are contrary to the purpose of the contract and rest on deceit are void, and a forced agreement does not take the place of real consent.</w:t>
+        <w:t>The first evidence of the producers: "B accepted the terms of use. He has consented." The refutation has two parts. First, if the terms were shown before the purchase, and B could refuse them, return X and take his money back, then the acceptance is a choice, and S is right. I do not contest that. Second, my refutation concerns the other terms: the terms that appear only after P is paid, the terms that do not say what a later act on X will do, and the terms that are shown at a moment when return is no longer possible. At t one B accepts a general agreement for a change, and the agreement does not say that the change will lower X, and there is no refund at that moment. He accepted a change. He did not accept a lower X, because nobody told him. A signature on something whose effect was hidden is not consent to that effect. The rule: conditions that are contrary to the purpose of the contract and rest on deceit are void, and a forced agreement does not take the place of real consent.</w:t>
       </w:r>
     </w:p>
     <w:p>
@@ -351,7 +431,7 @@
         <w:spacing w:line="360" w:lineRule="auto" w:after="160"/>
       </w:pPr>
       <w:r>
-        <w:t>The second evidence: "We had no choice. For safety and to protect the battery, we limited the device." The refutation: necessity permits the act. It does not permit silence, and it does not remove the duty to make the owner whole. The Mecelle says that necessity does not cancel another man's right, Article 33. The classical example is the starving man who eats another's bread. He may eat it, and he must pay for it afterwards. So when the maker really finds that an aged battery endangers life, he may and must limit the device at once. Then he must tell the owner, and offer a new battery at his own cost, and make good the loss. A protective update that is announced and offered with a remedy is honest. The same update done in the dark, with the owner left to think his device has died, is the wrong. And a maker who has genuinely reached the limit of the hardware may say so, stop adding features, and announce the end of updates with a date. What he may not do is remove what works without a real danger and without telling the owner. The rule: necessity is measured by its extent, and it does not cancel another man's right.</w:t>
+        <w:t>The second evidence: "We had no choice. For safety, we limited the good." The refutation: this is the case where T is not zero, and I accept the case. Necessity permits the act. It does not permit silence, and it does not remove the duty to make the owner whole. The Mecelle says that necessity does not cancel another man's right, Article 33. The classical example is the starving man who eats another's bread. He may eat it, and he must pay for it afterwards. So when S really finds that X endangers life, he may and must limit X at once. Then he must tell B, offer the remedy at his own cost, and make good the loss. An act that is announced and offered with a remedy is honest. The same act done in the dark, with B left to think that X has died, is the wrong. A maker who has genuinely reached the limit of the hardware may say so, stop adding features, and announce the end of updates with a date. What he may not do is remove what works without a real danger and without telling the owner. The rule: necessity is measured by its extent, and it does not cancel another man's right.</w:t>
       </w:r>
     </w:p>
     <w:p>
@@ -359,7 +439,7 @@
         <w:spacing w:line="360" w:lineRule="auto" w:after="160"/>
       </w:pPr>
       <w:r>
-        <w:t>The third evidence: "We sold the device, but we did not sell the software inside it. We licensed it." The refutation has three parts, because there are three kinds of software. First, I do not contest the licensing of independent programs that a buyer later installs on a computer. They are separate from the machine and can be licensed. Second, the software embedded in the device, which the hardware cannot work without, is different. Take a machine whose control program is written into its own board. Without that program the machine is a heap of metal and plastic. The Mecelle says that what follows a thing in existence follows it in the ruling, Article 47, and that what follows cannot be given a separate ruling, Article 48. The device is the principal thing, so the embedded software that cannot be separated from it goes with the sale. The owner of the code keeps his copyright and his secret. The buyer asks only to use and keep the device he paid for. Third, there is the function that lives on the maker's server and not in the device. The maker says: "The device is in your home, but the service is mine." That is true, and it is answered by a different rule. If the service was part of what was sold, the maker owes it for the period he stated at the sale. After that period he may end it, with notice, and without leaving the device a dead box if he can help it. In contracts, meaning counts, not wording. If the maker wants to keep ownership, he must call the contract a lease and price it as rent.</w:t>
+        <w:t>The third evidence: "We sold the good, but we did not sell the software in it. We licensed it." The refutation has three parts, because there are three kinds of software. First, I do not contest the licensing of independent programs that a buyer later installs on his own machine. They are separate from the good and can be licensed. Second, the software embedded in the good, which the good cannot work without, is different. Without it, X is a heap of material. The Mecelle says that what follows a thing in existence follows it in the ruling, Article 47, and that what follows cannot be given a separate ruling, Article 48. X is the principal thing, so the embedded software that cannot be separated from it goes with the sale. The owner of the code keeps his copyright and his secret. B asks only to use and keep what he paid for. Third, there is the function that lives on S's server and not in X. S says: "The good is with you, but the service is mine." That is true, and it is answered by a different rule. If the service was part of what was sold, S owes it for the period that he stated at the sale. After that period he may end it, with notice, and without leaving X a dead thing if he can help it. In contracts, meaning counts, not wording. If S wants to keep ownership, he must call the contract a lease and price it as rent.</w:t>
       </w:r>
     </w:p>
     <w:p>
@@ -367,7 +447,7 @@
         <w:spacing w:line="360" w:lineRule="auto" w:after="160"/>
       </w:pPr>
       <w:r>
-        <w:t>The fourth evidence, and the strongest: "We finance innovation. Without replacement sales we cannot pay for research, and technology stops." The refutation: here is the practice in its plainest form. A lamp maker builds a lamp to last half as long as he could, tells no one, and says that the second sale pays for next year's better lamp. The buyer paid for a lamp with an ordinary life and received half. The money for the missing half was taken from him for a purpose that he never heard of, and that is the same wrong whatever the purpose is. Four questions show that the defense fails. If buyers would accept "this lasts two years, and the difference funds the next model," the maker loses nothing by saying so, and his silence shows that he expects a refusal. If he needs money, he can raise the price openly, offer a trade-in, or sell a cheaper line with the life printed on it. If the new product is better, buyers have a reason to buy it, and the old one does not have to die first. If it is not better, the buyer pays twice for the same thing, and that is not research. A last answer comes from the one who says that old devices hold back the ecosystem. If the old hardware cannot carry the new program, the maker does not give the new program to it, and nobody objects. He freezes the old version, and the device keeps doing what it did. Progress does not need the end of what someone else owns. And if research benefits everyone, then everyone should fund it in the open, and one class of buyers should not fund it in the dark. The rule: a good end does not make a forbidden means lawful, and the property of one man may not be taken without a lawful cause for the benefit of others.</w:t>
+        <w:t>The fourth evidence, and the strongest: "We finance innovation. Without replacement sales we cannot pay for research, and technology stops." The refutation: put it in the model. S plants L, tells no one, and says that the second sale pays for the next, better good. B paid for E and received L. The money for the missing time was taken from him for a purpose that he never heard of, and that is the same wrong whatever the purpose is. Four questions show that the defense fails. If B would accept "this lasts L, and the difference funds the next model," S loses nothing by saying so, and his silence shows that he expects a refusal. If S needs money, he can raise the price openly, offer a trade-in, or sell a cheaper line with the life printed on it. If the next good is better, B has a reason to buy it, and the old one does not have to end first. If it is not better, B pays twice for the same thing, and that is not research. A last answer comes from the one who says that old goods hold back the ecosystem. If the old hardware cannot carry the new program, S does not give the new program to it, and nobody objects. He freezes the old version, and X keeps doing what it did. Progress does not need the end of what someone else owns. And if research benefits everyone, then everyone should fund it in the open, and one class of buyers should not fund it in the dark. The rule: a good end does not make a forbidden means lawful, and the property of one man may not be taken without a lawful cause for the benefit of others.</w:t>
       </w:r>
     </w:p>
     <w:p>
@@ -383,7 +463,7 @@
         <w:spacing w:line="360" w:lineRule="auto" w:after="160"/>
       </w:pPr>
       <w:r>
-        <w:t>The matter, in all its aspects, is established, and the ruling is firmly set. One: to hide the life of goods is to give short weight on the scale. Two: to lock the repair and the part is to take from the owner what the sale gave him. Three: to cause working goods to end up on the waste pile is to harm the public. Four: to do these under the cover of technology, safety, license or innovation does not lighten the act, it makes the deceit layered.</w:t>
+        <w:t>The matter, in all its aspects, is established, and the ruling is firmly set, on one condition that I have stated from the start: it holds where T is zero. One: to plant L and hide it is to give short weight on the scale. Two: to act on X after the sale, or to close its repair, is to take from the owner what the sale gave him. Three: to cause working goods to end up on the waste pile is to harm the public. Four: to do these under the cover of technology, safety, license or innovation does not lighten the act, it makes the deceit layered.</w:t>
       </w:r>
     </w:p>
     <w:p>
@@ -391,7 +471,7 @@
         <w:spacing w:line="360" w:lineRule="auto" w:after="160"/>
       </w:pPr>
       <w:r>
-        <w:t>If you are a producer, the rule is simple. If you will make cheap goods, you write their life on them and you sell them openly. If your hardware reaches its limit, you say so and you announce the end of updates and of services with a date. If a real danger requires you to limit a device, you do it openly, you offer the remedy, and you make the owner whole. You take your hand off the goods that you sold. You respect the owner's right to repair, and his will. Every act that does not keep to these limits is not trade. Thank you.</w:t>
+        <w:t>If you are a producer, the rule is simple. If you will make cheap goods, you write their life on them and you sell them openly. If your hardware reaches its limit, you say so and you announce the end of updates and of services with a date. If a real danger requires you to limit a good, you do it openly, you offer the remedy, and you make the owner whole. You take your hand off the goods that you sold. You respect the owner's right to repair, and his will. Every act that does not keep to these limits is not trade. Thank you.</w:t>
       </w:r>
     </w:p>
     <w:sectPr>

</xml_diff>